<commit_message>
thêm vài script với 1 bảng chi tiết khuyến mãi để 1 sản phẩm có thể add nhiều mã giảm giá
</commit_message>
<xml_diff>
--- a/docs/Dac_ta_tinh_nang_quan_ly_quan_ca_phe.docx
+++ b/docs/Dac_ta_tinh_nang_quan_ly_quan_ca_phe.docx
@@ -5156,7 +5156,7 @@
                 <w:sz w:val="18"/>
                 <w:szCs w:val="18"/>
               </w:rPr>
-              <w:t xml:space="preserve">; tra khuyến mãi đang hiệu lực (Phụ lục A.2); tính </w:t>
+              <w:t xml:space="preserve">; tự áp MỌI khuyến mãi đang hiệu lực của sản phẩm, cộng dồn trên giá gốc, tính trên từng ly (Phụ lục A.2); tính </w:t>
             </w:r>
             <w:r>
               <w:rPr>
@@ -5179,51 +5179,6 @@
               <w:t xml:space="preserve"> theo tồn kho (Phụ lục A.3), sản phẩm chưa có công thức thì không giới hạn</w:t>
             </w:r>
           </w:p>
-          <w:p>
-            <w:pPr>
-              <w:spacing w:after="20"/>
-            </w:pPr>
-            <w:r>
-              <w:rPr>
-                <w:rFonts w:ascii="Consolas" w:cs="Consolas" w:eastAsia="Consolas" w:hAnsi="Consolas"/>
-                <w:b w:val="false"/>
-                <w:bCs w:val="false"/>
-                <w:sz w:val="18"/>
-                <w:szCs w:val="18"/>
-              </w:rPr>
-              <w:t xml:space="preserve">gia_sau_giam</w:t>
-            </w:r>
-            <w:r>
-              <w:rPr>
-                <w:rFonts w:ascii="Arial" w:cs="Arial" w:eastAsia="Arial" w:hAnsi="Arial"/>
-                <w:b w:val="false"/>
-                <w:bCs w:val="false"/>
-                <w:sz w:val="18"/>
-                <w:szCs w:val="18"/>
-              </w:rPr>
-              <w:t xml:space="preserve">, </w:t>
-            </w:r>
-            <w:r>
-              <w:rPr>
-                <w:rFonts w:ascii="Consolas" w:cs="Consolas" w:eastAsia="Consolas" w:hAnsi="Consolas"/>
-                <w:b w:val="false"/>
-                <w:bCs w:val="false"/>
-                <w:sz w:val="18"/>
-                <w:szCs w:val="18"/>
-              </w:rPr>
-              <w:t xml:space="preserve">ma_khuyen_mai</w:t>
-            </w:r>
-            <w:r>
-              <w:rPr>
-                <w:rFonts w:ascii="Arial" w:cs="Arial" w:eastAsia="Arial" w:hAnsi="Arial"/>
-                <w:b w:val="false"/>
-                <w:bCs w:val="false"/>
-                <w:sz w:val="18"/>
-                <w:szCs w:val="18"/>
-              </w:rPr>
-              <w:t xml:space="preserve"> bổ sung ở Sprint 3 khi có module khuyến mãi</w:t>
-            </w:r>
-          </w:p>
         </w:tc>
         <w:tc>
           <w:tcPr>
@@ -5263,7 +5218,57 @@
                 <w:sz w:val="18"/>
                 <w:szCs w:val="18"/>
               </w:rPr>
-              <w:t xml:space="preserve">{ma_san_pham, ten_san_pham, gia_ban, gia_sau_giam, ma_khuyen_mai?, so_ly_toi_da, du_nguyen_lieu, ten_danh_muc}</w:t>
+              <w:t xml:space="preserve">{ma_san_pham, ten_san_pham, gia_ban, gia_sau_giam, tong_giam_moi_ly, khuyen_mai[], so_ly_toi_da, du_nguyen_lieu, ten_danh_muc}</w:t>
+            </w:r>
+            <w:r>
+              <w:rPr>
+                <w:rFonts w:ascii="Arial" w:cs="Arial" w:eastAsia="Arial" w:hAnsi="Arial"/>
+                <w:b w:val="false"/>
+                <w:bCs w:val="false"/>
+                <w:sz w:val="18"/>
+                <w:szCs w:val="18"/>
+              </w:rPr>
+              <w:t xml:space="preserve">; </w:t>
+            </w:r>
+            <w:r>
+              <w:rPr>
+                <w:rFonts w:ascii="Consolas" w:cs="Consolas" w:eastAsia="Consolas" w:hAnsi="Consolas"/>
+                <w:b w:val="false"/>
+                <w:bCs w:val="false"/>
+                <w:sz w:val="18"/>
+                <w:szCs w:val="18"/>
+              </w:rPr>
+              <w:t xml:space="preserve">khuyen_mai[]</w:t>
+            </w:r>
+            <w:r>
+              <w:rPr>
+                <w:rFonts w:ascii="Arial" w:cs="Arial" w:eastAsia="Arial" w:hAnsi="Arial"/>
+                <w:b w:val="false"/>
+                <w:bCs w:val="false"/>
+                <w:sz w:val="18"/>
+                <w:szCs w:val="18"/>
+              </w:rPr>
+              <w:t xml:space="preserve"> = </w:t>
+            </w:r>
+            <w:r>
+              <w:rPr>
+                <w:rFonts w:ascii="Consolas" w:cs="Consolas" w:eastAsia="Consolas" w:hAnsi="Consolas"/>
+                <w:b w:val="false"/>
+                <w:bCs w:val="false"/>
+                <w:sz w:val="18"/>
+                <w:szCs w:val="18"/>
+              </w:rPr>
+              <w:t xml:space="preserve">{ma_khuyen_mai, ten_khuyen_mai, muc_giam_moi_ly}</w:t>
+            </w:r>
+            <w:r>
+              <w:rPr>
+                <w:rFonts w:ascii="Arial" w:cs="Arial" w:eastAsia="Arial" w:hAnsi="Arial"/>
+                <w:b w:val="false"/>
+                <w:bCs w:val="false"/>
+                <w:sz w:val="18"/>
+                <w:szCs w:val="18"/>
+              </w:rPr>
+              <w:t xml:space="preserve"> theo thứ tự mã tăng dần</w:t>
             </w:r>
           </w:p>
           <w:p>
@@ -5653,7 +5658,7 @@
                 <w:sz w:val="18"/>
                 <w:szCs w:val="18"/>
               </w:rPr>
-              <w:t xml:space="preserve">; </w:t>
+              <w:t xml:space="preserve">; TỰ ÁP khuyến mãi từng dòng: </w:t>
             </w:r>
             <w:r>
               <w:rPr>
@@ -5673,27 +5678,27 @@
                 <w:sz w:val="18"/>
                 <w:szCs w:val="18"/>
               </w:rPr>
-              <w:t xml:space="preserve"> = 0, </w:t>
-            </w:r>
-            <w:r>
-              <w:rPr>
-                <w:rFonts w:ascii="Consolas" w:cs="Consolas" w:eastAsia="Consolas" w:hAnsi="Consolas"/>
-                <w:b w:val="false"/>
-                <w:bCs w:val="false"/>
-                <w:sz w:val="18"/>
-                <w:szCs w:val="18"/>
-              </w:rPr>
-              <w:t xml:space="preserve">ma_khuyen_mai</w:t>
-            </w:r>
-            <w:r>
-              <w:rPr>
-                <w:rFonts w:ascii="Arial" w:cs="Arial" w:eastAsia="Arial" w:hAnsi="Arial"/>
-                <w:b w:val="false"/>
-                <w:bCs w:val="false"/>
-                <w:sz w:val="18"/>
-                <w:szCs w:val="18"/>
-              </w:rPr>
-              <w:t xml:space="preserve"> = NULL cho đến Sprint 3</w:t>
+              <w:t xml:space="preserve"> = số ly x tổng mức giảm mỗi ly; từng mã được chụp vào </w:t>
+            </w:r>
+            <w:r>
+              <w:rPr>
+                <w:rFonts w:ascii="Consolas" w:cs="Consolas" w:eastAsia="Consolas" w:hAnsi="Consolas"/>
+                <w:b w:val="false"/>
+                <w:bCs w:val="false"/>
+                <w:sz w:val="18"/>
+                <w:szCs w:val="18"/>
+              </w:rPr>
+              <w:t xml:space="preserve">ChiTietHoaDonKhuyenMai</w:t>
+            </w:r>
+            <w:r>
+              <w:rPr>
+                <w:rFonts w:ascii="Arial" w:cs="Arial" w:eastAsia="Arial" w:hAnsi="Arial"/>
+                <w:b w:val="false"/>
+                <w:bCs w:val="false"/>
+                <w:sz w:val="18"/>
+                <w:szCs w:val="18"/>
+              </w:rPr>
+              <w:t xml:space="preserve"> (mức giảm mỗi ly). Khóa chia sẻ các khuyến mãi dùng đến khi COMMIT nên không bị xóa/sửa chen giữa chừng</w:t>
             </w:r>
           </w:p>
           <w:p>
@@ -5750,7 +5755,7 @@
                 <w:sz w:val="18"/>
                 <w:szCs w:val="18"/>
               </w:rPr>
-              <w:t xml:space="preserve">{ma_hoa_don, so_thu_tu, thoi_gian_tao, trang_thai, ma_khach_hang, ten_khach_hang, ma_nhan_vien, ten_nhan_vien, chi_tiet[], tong_tien_tam_tinh, canh_bao_kho[]}</w:t>
+              <w:t xml:space="preserve">{ma_hoa_don, so_thu_tu, thoi_gian_tao, trang_thai, ma_khach_hang, ten_khach_hang, ma_nhan_vien, ten_nhan_vien, chi_tiet[] (mỗi dòng có giam_gia và khuyen_mai[] đã áp), tong_tien_hang, tong_giam_gia, tong_tien_tam_tinh, canh_bao_kho[]}</w:t>
             </w:r>
           </w:p>
           <w:p>
@@ -6140,7 +6145,7 @@
                 <w:sz w:val="18"/>
                 <w:szCs w:val="18"/>
               </w:rPr>
-              <w:t xml:space="preserve">Sản phẩm tồn tại và còn bán; snapshot giá lúc thêm (khuyến mãi từ Sprint 3)</w:t>
+              <w:t xml:space="preserve">Sản phẩm tồn tại và còn bán; snapshot giá lúc thêm và TỰ ÁP khuyến mãi đang hiệu lực lúc đó (dòng cũ giữ nguyên mức giảm đã chụp)</w:t>
             </w:r>
           </w:p>
           <w:p>
@@ -6622,7 +6627,7 @@
                 <w:sz w:val="18"/>
                 <w:szCs w:val="18"/>
               </w:rPr>
-              <w:t xml:space="preserve"> thì giữ nguyên mức giảm trên mỗi ly (</w:t>
+              <w:t xml:space="preserve"> thì giữ nguyên mức giảm trên mỗi ly ĐÃ CHỤP của dòng: </w:t>
             </w:r>
             <w:r>
               <w:rPr>
@@ -6642,7 +6647,27 @@
                 <w:sz w:val="18"/>
                 <w:szCs w:val="18"/>
               </w:rPr>
-              <w:t xml:space="preserve"> tính lại theo tỷ lệ)</w:t>
+              <w:t xml:space="preserve"> = số ly mới x tổng </w:t>
+            </w:r>
+            <w:r>
+              <w:rPr>
+                <w:rFonts w:ascii="Consolas" w:cs="Consolas" w:eastAsia="Consolas" w:hAnsi="Consolas"/>
+                <w:b w:val="false"/>
+                <w:bCs w:val="false"/>
+                <w:sz w:val="18"/>
+                <w:szCs w:val="18"/>
+              </w:rPr>
+              <w:t xml:space="preserve">muc_giam_moi_ly</w:t>
+            </w:r>
+            <w:r>
+              <w:rPr>
+                <w:rFonts w:ascii="Arial" w:cs="Arial" w:eastAsia="Arial" w:hAnsi="Arial"/>
+                <w:b w:val="false"/>
+                <w:bCs w:val="false"/>
+                <w:sz w:val="18"/>
+                <w:szCs w:val="18"/>
+              </w:rPr>
+              <w:t xml:space="preserve"> (không tính lại theo khuyến mãi hiện tại, kể cả khi khuyến mãi đã đổi hoặc hết hạn)</w:t>
             </w:r>
           </w:p>
           <w:p>
@@ -9723,7 +9748,17 @@
                 <w:sz w:val="18"/>
                 <w:szCs w:val="18"/>
               </w:rPr>
-              <w:t xml:space="preserve"> (số đã chốt, null nếu chưa thanh toán)</w:t>
+              <w:t xml:space="preserve"> (số đã chốt, null nếu chưa thanh toán); mỗi dòng kèm </w:t>
+            </w:r>
+            <w:r>
+              <w:rPr>
+                <w:rFonts w:ascii="Consolas" w:cs="Consolas" w:eastAsia="Consolas" w:hAnsi="Consolas"/>
+                <w:b w:val="false"/>
+                <w:bCs w:val="false"/>
+                <w:sz w:val="18"/>
+                <w:szCs w:val="18"/>
+              </w:rPr>
+              <w:t xml:space="preserve">khuyen_mai[]</w:t>
             </w:r>
           </w:p>
         </w:tc>
@@ -10265,7 +10300,27 @@
                 <w:sz w:val="18"/>
                 <w:szCs w:val="18"/>
               </w:rPr>
-              <w:t xml:space="preserve"> &gt; 0</w:t>
+              <w:t xml:space="preserve"> &gt; 0; ngày dạng </w:t>
+            </w:r>
+            <w:r>
+              <w:rPr>
+                <w:rFonts w:ascii="Consolas" w:cs="Consolas" w:eastAsia="Consolas" w:hAnsi="Consolas"/>
+                <w:b w:val="false"/>
+                <w:bCs w:val="false"/>
+                <w:sz w:val="18"/>
+                <w:szCs w:val="18"/>
+              </w:rPr>
+              <w:t xml:space="preserve">YYYY-MM-DDTHH:mm[:ss]</w:t>
+            </w:r>
+            <w:r>
+              <w:rPr>
+                <w:rFonts w:ascii="Arial" w:cs="Arial" w:eastAsia="Arial" w:hAnsi="Arial"/>
+                <w:b w:val="false"/>
+                <w:bCs w:val="false"/>
+                <w:sz w:val="18"/>
+                <w:szCs w:val="18"/>
+              </w:rPr>
+              <w:t xml:space="preserve"> (có thể kèm múi giờ; không nhận chỉ-ngày)</w:t>
             </w:r>
           </w:p>
           <w:p>
@@ -10320,7 +10375,22 @@
                 <w:sz w:val="18"/>
                 <w:szCs w:val="18"/>
               </w:rPr>
-              <w:t xml:space="preserve"> cùng transaction</w:t>
+              <w:t xml:space="preserve"> cùng transaction (sản phẩm ngừng bán vẫn gán được; thiếu sản phẩm: 404 và không tạo gì)</w:t>
+            </w:r>
+          </w:p>
+          <w:p>
+            <w:pPr>
+              <w:spacing w:after="20"/>
+            </w:pPr>
+            <w:r>
+              <w:rPr>
+                <w:rFonts w:ascii="Arial" w:cs="Arial" w:eastAsia="Arial" w:hAnsi="Arial"/>
+                <w:b w:val="false"/>
+                <w:bCs w:val="false"/>
+                <w:sz w:val="18"/>
+                <w:szCs w:val="18"/>
+              </w:rPr>
+              <w:t xml:space="preserve">Một sản phẩm thuộc được NHIỀU khuyến mãi cùng lúc (cộng dồn khi áp, xem 7b)</w:t>
             </w:r>
           </w:p>
         </w:tc>
@@ -10352,7 +10422,7 @@
                 <w:sz w:val="18"/>
                 <w:szCs w:val="18"/>
               </w:rPr>
-              <w:t xml:space="preserve">{ma_khuyen_mai, ...}</w:t>
+              <w:t xml:space="preserve">{ma_khuyen_mai, ..., trang_thai, so_san_pham, so_luot_dung, san_pham[]}</w:t>
             </w:r>
           </w:p>
         </w:tc>
@@ -10384,7 +10454,7 @@
                 <w:sz w:val="18"/>
                 <w:szCs w:val="18"/>
               </w:rPr>
-              <w:t xml:space="preserve">400</w:t>
+              <w:t xml:space="preserve">400; 404 sản phẩm</w:t>
             </w:r>
           </w:p>
         </w:tc>
@@ -10495,7 +10565,7 @@
                 <w:sz w:val="18"/>
                 <w:szCs w:val="18"/>
               </w:rPr>
-              <w:t xml:space="preserve">, các trường cần đổi</w:t>
+              <w:t xml:space="preserve">, các trường cần đổi (không gồm sản phẩm: dùng KM-04/05)</w:t>
             </w:r>
           </w:p>
         </w:tc>
@@ -10527,7 +10597,27 @@
                 <w:sz w:val="18"/>
                 <w:szCs w:val="18"/>
               </w:rPr>
-              <w:t xml:space="preserve">Như KM-01. Không ảnh hưởng hóa đơn cũ (đã snapshot)</w:t>
+              <w:t xml:space="preserve">Như KM-01, kiểm tra trên dữ liệu SAU khi gộp với dữ liệu cũ (ví dụ đổi sang </w:t>
+            </w:r>
+            <w:r>
+              <w:rPr>
+                <w:rFonts w:ascii="Consolas" w:cs="Consolas" w:eastAsia="Consolas" w:hAnsi="Consolas"/>
+                <w:b w:val="false"/>
+                <w:bCs w:val="false"/>
+                <w:sz w:val="18"/>
+                <w:szCs w:val="18"/>
+              </w:rPr>
+              <w:t xml:space="preserve">phan_tram</w:t>
+            </w:r>
+            <w:r>
+              <w:rPr>
+                <w:rFonts w:ascii="Arial" w:cs="Arial" w:eastAsia="Arial" w:hAnsi="Arial"/>
+                <w:b w:val="false"/>
+                <w:bCs w:val="false"/>
+                <w:sz w:val="18"/>
+                <w:szCs w:val="18"/>
+              </w:rPr>
+              <w:t xml:space="preserve"> mà giữ 50000 là sai). Không ảnh hưởng hóa đơn cũ và dòng order đang mở đã chụp mức giảm</w:t>
             </w:r>
           </w:p>
         </w:tc>
@@ -10559,7 +10649,27 @@
                 <w:sz w:val="18"/>
                 <w:szCs w:val="18"/>
               </w:rPr>
-              <w:t xml:space="preserve">Khuyến mãi cập nhật</w:t>
+              <w:t xml:space="preserve">Khuyến mãi cập nhật (kèm </w:t>
+            </w:r>
+            <w:r>
+              <w:rPr>
+                <w:rFonts w:ascii="Consolas" w:cs="Consolas" w:eastAsia="Consolas" w:hAnsi="Consolas"/>
+                <w:b w:val="false"/>
+                <w:bCs w:val="false"/>
+                <w:sz w:val="18"/>
+                <w:szCs w:val="18"/>
+              </w:rPr>
+              <w:t xml:space="preserve">san_pham[]</w:t>
+            </w:r>
+            <w:r>
+              <w:rPr>
+                <w:rFonts w:ascii="Arial" w:cs="Arial" w:eastAsia="Arial" w:hAnsi="Arial"/>
+                <w:b w:val="false"/>
+                <w:bCs w:val="false"/>
+                <w:sz w:val="18"/>
+                <w:szCs w:val="18"/>
+              </w:rPr>
+              <w:t xml:space="preserve">)</w:t>
             </w:r>
           </w:p>
         </w:tc>
@@ -10591,7 +10701,7 @@
                 <w:sz w:val="18"/>
                 <w:szCs w:val="18"/>
               </w:rPr>
-              <w:t xml:space="preserve">404</w:t>
+              <w:t xml:space="preserve">400; 404</w:t>
             </w:r>
           </w:p>
         </w:tc>
@@ -10734,27 +10844,47 @@
                 <w:sz w:val="18"/>
                 <w:szCs w:val="18"/>
               </w:rPr>
-              <w:t xml:space="preserve">ChiTietHoaDon.ma_khuyen_mai</w:t>
-            </w:r>
-            <w:r>
-              <w:rPr>
-                <w:rFonts w:ascii="Arial" w:cs="Arial" w:eastAsia="Arial" w:hAnsi="Arial"/>
-                <w:b w:val="false"/>
-                <w:bCs w:val="false"/>
-                <w:sz w:val="18"/>
-                <w:szCs w:val="18"/>
-              </w:rPr>
-              <w:t xml:space="preserve"> tham chiếu thì chặn xóa, gợi ý đặt </w:t>
-            </w:r>
-            <w:r>
-              <w:rPr>
-                <w:rFonts w:ascii="Consolas" w:cs="Consolas" w:eastAsia="Consolas" w:hAnsi="Consolas"/>
-                <w:b w:val="false"/>
-                <w:bCs w:val="false"/>
-                <w:sz w:val="18"/>
-                <w:szCs w:val="18"/>
-              </w:rPr>
-              <w:t xml:space="preserve">ngay_ket_thuc = NOW()</w:t>
+              <w:t xml:space="preserve">ChiTietHoaDonKhuyenMai</w:t>
+            </w:r>
+            <w:r>
+              <w:rPr>
+                <w:rFonts w:ascii="Arial" w:cs="Arial" w:eastAsia="Arial" w:hAnsi="Arial"/>
+                <w:b w:val="false"/>
+                <w:bCs w:val="false"/>
+                <w:sz w:val="18"/>
+                <w:szCs w:val="18"/>
+              </w:rPr>
+              <w:t xml:space="preserve"> tham chiếu (kể cả order đang mở hoặc đã hủy, khuyến mãi đã hết hạn) thì chặn xóa, gợi ý đặt </w:t>
+            </w:r>
+            <w:r>
+              <w:rPr>
+                <w:rFonts w:ascii="Consolas" w:cs="Consolas" w:eastAsia="Consolas" w:hAnsi="Consolas"/>
+                <w:b w:val="false"/>
+                <w:bCs w:val="false"/>
+                <w:sz w:val="18"/>
+                <w:szCs w:val="18"/>
+              </w:rPr>
+              <w:t xml:space="preserve">ngay_ket_thuc</w:t>
+            </w:r>
+            <w:r>
+              <w:rPr>
+                <w:rFonts w:ascii="Arial" w:cs="Arial" w:eastAsia="Arial" w:hAnsi="Arial"/>
+                <w:b w:val="false"/>
+                <w:bCs w:val="false"/>
+                <w:sz w:val="18"/>
+                <w:szCs w:val="18"/>
+              </w:rPr>
+              <w:t xml:space="preserve"> về hiện tại. Chưa dùng: xóa kèm </w:t>
+            </w:r>
+            <w:r>
+              <w:rPr>
+                <w:rFonts w:ascii="Consolas" w:cs="Consolas" w:eastAsia="Consolas" w:hAnsi="Consolas"/>
+                <w:b w:val="false"/>
+                <w:bCs w:val="false"/>
+                <w:sz w:val="18"/>
+                <w:szCs w:val="18"/>
+              </w:rPr>
+              <w:t xml:space="preserve">KhuyenMaiSanPham</w:t>
             </w:r>
           </w:p>
         </w:tc>
@@ -10818,7 +10948,17 @@
                 <w:sz w:val="18"/>
                 <w:szCs w:val="18"/>
               </w:rPr>
-              <w:t xml:space="preserve">409 đã được dùng</w:t>
+              <w:t xml:space="preserve">404; 409 </w:t>
+            </w:r>
+            <w:r>
+              <w:rPr>
+                <w:rFonts w:ascii="Consolas" w:cs="Consolas" w:eastAsia="Consolas" w:hAnsi="Consolas"/>
+                <w:b w:val="false"/>
+                <w:bCs w:val="false"/>
+                <w:sz w:val="18"/>
+                <w:szCs w:val="18"/>
+              </w:rPr>
+              <w:t xml:space="preserve">KHUYEN_MAI_DA_DUOC_DUNG</w:t>
             </w:r>
           </w:p>
         </w:tc>
@@ -10941,6 +11081,16 @@
               </w:rPr>
               <w:t xml:space="preserve">ma_san_pham[]</w:t>
             </w:r>
+            <w:r>
+              <w:rPr>
+                <w:rFonts w:ascii="Arial" w:cs="Arial" w:eastAsia="Arial" w:hAnsi="Arial"/>
+                <w:b w:val="false"/>
+                <w:bCs w:val="false"/>
+                <w:sz w:val="18"/>
+                <w:szCs w:val="18"/>
+              </w:rPr>
+              <w:t xml:space="preserve"> (1–100)</w:t>
+            </w:r>
           </w:p>
         </w:tc>
         <w:tc>
@@ -10971,7 +11121,7 @@
                 <w:sz w:val="18"/>
                 <w:szCs w:val="18"/>
               </w:rPr>
-              <w:t xml:space="preserve">Bỏ qua cặp đã tồn tại</w:t>
+              <w:t xml:space="preserve">Bỏ qua cặp đã tồn tại (an toàn khi gọi đồng thời); sản phẩm phải tồn tại</w:t>
             </w:r>
           </w:p>
         </w:tc>
@@ -11003,7 +11153,7 @@
                 <w:sz w:val="18"/>
                 <w:szCs w:val="18"/>
               </w:rPr>
-              <w:t xml:space="preserve">Danh sách sản phẩm hiện tại</w:t>
+              <w:t xml:space="preserve">Danh sách sản phẩm hiện tại của khuyến mãi</w:t>
             </w:r>
           </w:p>
         </w:tc>
@@ -11035,7 +11185,7 @@
                 <w:sz w:val="18"/>
                 <w:szCs w:val="18"/>
               </w:rPr>
-              <w:t xml:space="preserve">404</w:t>
+              <w:t xml:space="preserve">400; 404</w:t>
             </w:r>
           </w:p>
         </w:tc>
@@ -11200,6 +11350,16 @@
               </w:rPr>
               <w:t xml:space="preserve">KhuyenMaiSanPham</w:t>
             </w:r>
+            <w:r>
+              <w:rPr>
+                <w:rFonts w:ascii="Arial" w:cs="Arial" w:eastAsia="Arial" w:hAnsi="Arial"/>
+                <w:b w:val="false"/>
+                <w:bCs w:val="false"/>
+                <w:sz w:val="18"/>
+                <w:szCs w:val="18"/>
+              </w:rPr>
+              <w:t xml:space="preserve">; sản phẩm không thuộc khuyến mãi: 404</w:t>
+            </w:r>
           </w:p>
         </w:tc>
         <w:tc>
@@ -11230,7 +11390,7 @@
                 <w:sz w:val="18"/>
                 <w:szCs w:val="18"/>
               </w:rPr>
-              <w:t xml:space="preserve">Danh sách còn lại</w:t>
+              <w:t xml:space="preserve">Danh sách còn lại (có thể rỗng)</w:t>
             </w:r>
           </w:p>
         </w:tc>
@@ -11732,6 +11892,26 @@
                 <w:sz w:val="18"/>
                 <w:szCs w:val="18"/>
               </w:rPr>
+              <w:t xml:space="preserve">ChiTietHoaDonKhuyenMai</w:t>
+            </w:r>
+            <w:r>
+              <w:rPr>
+                <w:rFonts w:ascii="Arial" w:cs="Arial" w:eastAsia="Arial" w:hAnsi="Arial"/>
+                <w:b w:val="false"/>
+                <w:bCs w:val="false"/>
+                <w:sz w:val="18"/>
+                <w:szCs w:val="18"/>
+              </w:rPr>
+              <w:t xml:space="preserve"> JOIN </w:t>
+            </w:r>
+            <w:r>
+              <w:rPr>
+                <w:rFonts w:ascii="Consolas" w:cs="Consolas" w:eastAsia="Consolas" w:hAnsi="Consolas"/>
+                <w:b w:val="false"/>
+                <w:bCs w:val="false"/>
+                <w:sz w:val="18"/>
+                <w:szCs w:val="18"/>
+              </w:rPr>
               <w:t xml:space="preserve">ChiTietHoaDon</w:t>
             </w:r>
             <w:r>
@@ -11742,27 +11922,152 @@
                 <w:sz w:val="18"/>
                 <w:szCs w:val="18"/>
               </w:rPr>
-              <w:t xml:space="preserve"> (chỉ hóa đơn </w:t>
-            </w:r>
-            <w:r>
-              <w:rPr>
-                <w:rFonts w:ascii="Consolas" w:cs="Consolas" w:eastAsia="Consolas" w:hAnsi="Consolas"/>
-                <w:b w:val="false"/>
-                <w:bCs w:val="false"/>
-                <w:sz w:val="18"/>
-                <w:szCs w:val="18"/>
-              </w:rPr>
-              <w:t xml:space="preserve">da_thanh_toan</w:t>
-            </w:r>
-            <w:r>
-              <w:rPr>
-                <w:rFonts w:ascii="Arial" w:cs="Arial" w:eastAsia="Arial" w:hAnsi="Arial"/>
-                <w:b w:val="false"/>
-                <w:bCs w:val="false"/>
-                <w:sz w:val="18"/>
-                <w:szCs w:val="18"/>
-              </w:rPr>
-              <w:t xml:space="preserve">)</w:t>
+              <w:t xml:space="preserve"> JOIN </w:t>
+            </w:r>
+            <w:r>
+              <w:rPr>
+                <w:rFonts w:ascii="Consolas" w:cs="Consolas" w:eastAsia="Consolas" w:hAnsi="Consolas"/>
+                <w:b w:val="false"/>
+                <w:bCs w:val="false"/>
+                <w:sz w:val="18"/>
+                <w:szCs w:val="18"/>
+              </w:rPr>
+              <w:t xml:space="preserve">HoaDonDaThanhToan</w:t>
+            </w:r>
+            <w:r>
+              <w:rPr>
+                <w:rFonts w:ascii="Arial" w:cs="Arial" w:eastAsia="Arial" w:hAnsi="Arial"/>
+                <w:b w:val="false"/>
+                <w:bCs w:val="false"/>
+                <w:sz w:val="18"/>
+                <w:szCs w:val="18"/>
+              </w:rPr>
+              <w:t xml:space="preserve"> (chỉ hóa đơn đã thanh toán); </w:t>
+            </w:r>
+            <w:r>
+              <w:rPr>
+                <w:rFonts w:ascii="Consolas" w:cs="Consolas" w:eastAsia="Consolas" w:hAnsi="Consolas"/>
+                <w:b w:val="false"/>
+                <w:bCs w:val="false"/>
+                <w:sz w:val="18"/>
+                <w:szCs w:val="18"/>
+              </w:rPr>
+              <w:t xml:space="preserve">tu_ngay</w:t>
+            </w:r>
+            <w:r>
+              <w:rPr>
+                <w:rFonts w:ascii="Arial" w:cs="Arial" w:eastAsia="Arial" w:hAnsi="Arial"/>
+                <w:b w:val="false"/>
+                <w:bCs w:val="false"/>
+                <w:sz w:val="18"/>
+                <w:szCs w:val="18"/>
+              </w:rPr>
+              <w:t xml:space="preserve">/</w:t>
+            </w:r>
+            <w:r>
+              <w:rPr>
+                <w:rFonts w:ascii="Consolas" w:cs="Consolas" w:eastAsia="Consolas" w:hAnsi="Consolas"/>
+                <w:b w:val="false"/>
+                <w:bCs w:val="false"/>
+                <w:sz w:val="18"/>
+                <w:szCs w:val="18"/>
+              </w:rPr>
+              <w:t xml:space="preserve">den_ngay</w:t>
+            </w:r>
+            <w:r>
+              <w:rPr>
+                <w:rFonts w:ascii="Arial" w:cs="Arial" w:eastAsia="Arial" w:hAnsi="Arial"/>
+                <w:b w:val="false"/>
+                <w:bCs w:val="false"/>
+                <w:sz w:val="18"/>
+                <w:szCs w:val="18"/>
+              </w:rPr>
+              <w:t xml:space="preserve"> (YYYY-MM-DD, gồm cả hai đầu) lọc theo NGÀY THANH TOÁN</w:t>
+            </w:r>
+          </w:p>
+          <w:p>
+            <w:pPr>
+              <w:spacing w:after="20"/>
+            </w:pPr>
+            <w:r>
+              <w:rPr>
+                <w:rFonts w:ascii="Consolas" w:cs="Consolas" w:eastAsia="Consolas" w:hAnsi="Consolas"/>
+                <w:b w:val="false"/>
+                <w:bCs w:val="false"/>
+                <w:sz w:val="18"/>
+                <w:szCs w:val="18"/>
+              </w:rPr>
+              <w:t xml:space="preserve">so_luong_ban</w:t>
+            </w:r>
+            <w:r>
+              <w:rPr>
+                <w:rFonts w:ascii="Arial" w:cs="Arial" w:eastAsia="Arial" w:hAnsi="Arial"/>
+                <w:b w:val="false"/>
+                <w:bCs w:val="false"/>
+                <w:sz w:val="18"/>
+                <w:szCs w:val="18"/>
+              </w:rPr>
+              <w:t xml:space="preserve"> = số LY có áp mã; </w:t>
+            </w:r>
+            <w:r>
+              <w:rPr>
+                <w:rFonts w:ascii="Consolas" w:cs="Consolas" w:eastAsia="Consolas" w:hAnsi="Consolas"/>
+                <w:b w:val="false"/>
+                <w:bCs w:val="false"/>
+                <w:sz w:val="18"/>
+                <w:szCs w:val="18"/>
+              </w:rPr>
+              <w:t xml:space="preserve">tong_tien_giam</w:t>
+            </w:r>
+            <w:r>
+              <w:rPr>
+                <w:rFonts w:ascii="Arial" w:cs="Arial" w:eastAsia="Arial" w:hAnsi="Arial"/>
+                <w:b w:val="false"/>
+                <w:bCs w:val="false"/>
+                <w:sz w:val="18"/>
+                <w:szCs w:val="18"/>
+              </w:rPr>
+              <w:t xml:space="preserve"> = SUM(</w:t>
+            </w:r>
+            <w:r>
+              <w:rPr>
+                <w:rFonts w:ascii="Consolas" w:cs="Consolas" w:eastAsia="Consolas" w:hAnsi="Consolas"/>
+                <w:b w:val="false"/>
+                <w:bCs w:val="false"/>
+                <w:sz w:val="18"/>
+                <w:szCs w:val="18"/>
+              </w:rPr>
+              <w:t xml:space="preserve">muc_giam_moi_ly</w:t>
+            </w:r>
+            <w:r>
+              <w:rPr>
+                <w:rFonts w:ascii="Arial" w:cs="Arial" w:eastAsia="Arial" w:hAnsi="Arial"/>
+                <w:b w:val="false"/>
+                <w:bCs w:val="false"/>
+                <w:sz w:val="18"/>
+                <w:szCs w:val="18"/>
+              </w:rPr>
+              <w:t xml:space="preserve"> x số ly), tiền giảm do RIÊNG mã này; </w:t>
+            </w:r>
+            <w:r>
+              <w:rPr>
+                <w:rFonts w:ascii="Consolas" w:cs="Consolas" w:eastAsia="Consolas" w:hAnsi="Consolas"/>
+                <w:b w:val="false"/>
+                <w:bCs w:val="false"/>
+                <w:sz w:val="18"/>
+                <w:szCs w:val="18"/>
+              </w:rPr>
+              <w:t xml:space="preserve">doanh_thu_sau_giam</w:t>
+            </w:r>
+            <w:r>
+              <w:rPr>
+                <w:rFonts w:ascii="Arial" w:cs="Arial" w:eastAsia="Arial" w:hAnsi="Arial"/>
+                <w:b w:val="false"/>
+                <w:bCs w:val="false"/>
+                <w:sz w:val="18"/>
+                <w:szCs w:val="18"/>
+              </w:rPr>
+              <w:t xml:space="preserve"> = doanh thu các dòng có áp mã SAU toàn bộ giảm (kể cả mã khác cộng dồn trên cùng dòng, nên cộng doanh thu của nhiều mã sẽ bị tính trùng)</w:t>
             </w:r>
           </w:p>
         </w:tc>
@@ -11794,7 +12099,7 @@
                 <w:sz w:val="18"/>
                 <w:szCs w:val="18"/>
               </w:rPr>
-              <w:t xml:space="preserve">{so_luong_ban, tong_tien_giam, doanh_thu_sau_giam}</w:t>
+              <w:t xml:space="preserve">{ma_khuyen_mai, ten_khuyen_mai, tu_ngay, den_ngay, so_hoa_don, so_luong_ban, tong_tien_giam, doanh_thu_sau_giam}</w:t>
             </w:r>
           </w:p>
         </w:tc>
@@ -11818,6 +12123,16 @@
             <w:pPr>
               <w:spacing w:after="20"/>
             </w:pPr>
+            <w:r>
+              <w:rPr>
+                <w:rFonts w:ascii="Arial" w:cs="Arial" w:eastAsia="Arial" w:hAnsi="Arial"/>
+                <w:b w:val="false"/>
+                <w:bCs w:val="false"/>
+                <w:sz w:val="18"/>
+                <w:szCs w:val="18"/>
+              </w:rPr>
+              <w:t xml:space="preserve">400 ngày sai; 404</w:t>
+            </w:r>
           </w:p>
         </w:tc>
       </w:tr>
@@ -13992,6 +14307,36 @@
               </w:rPr>
               <w:t xml:space="preserve">don_vi_tinh</w:t>
             </w:r>
+            <w:r>
+              <w:rPr>
+                <w:rFonts w:ascii="Arial" w:cs="Arial" w:eastAsia="Arial" w:hAnsi="Arial"/>
+                <w:b w:val="false"/>
+                <w:bCs w:val="false"/>
+                <w:sz w:val="18"/>
+                <w:szCs w:val="18"/>
+              </w:rPr>
+              <w:t xml:space="preserve">, </w:t>
+            </w:r>
+            <w:r>
+              <w:rPr>
+                <w:rFonts w:ascii="Consolas" w:cs="Consolas" w:eastAsia="Consolas" w:hAnsi="Consolas"/>
+                <w:b w:val="false"/>
+                <w:bCs w:val="false"/>
+                <w:sz w:val="18"/>
+                <w:szCs w:val="18"/>
+              </w:rPr>
+              <w:t xml:space="preserve">muc_ton_toi_thieu?</w:t>
+            </w:r>
+            <w:r>
+              <w:rPr>
+                <w:rFonts w:ascii="Arial" w:cs="Arial" w:eastAsia="Arial" w:hAnsi="Arial"/>
+                <w:b w:val="false"/>
+                <w:bCs w:val="false"/>
+                <w:sz w:val="18"/>
+                <w:szCs w:val="18"/>
+              </w:rPr>
+              <w:t xml:space="preserve"> (mặc định 0)</w:t>
+            </w:r>
           </w:p>
         </w:tc>
         <w:tc>
@@ -14032,7 +14377,97 @@
                 <w:sz w:val="18"/>
                 <w:szCs w:val="18"/>
               </w:rPr>
-              <w:t xml:space="preserve"> khởi tạo 0, chỉ đổi qua nhập/xuất</w:t>
+              <w:t xml:space="preserve"> khởi tạo 0 và KHÔNG sửa được từ đây (gửi trường này hay trường lạ: 400); chỉ đổi qua nhập hàng (tăng) và bán hàng (giảm)</w:t>
+            </w:r>
+          </w:p>
+          <w:p>
+            <w:pPr>
+              <w:spacing w:after="20"/>
+            </w:pPr>
+            <w:r>
+              <w:rPr>
+                <w:rFonts w:ascii="Arial" w:cs="Arial" w:eastAsia="Arial" w:hAnsi="Arial"/>
+                <w:b w:val="false"/>
+                <w:bCs w:val="false"/>
+                <w:sz w:val="18"/>
+                <w:szCs w:val="18"/>
+              </w:rPr>
+              <w:t xml:space="preserve">Tên không trùng, không phân biệt hoa thường (409 </w:t>
+            </w:r>
+            <w:r>
+              <w:rPr>
+                <w:rFonts w:ascii="Consolas" w:cs="Consolas" w:eastAsia="Consolas" w:hAnsi="Consolas"/>
+                <w:b w:val="false"/>
+                <w:bCs w:val="false"/>
+                <w:sz w:val="18"/>
+                <w:szCs w:val="18"/>
+              </w:rPr>
+              <w:t xml:space="preserve">TRUNG_TEN_NGUYEN_LIEU</w:t>
+            </w:r>
+            <w:r>
+              <w:rPr>
+                <w:rFonts w:ascii="Arial" w:cs="Arial" w:eastAsia="Arial" w:hAnsi="Arial"/>
+                <w:b w:val="false"/>
+                <w:bCs w:val="false"/>
+                <w:sz w:val="18"/>
+                <w:szCs w:val="18"/>
+              </w:rPr>
+              <w:t xml:space="preserve">); tự cắt khoảng trắng; số lượng tối đa 3 chữ số thập phân</w:t>
+            </w:r>
+          </w:p>
+          <w:p>
+            <w:pPr>
+              <w:spacing w:after="20"/>
+            </w:pPr>
+            <w:r>
+              <w:rPr>
+                <w:rFonts w:ascii="Arial" w:cs="Arial" w:eastAsia="Arial" w:hAnsi="Arial"/>
+                <w:b w:val="false"/>
+                <w:bCs w:val="false"/>
+                <w:sz w:val="18"/>
+                <w:szCs w:val="18"/>
+              </w:rPr>
+              <w:t xml:space="preserve">Đổi </w:t>
+            </w:r>
+            <w:r>
+              <w:rPr>
+                <w:rFonts w:ascii="Consolas" w:cs="Consolas" w:eastAsia="Consolas" w:hAnsi="Consolas"/>
+                <w:b w:val="false"/>
+                <w:bCs w:val="false"/>
+                <w:sz w:val="18"/>
+                <w:szCs w:val="18"/>
+              </w:rPr>
+              <w:t xml:space="preserve">don_vi_tinh</w:t>
+            </w:r>
+            <w:r>
+              <w:rPr>
+                <w:rFonts w:ascii="Arial" w:cs="Arial" w:eastAsia="Arial" w:hAnsi="Arial"/>
+                <w:b w:val="false"/>
+                <w:bCs w:val="false"/>
+                <w:sz w:val="18"/>
+                <w:szCs w:val="18"/>
+              </w:rPr>
+              <w:t xml:space="preserve"> bị chặn khi còn tồn hoặc đã có trong công thức/phiếu nhập (409 </w:t>
+            </w:r>
+            <w:r>
+              <w:rPr>
+                <w:rFonts w:ascii="Consolas" w:cs="Consolas" w:eastAsia="Consolas" w:hAnsi="Consolas"/>
+                <w:b w:val="false"/>
+                <w:bCs w:val="false"/>
+                <w:sz w:val="18"/>
+                <w:szCs w:val="18"/>
+              </w:rPr>
+              <w:t xml:space="preserve">KHONG_DOI_DON_VI</w:t>
+            </w:r>
+            <w:r>
+              <w:rPr>
+                <w:rFonts w:ascii="Arial" w:cs="Arial" w:eastAsia="Arial" w:hAnsi="Arial"/>
+                <w:b w:val="false"/>
+                <w:bCs w:val="false"/>
+                <w:sz w:val="18"/>
+                <w:szCs w:val="18"/>
+              </w:rPr>
+              <w:t xml:space="preserve">)</w:t>
             </w:r>
           </w:p>
           <w:p>
@@ -14079,6 +14514,71 @@
               </w:rPr>
               <w:t xml:space="preserve">ChiTietNhap</w:t>
             </w:r>
+            <w:r>
+              <w:rPr>
+                <w:rFonts w:ascii="Arial" w:cs="Arial" w:eastAsia="Arial" w:hAnsi="Arial"/>
+                <w:b w:val="false"/>
+                <w:bCs w:val="false"/>
+                <w:sz w:val="18"/>
+                <w:szCs w:val="18"/>
+              </w:rPr>
+              <w:t xml:space="preserve"> (409 </w:t>
+            </w:r>
+            <w:r>
+              <w:rPr>
+                <w:rFonts w:ascii="Consolas" w:cs="Consolas" w:eastAsia="Consolas" w:hAnsi="Consolas"/>
+                <w:b w:val="false"/>
+                <w:bCs w:val="false"/>
+                <w:sz w:val="18"/>
+                <w:szCs w:val="18"/>
+              </w:rPr>
+              <w:t xml:space="preserve">NGUYEN_LIEU_DANG_DUNG</w:t>
+            </w:r>
+            <w:r>
+              <w:rPr>
+                <w:rFonts w:ascii="Arial" w:cs="Arial" w:eastAsia="Arial" w:hAnsi="Arial"/>
+                <w:b w:val="false"/>
+                <w:bCs w:val="false"/>
+                <w:sz w:val="18"/>
+                <w:szCs w:val="18"/>
+              </w:rPr>
+              <w:t xml:space="preserve">, </w:t>
+            </w:r>
+            <w:r>
+              <w:rPr>
+                <w:rFonts w:ascii="Consolas" w:cs="Consolas" w:eastAsia="Consolas" w:hAnsi="Consolas"/>
+                <w:b w:val="false"/>
+                <w:bCs w:val="false"/>
+                <w:sz w:val="18"/>
+                <w:szCs w:val="18"/>
+              </w:rPr>
+              <w:t xml:space="preserve">chi_tiet: {cong_thuc, phieu_nhap}</w:t>
+            </w:r>
+            <w:r>
+              <w:rPr>
+                <w:rFonts w:ascii="Arial" w:cs="Arial" w:eastAsia="Arial" w:hAnsi="Arial"/>
+                <w:b w:val="false"/>
+                <w:bCs w:val="false"/>
+                <w:sz w:val="18"/>
+                <w:szCs w:val="18"/>
+              </w:rPr>
+              <w:t xml:space="preserve">)</w:t>
+            </w:r>
+          </w:p>
+          <w:p>
+            <w:pPr>
+              <w:spacing w:after="20"/>
+            </w:pPr>
+            <w:r>
+              <w:rPr>
+                <w:rFonts w:ascii="Arial" w:cs="Arial" w:eastAsia="Arial" w:hAnsi="Arial"/>
+                <w:b w:val="false"/>
+                <w:bCs w:val="false"/>
+                <w:sz w:val="18"/>
+                <w:szCs w:val="18"/>
+              </w:rPr>
+              <w:t xml:space="preserve">Mọi sửa/xóa khóa dòng nguyên liệu (FOR UPDATE) trước</w:t>
+            </w:r>
           </w:p>
         </w:tc>
         <w:tc>
@@ -14109,7 +14609,47 @@
                 <w:sz w:val="18"/>
                 <w:szCs w:val="18"/>
               </w:rPr>
-              <w:t xml:space="preserve">Nguyên liệu</w:t>
+              <w:t xml:space="preserve">Nguyên liệu </w:t>
+            </w:r>
+            <w:r>
+              <w:rPr>
+                <w:rFonts w:ascii="Consolas" w:cs="Consolas" w:eastAsia="Consolas" w:hAnsi="Consolas"/>
+                <w:b w:val="false"/>
+                <w:bCs w:val="false"/>
+                <w:sz w:val="18"/>
+                <w:szCs w:val="18"/>
+              </w:rPr>
+              <w:t xml:space="preserve">{ma_nguyen_lieu, ten_nguyen_lieu, don_vi_tinh, so_luong_ton, muc_ton_toi_thieu}</w:t>
+            </w:r>
+            <w:r>
+              <w:rPr>
+                <w:rFonts w:ascii="Arial" w:cs="Arial" w:eastAsia="Arial" w:hAnsi="Arial"/>
+                <w:b w:val="false"/>
+                <w:bCs w:val="false"/>
+                <w:sz w:val="18"/>
+                <w:szCs w:val="18"/>
+              </w:rPr>
+              <w:t xml:space="preserve">; danh sách có </w:t>
+            </w:r>
+            <w:r>
+              <w:rPr>
+                <w:rFonts w:ascii="Consolas" w:cs="Consolas" w:eastAsia="Consolas" w:hAnsi="Consolas"/>
+                <w:b w:val="false"/>
+                <w:bCs w:val="false"/>
+                <w:sz w:val="18"/>
+                <w:szCs w:val="18"/>
+              </w:rPr>
+              <w:t xml:space="preserve">tu_khoa</w:t>
+            </w:r>
+            <w:r>
+              <w:rPr>
+                <w:rFonts w:ascii="Arial" w:cs="Arial" w:eastAsia="Arial" w:hAnsi="Arial"/>
+                <w:b w:val="false"/>
+                <w:bCs w:val="false"/>
+                <w:sz w:val="18"/>
+                <w:szCs w:val="18"/>
+              </w:rPr>
+              <w:t xml:space="preserve">, phân trang</w:t>
             </w:r>
           </w:p>
         </w:tc>
@@ -14141,7 +14681,37 @@
                 <w:sz w:val="18"/>
                 <w:szCs w:val="18"/>
               </w:rPr>
-              <w:t xml:space="preserve">409 đang được dùng</w:t>
+              <w:t xml:space="preserve">400</w:t>
+            </w:r>
+          </w:p>
+          <w:p>
+            <w:pPr>
+              <w:spacing w:after="20"/>
+            </w:pPr>
+            <w:r>
+              <w:rPr>
+                <w:rFonts w:ascii="Arial" w:cs="Arial" w:eastAsia="Arial" w:hAnsi="Arial"/>
+                <w:b w:val="false"/>
+                <w:bCs w:val="false"/>
+                <w:sz w:val="18"/>
+                <w:szCs w:val="18"/>
+              </w:rPr>
+              <w:t xml:space="preserve">404</w:t>
+            </w:r>
+          </w:p>
+          <w:p>
+            <w:pPr>
+              <w:spacing w:after="20"/>
+            </w:pPr>
+            <w:r>
+              <w:rPr>
+                <w:rFonts w:ascii="Arial" w:cs="Arial" w:eastAsia="Arial" w:hAnsi="Arial"/>
+                <w:b w:val="false"/>
+                <w:bCs w:val="false"/>
+                <w:sz w:val="18"/>
+                <w:szCs w:val="18"/>
+              </w:rPr>
+              <w:t xml:space="preserve">409</w:t>
             </w:r>
           </w:p>
         </w:tc>
@@ -14262,7 +14832,7 @@
                 <w:sz w:val="18"/>
                 <w:szCs w:val="18"/>
               </w:rPr>
-              <w:t xml:space="preserve">so_dien_thoai</w:t>
+              <w:t xml:space="preserve">so_dien_thoai?</w:t>
             </w:r>
             <w:r>
               <w:rPr>
@@ -14282,7 +14852,7 @@
                 <w:sz w:val="18"/>
                 <w:szCs w:val="18"/>
               </w:rPr>
-              <w:t xml:space="preserve">dia_chi</w:t>
+              <w:t xml:space="preserve">dia_chi?</w:t>
             </w:r>
           </w:p>
         </w:tc>
@@ -14314,6 +14884,41 @@
                 <w:sz w:val="18"/>
                 <w:szCs w:val="18"/>
               </w:rPr>
+              <w:t xml:space="preserve">SĐT 10–11 chữ số bắt đầu bằng 0; sửa với </w:t>
+            </w:r>
+            <w:r>
+              <w:rPr>
+                <w:rFonts w:ascii="Consolas" w:cs="Consolas" w:eastAsia="Consolas" w:hAnsi="Consolas"/>
+                <w:b w:val="false"/>
+                <w:bCs w:val="false"/>
+                <w:sz w:val="18"/>
+                <w:szCs w:val="18"/>
+              </w:rPr>
+              <w:t xml:space="preserve">null</w:t>
+            </w:r>
+            <w:r>
+              <w:rPr>
+                <w:rFonts w:ascii="Arial" w:cs="Arial" w:eastAsia="Arial" w:hAnsi="Arial"/>
+                <w:b w:val="false"/>
+                <w:bCs w:val="false"/>
+                <w:sz w:val="18"/>
+                <w:szCs w:val="18"/>
+              </w:rPr>
+              <w:t xml:space="preserve"> để xóa SĐT/địa chỉ; danh sách tìm theo tên hoặc SĐT, phân trang</w:t>
+            </w:r>
+          </w:p>
+          <w:p>
+            <w:pPr>
+              <w:spacing w:after="20"/>
+            </w:pPr>
+            <w:r>
+              <w:rPr>
+                <w:rFonts w:ascii="Arial" w:cs="Arial" w:eastAsia="Arial" w:hAnsi="Arial"/>
+                <w:b w:val="false"/>
+                <w:bCs w:val="false"/>
+                <w:sz w:val="18"/>
+                <w:szCs w:val="18"/>
+              </w:rPr>
               <w:t xml:space="preserve">Xóa bị chặn nếu đã có </w:t>
             </w:r>
             <w:r>
@@ -14326,6 +14931,36 @@
               </w:rPr>
               <w:t xml:space="preserve">PhieuNhap</w:t>
             </w:r>
+            <w:r>
+              <w:rPr>
+                <w:rFonts w:ascii="Arial" w:cs="Arial" w:eastAsia="Arial" w:hAnsi="Arial"/>
+                <w:b w:val="false"/>
+                <w:bCs w:val="false"/>
+                <w:sz w:val="18"/>
+                <w:szCs w:val="18"/>
+              </w:rPr>
+              <w:t xml:space="preserve"> (409 </w:t>
+            </w:r>
+            <w:r>
+              <w:rPr>
+                <w:rFonts w:ascii="Consolas" w:cs="Consolas" w:eastAsia="Consolas" w:hAnsi="Consolas"/>
+                <w:b w:val="false"/>
+                <w:bCs w:val="false"/>
+                <w:sz w:val="18"/>
+                <w:szCs w:val="18"/>
+              </w:rPr>
+              <w:t xml:space="preserve">NCC_DA_CO_PHIEU_NHAP</w:t>
+            </w:r>
+            <w:r>
+              <w:rPr>
+                <w:rFonts w:ascii="Arial" w:cs="Arial" w:eastAsia="Arial" w:hAnsi="Arial"/>
+                <w:b w:val="false"/>
+                <w:bCs w:val="false"/>
+                <w:sz w:val="18"/>
+                <w:szCs w:val="18"/>
+              </w:rPr>
+              <w:t xml:space="preserve">); khóa dòng nhà cung cấp trước khi xóa</w:t>
+            </w:r>
           </w:p>
         </w:tc>
         <w:tc>
@@ -14356,7 +14991,17 @@
                 <w:sz w:val="18"/>
                 <w:szCs w:val="18"/>
               </w:rPr>
-              <w:t xml:space="preserve">Nhà cung cấp</w:t>
+              <w:t xml:space="preserve">Nhà cung cấp </w:t>
+            </w:r>
+            <w:r>
+              <w:rPr>
+                <w:rFonts w:ascii="Consolas" w:cs="Consolas" w:eastAsia="Consolas" w:hAnsi="Consolas"/>
+                <w:b w:val="false"/>
+                <w:bCs w:val="false"/>
+                <w:sz w:val="18"/>
+                <w:szCs w:val="18"/>
+              </w:rPr>
+              <w:t xml:space="preserve">{ma_ncc, ten_ncc, so_dien_thoai, dia_chi}</w:t>
             </w:r>
           </w:p>
         </w:tc>
@@ -14376,6 +15021,36 @@
               <w:right w:type="dxa" w:w="90"/>
             </w:tcMar>
           </w:tcPr>
+          <w:p>
+            <w:pPr>
+              <w:spacing w:after="20"/>
+            </w:pPr>
+            <w:r>
+              <w:rPr>
+                <w:rFonts w:ascii="Arial" w:cs="Arial" w:eastAsia="Arial" w:hAnsi="Arial"/>
+                <w:b w:val="false"/>
+                <w:bCs w:val="false"/>
+                <w:sz w:val="18"/>
+                <w:szCs w:val="18"/>
+              </w:rPr>
+              <w:t xml:space="preserve">400</w:t>
+            </w:r>
+          </w:p>
+          <w:p>
+            <w:pPr>
+              <w:spacing w:after="20"/>
+            </w:pPr>
+            <w:r>
+              <w:rPr>
+                <w:rFonts w:ascii="Arial" w:cs="Arial" w:eastAsia="Arial" w:hAnsi="Arial"/>
+                <w:b w:val="false"/>
+                <w:bCs w:val="false"/>
+                <w:sz w:val="18"/>
+                <w:szCs w:val="18"/>
+              </w:rPr>
+              <w:t xml:space="preserve">404</w:t>
+            </w:r>
+          </w:p>
           <w:p>
             <w:pPr>
               <w:spacing w:after="20"/>
@@ -14491,11 +15166,16 @@
               </w:rPr>
               <w:t xml:space="preserve">ma_san_pham</w:t>
             </w:r>
-          </w:p>
-          <w:p>
-            <w:pPr>
-              <w:spacing w:after="20"/>
-            </w:pPr>
+            <w:r>
+              <w:rPr>
+                <w:rFonts w:ascii="Arial" w:cs="Arial" w:eastAsia="Arial" w:hAnsi="Arial"/>
+                <w:b w:val="false"/>
+                <w:bCs w:val="false"/>
+                <w:sz w:val="18"/>
+                <w:szCs w:val="18"/>
+              </w:rPr>
+              <w:t xml:space="preserve"> (đường dẫn), </w:t>
+            </w:r>
             <w:r>
               <w:rPr>
                 <w:rFonts w:ascii="Consolas" w:cs="Consolas" w:eastAsia="Consolas" w:hAnsi="Consolas"/>
@@ -14546,7 +15226,52 @@
                 <w:sz w:val="18"/>
                 <w:szCs w:val="18"/>
               </w:rPr>
-              <w:t xml:space="preserve"> &gt; 0; thay toàn bộ công thức cũ trong transaction</w:t>
+              <w:t xml:space="preserve"> &gt; 0, tối đa 3 chữ số thập phân; không lặp nguyên liệu; tối đa 50 dòng; mảng RỖNG = xóa công thức</w:t>
+            </w:r>
+          </w:p>
+          <w:p>
+            <w:pPr>
+              <w:spacing w:after="20"/>
+            </w:pPr>
+            <w:r>
+              <w:rPr>
+                <w:rFonts w:ascii="Arial" w:cs="Arial" w:eastAsia="Arial" w:hAnsi="Arial"/>
+                <w:b w:val="false"/>
+                <w:bCs w:val="false"/>
+                <w:sz w:val="18"/>
+                <w:szCs w:val="18"/>
+              </w:rPr>
+              <w:t xml:space="preserve">Thay TOÀN BỘ công thức cũ trong một transaction (một nguyên liệu không tồn tại: 404, công thức cũ giữ nguyên)</w:t>
+            </w:r>
+          </w:p>
+          <w:p>
+            <w:pPr>
+              <w:spacing w:after="20"/>
+            </w:pPr>
+            <w:r>
+              <w:rPr>
+                <w:rFonts w:ascii="Arial" w:cs="Arial" w:eastAsia="Arial" w:hAnsi="Arial"/>
+                <w:b w:val="false"/>
+                <w:bCs w:val="false"/>
+                <w:sz w:val="18"/>
+                <w:szCs w:val="18"/>
+              </w:rPr>
+              <w:t xml:space="preserve">Thứ tự khóa: SanPham -&gt; NguyenLieu (mã tăng dần) -&gt; trùng thứ tự với bán hàng nên không deadlock</w:t>
+            </w:r>
+          </w:p>
+          <w:p>
+            <w:pPr>
+              <w:spacing w:after="20"/>
+            </w:pPr>
+            <w:r>
+              <w:rPr>
+                <w:rFonts w:ascii="Arial" w:cs="Arial" w:eastAsia="Arial" w:hAnsi="Arial"/>
+                <w:b w:val="false"/>
+                <w:bCs w:val="false"/>
+                <w:sz w:val="18"/>
+                <w:szCs w:val="18"/>
+              </w:rPr>
+              <w:t xml:space="preserve">Lưu ý: order đang mở đã trừ kho theo công thức cũ; hủy/bỏ ly sau đó trả kho theo công thức mới (không chụp công thức). Xem công thức: GET cùng đường dẫn</w:t>
             </w:r>
           </w:p>
         </w:tc>
@@ -14578,7 +15303,17 @@
                 <w:sz w:val="18"/>
                 <w:szCs w:val="18"/>
               </w:rPr>
-              <w:t xml:space="preserve">Công thức mới của sản phẩm</w:t>
+              <w:t xml:space="preserve">Công thức mới </w:t>
+            </w:r>
+            <w:r>
+              <w:rPr>
+                <w:rFonts w:ascii="Consolas" w:cs="Consolas" w:eastAsia="Consolas" w:hAnsi="Consolas"/>
+                <w:b w:val="false"/>
+                <w:bCs w:val="false"/>
+                <w:sz w:val="18"/>
+                <w:szCs w:val="18"/>
+              </w:rPr>
+              <w:t xml:space="preserve">{ma_san_pham, ten_san_pham, nguyen_lieu[]: {ma_nguyen_lieu, ten_nguyen_lieu, don_vi_tinh, dinh_luong}}</w:t>
             </w:r>
           </w:p>
         </w:tc>
@@ -14611,6 +15346,21 @@
                 <w:szCs w:val="18"/>
               </w:rPr>
               <w:t xml:space="preserve">400</w:t>
+            </w:r>
+          </w:p>
+          <w:p>
+            <w:pPr>
+              <w:spacing w:after="20"/>
+            </w:pPr>
+            <w:r>
+              <w:rPr>
+                <w:rFonts w:ascii="Arial" w:cs="Arial" w:eastAsia="Arial" w:hAnsi="Arial"/>
+                <w:b w:val="false"/>
+                <w:bCs w:val="false"/>
+                <w:sz w:val="18"/>
+                <w:szCs w:val="18"/>
+              </w:rPr>
+              <w:t xml:space="preserve">404</w:t>
             </w:r>
           </w:p>
         </w:tc>
@@ -14731,13 +15481,18 @@
                 <w:sz w:val="18"/>
                 <w:szCs w:val="18"/>
               </w:rPr>
-              <w:t xml:space="preserve">ngay_nhap</w:t>
-            </w:r>
-          </w:p>
-          <w:p>
-            <w:pPr>
-              <w:spacing w:after="20"/>
-            </w:pPr>
+              <w:t xml:space="preserve">ngay_nhap?</w:t>
+            </w:r>
+            <w:r>
+              <w:rPr>
+                <w:rFonts w:ascii="Arial" w:cs="Arial" w:eastAsia="Arial" w:hAnsi="Arial"/>
+                <w:b w:val="false"/>
+                <w:bCs w:val="false"/>
+                <w:sz w:val="18"/>
+                <w:szCs w:val="18"/>
+              </w:rPr>
+              <w:t xml:space="preserve"> (mặc định bây giờ; không ở tương lai), </w:t>
+            </w:r>
             <w:r>
               <w:rPr>
                 <w:rFonts w:ascii="Consolas" w:cs="Consolas" w:eastAsia="Consolas" w:hAnsi="Consolas"/>
@@ -14778,7 +15533,62 @@
                 <w:sz w:val="18"/>
                 <w:szCs w:val="18"/>
               </w:rPr>
-              <w:t xml:space="preserve">Một transaction: tạo </w:t>
+              <w:t xml:space="preserve">1–100 dòng, không lặp nguyên liệu; </w:t>
+            </w:r>
+            <w:r>
+              <w:rPr>
+                <w:rFonts w:ascii="Consolas" w:cs="Consolas" w:eastAsia="Consolas" w:hAnsi="Consolas"/>
+                <w:b w:val="false"/>
+                <w:bCs w:val="false"/>
+                <w:sz w:val="18"/>
+                <w:szCs w:val="18"/>
+              </w:rPr>
+              <w:t xml:space="preserve">so_luong_nhap</w:t>
+            </w:r>
+            <w:r>
+              <w:rPr>
+                <w:rFonts w:ascii="Arial" w:cs="Arial" w:eastAsia="Arial" w:hAnsi="Arial"/>
+                <w:b w:val="false"/>
+                <w:bCs w:val="false"/>
+                <w:sz w:val="18"/>
+                <w:szCs w:val="18"/>
+              </w:rPr>
+              <w:t xml:space="preserve"> &gt; 0 (3 số lẻ), </w:t>
+            </w:r>
+            <w:r>
+              <w:rPr>
+                <w:rFonts w:ascii="Consolas" w:cs="Consolas" w:eastAsia="Consolas" w:hAnsi="Consolas"/>
+                <w:b w:val="false"/>
+                <w:bCs w:val="false"/>
+                <w:sz w:val="18"/>
+                <w:szCs w:val="18"/>
+              </w:rPr>
+              <w:t xml:space="preserve">don_gia_nhap</w:t>
+            </w:r>
+            <w:r>
+              <w:rPr>
+                <w:rFonts w:ascii="Arial" w:cs="Arial" w:eastAsia="Arial" w:hAnsi="Arial"/>
+                <w:b w:val="false"/>
+                <w:bCs w:val="false"/>
+                <w:sz w:val="18"/>
+                <w:szCs w:val="18"/>
+              </w:rPr>
+              <w:t xml:space="preserve"> &gt; 0 (2 số lẻ)</w:t>
+            </w:r>
+          </w:p>
+          <w:p>
+            <w:pPr>
+              <w:spacing w:after="20"/>
+            </w:pPr>
+            <w:r>
+              <w:rPr>
+                <w:rFonts w:ascii="Arial" w:cs="Arial" w:eastAsia="Arial" w:hAnsi="Arial"/>
+                <w:b w:val="false"/>
+                <w:bCs w:val="false"/>
+                <w:sz w:val="18"/>
+                <w:szCs w:val="18"/>
+              </w:rPr>
+              <w:t xml:space="preserve">Một transaction: khóa NCC (chia sẻ) rồi các nguyên liệu (mã tăng dần); tạo </w:t>
             </w:r>
             <w:r>
               <w:rPr>
@@ -14818,27 +15628,27 @@
                 <w:sz w:val="18"/>
                 <w:szCs w:val="18"/>
               </w:rPr>
-              <w:t xml:space="preserve">, </w:t>
-            </w:r>
-            <w:r>
-              <w:rPr>
-                <w:rFonts w:ascii="Consolas" w:cs="Consolas" w:eastAsia="Consolas" w:hAnsi="Consolas"/>
-                <w:b w:val="false"/>
-                <w:bCs w:val="false"/>
-                <w:sz w:val="18"/>
-                <w:szCs w:val="18"/>
-              </w:rPr>
-              <w:t xml:space="preserve">tong_tien_nhap = Σ</w:t>
-            </w:r>
-            <w:r>
-              <w:rPr>
-                <w:rFonts w:ascii="Arial" w:cs="Arial" w:eastAsia="Arial" w:hAnsi="Arial"/>
-                <w:b w:val="false"/>
-                <w:bCs w:val="false"/>
-                <w:sz w:val="18"/>
-                <w:szCs w:val="18"/>
-              </w:rPr>
-              <w:t xml:space="preserve">, cộng </w:t>
+              <w:t xml:space="preserve">; </w:t>
+            </w:r>
+            <w:r>
+              <w:rPr>
+                <w:rFonts w:ascii="Consolas" w:cs="Consolas" w:eastAsia="Consolas" w:hAnsi="Consolas"/>
+                <w:b w:val="false"/>
+                <w:bCs w:val="false"/>
+                <w:sz w:val="18"/>
+                <w:szCs w:val="18"/>
+              </w:rPr>
+              <w:t xml:space="preserve">tong_tien_nhap</w:t>
+            </w:r>
+            <w:r>
+              <w:rPr>
+                <w:rFonts w:ascii="Arial" w:cs="Arial" w:eastAsia="Arial" w:hAnsi="Arial"/>
+                <w:b w:val="false"/>
+                <w:bCs w:val="false"/>
+                <w:sz w:val="18"/>
+                <w:szCs w:val="18"/>
+              </w:rPr>
+              <w:t xml:space="preserve"> = Σ làm tròn nửa lên TỪNG dòng đến 0,01 (tính bằng số nguyên); cộng </w:t>
             </w:r>
             <w:r>
               <w:rPr>
@@ -14850,6 +15660,41 @@
               </w:rPr>
               <w:t xml:space="preserve">so_luong_ton</w:t>
             </w:r>
+            <w:r>
+              <w:rPr>
+                <w:rFonts w:ascii="Arial" w:cs="Arial" w:eastAsia="Arial" w:hAnsi="Arial"/>
+                <w:b w:val="false"/>
+                <w:bCs w:val="false"/>
+                <w:sz w:val="18"/>
+                <w:szCs w:val="18"/>
+              </w:rPr>
+              <w:t xml:space="preserve">; nhân viên lấy từ token</w:t>
+            </w:r>
+          </w:p>
+          <w:p>
+            <w:pPr>
+              <w:spacing w:after="20"/>
+            </w:pPr>
+            <w:r>
+              <w:rPr>
+                <w:rFonts w:ascii="Arial" w:cs="Arial" w:eastAsia="Arial" w:hAnsi="Arial"/>
+                <w:b w:val="false"/>
+                <w:bCs w:val="false"/>
+                <w:sz w:val="18"/>
+                <w:szCs w:val="18"/>
+              </w:rPr>
+              <w:t xml:space="preserve">Thiếu NCC/nguyên liệu: 404, không đổi gì; tồn vượt giới hạn lưu trữ: 409 </w:t>
+            </w:r>
+            <w:r>
+              <w:rPr>
+                <w:rFonts w:ascii="Consolas" w:cs="Consolas" w:eastAsia="Consolas" w:hAnsi="Consolas"/>
+                <w:b w:val="false"/>
+                <w:bCs w:val="false"/>
+                <w:sz w:val="18"/>
+                <w:szCs w:val="18"/>
+              </w:rPr>
+              <w:t xml:space="preserve">TON_KHO_VUOT_GIOI_HAN</w:t>
+            </w:r>
           </w:p>
         </w:tc>
         <w:tc>
@@ -14880,7 +15725,7 @@
                 <w:sz w:val="18"/>
                 <w:szCs w:val="18"/>
               </w:rPr>
-              <w:t xml:space="preserve">{ma_phieu_nhap, tong_tien_nhap, ton_moi[]}</w:t>
+              <w:t xml:space="preserve">{ma_phieu_nhap, tong_tien_nhap, chi_tiet[], ton_moi[]: {ma_nguyen_lieu, so_luong_ton, muc_ton_toi_thieu, sap_het, ...}}</w:t>
             </w:r>
           </w:p>
         </w:tc>
@@ -14927,7 +15772,22 @@
                 <w:sz w:val="18"/>
                 <w:szCs w:val="18"/>
               </w:rPr>
-              <w:t xml:space="preserve">404 NCC</w:t>
+              <w:t xml:space="preserve">404 NCC, nguyên liệu</w:t>
+            </w:r>
+          </w:p>
+          <w:p>
+            <w:pPr>
+              <w:spacing w:after="20"/>
+            </w:pPr>
+            <w:r>
+              <w:rPr>
+                <w:rFonts w:ascii="Arial" w:cs="Arial" w:eastAsia="Arial" w:hAnsi="Arial"/>
+                <w:b w:val="false"/>
+                <w:bCs w:val="false"/>
+                <w:sz w:val="18"/>
+                <w:szCs w:val="18"/>
+              </w:rPr>
+              <w:t xml:space="preserve">409</w:t>
             </w:r>
           </w:p>
         </w:tc>
@@ -15058,6 +15918,26 @@
                 <w:sz w:val="18"/>
                 <w:szCs w:val="18"/>
               </w:rPr>
+              <w:t xml:space="preserve"> (YYYY-MM-DD, lọc theo NGÀY nhập, den_ngay tính trọn ngày), </w:t>
+            </w:r>
+            <w:r>
+              <w:rPr>
+                <w:rFonts w:ascii="Consolas" w:cs="Consolas" w:eastAsia="Consolas" w:hAnsi="Consolas"/>
+                <w:b w:val="false"/>
+                <w:bCs w:val="false"/>
+                <w:sz w:val="18"/>
+                <w:szCs w:val="18"/>
+              </w:rPr>
+              <w:t xml:space="preserve">ma_ncc?</w:t>
+            </w:r>
+            <w:r>
+              <w:rPr>
+                <w:rFonts w:ascii="Arial" w:cs="Arial" w:eastAsia="Arial" w:hAnsi="Arial"/>
+                <w:b w:val="false"/>
+                <w:bCs w:val="false"/>
+                <w:sz w:val="18"/>
+                <w:szCs w:val="18"/>
+              </w:rPr>
               <w:t xml:space="preserve">, </w:t>
             </w:r>
             <w:r>
@@ -15068,7 +15948,27 @@
                 <w:sz w:val="18"/>
                 <w:szCs w:val="18"/>
               </w:rPr>
-              <w:t xml:space="preserve">ma_ncc?</w:t>
+              <w:t xml:space="preserve">trang?</w:t>
+            </w:r>
+            <w:r>
+              <w:rPr>
+                <w:rFonts w:ascii="Arial" w:cs="Arial" w:eastAsia="Arial" w:hAnsi="Arial"/>
+                <w:b w:val="false"/>
+                <w:bCs w:val="false"/>
+                <w:sz w:val="18"/>
+                <w:szCs w:val="18"/>
+              </w:rPr>
+              <w:t xml:space="preserve">, </w:t>
+            </w:r>
+            <w:r>
+              <w:rPr>
+                <w:rFonts w:ascii="Consolas" w:cs="Consolas" w:eastAsia="Consolas" w:hAnsi="Consolas"/>
+                <w:b w:val="false"/>
+                <w:bCs w:val="false"/>
+                <w:sz w:val="18"/>
+                <w:szCs w:val="18"/>
+              </w:rPr>
+              <w:t xml:space="preserve">moi_trang?</w:t>
             </w:r>
           </w:p>
         </w:tc>
@@ -15152,6 +16052,106 @@
               </w:rPr>
               <w:t xml:space="preserve">NhanVien</w:t>
             </w:r>
+            <w:r>
+              <w:rPr>
+                <w:rFonts w:ascii="Arial" w:cs="Arial" w:eastAsia="Arial" w:hAnsi="Arial"/>
+                <w:b w:val="false"/>
+                <w:bCs w:val="false"/>
+                <w:sz w:val="18"/>
+                <w:szCs w:val="18"/>
+              </w:rPr>
+              <w:t xml:space="preserve">; mới nhất trước; </w:t>
+            </w:r>
+            <w:r>
+              <w:rPr>
+                <w:rFonts w:ascii="Consolas" w:cs="Consolas" w:eastAsia="Consolas" w:hAnsi="Consolas"/>
+                <w:b w:val="false"/>
+                <w:bCs w:val="false"/>
+                <w:sz w:val="18"/>
+                <w:szCs w:val="18"/>
+              </w:rPr>
+              <w:t xml:space="preserve">tong_tien_nhap</w:t>
+            </w:r>
+            <w:r>
+              <w:rPr>
+                <w:rFonts w:ascii="Arial" w:cs="Arial" w:eastAsia="Arial" w:hAnsi="Arial"/>
+                <w:b w:val="false"/>
+                <w:bCs w:val="false"/>
+                <w:sz w:val="18"/>
+                <w:szCs w:val="18"/>
+              </w:rPr>
+              <w:t xml:space="preserve"> và </w:t>
+            </w:r>
+            <w:r>
+              <w:rPr>
+                <w:rFonts w:ascii="Consolas" w:cs="Consolas" w:eastAsia="Consolas" w:hAnsi="Consolas"/>
+                <w:b w:val="false"/>
+                <w:bCs w:val="false"/>
+                <w:sz w:val="18"/>
+                <w:szCs w:val="18"/>
+              </w:rPr>
+              <w:t xml:space="preserve">tong_so_ban_ghi</w:t>
+            </w:r>
+            <w:r>
+              <w:rPr>
+                <w:rFonts w:ascii="Arial" w:cs="Arial" w:eastAsia="Arial" w:hAnsi="Arial"/>
+                <w:b w:val="false"/>
+                <w:bCs w:val="false"/>
+                <w:sz w:val="18"/>
+                <w:szCs w:val="18"/>
+              </w:rPr>
+              <w:t xml:space="preserve"> tính trên TOÀN BỘ kết quả lọc. Chi tiết một phiếu: GET </w:t>
+            </w:r>
+            <w:r>
+              <w:rPr>
+                <w:rFonts w:ascii="Consolas" w:cs="Consolas" w:eastAsia="Consolas" w:hAnsi="Consolas"/>
+                <w:b w:val="false"/>
+                <w:bCs w:val="false"/>
+                <w:sz w:val="18"/>
+                <w:szCs w:val="18"/>
+              </w:rPr>
+              <w:t xml:space="preserve">/phieu-nhap/:ma</w:t>
+            </w:r>
+            <w:r>
+              <w:rPr>
+                <w:rFonts w:ascii="Arial" w:cs="Arial" w:eastAsia="Arial" w:hAnsi="Arial"/>
+                <w:b w:val="false"/>
+                <w:bCs w:val="false"/>
+                <w:sz w:val="18"/>
+                <w:szCs w:val="18"/>
+              </w:rPr>
+              <w:t xml:space="preserve"> kèm </w:t>
+            </w:r>
+            <w:r>
+              <w:rPr>
+                <w:rFonts w:ascii="Consolas" w:cs="Consolas" w:eastAsia="Consolas" w:hAnsi="Consolas"/>
+                <w:b w:val="false"/>
+                <w:bCs w:val="false"/>
+                <w:sz w:val="18"/>
+                <w:szCs w:val="18"/>
+              </w:rPr>
+              <w:t xml:space="preserve">chi_tiet[]</w:t>
+            </w:r>
+            <w:r>
+              <w:rPr>
+                <w:rFonts w:ascii="Arial" w:cs="Arial" w:eastAsia="Arial" w:hAnsi="Arial"/>
+                <w:b w:val="false"/>
+                <w:bCs w:val="false"/>
+                <w:sz w:val="18"/>
+                <w:szCs w:val="18"/>
+              </w:rPr>
+              <w:t xml:space="preserve"> và </w:t>
+            </w:r>
+            <w:r>
+              <w:rPr>
+                <w:rFonts w:ascii="Consolas" w:cs="Consolas" w:eastAsia="Consolas" w:hAnsi="Consolas"/>
+                <w:b w:val="false"/>
+                <w:bCs w:val="false"/>
+                <w:sz w:val="18"/>
+                <w:szCs w:val="18"/>
+              </w:rPr>
+              <w:t xml:space="preserve">thanh_tien</w:t>
+            </w:r>
           </w:p>
         </w:tc>
         <w:tc>
@@ -15182,7 +16182,17 @@
                 <w:sz w:val="18"/>
                 <w:szCs w:val="18"/>
               </w:rPr>
-              <w:t xml:space="preserve">Mảng phiếu nhập</w:t>
+              <w:t xml:space="preserve">Mảng </w:t>
+            </w:r>
+            <w:r>
+              <w:rPr>
+                <w:rFonts w:ascii="Consolas" w:cs="Consolas" w:eastAsia="Consolas" w:hAnsi="Consolas"/>
+                <w:b w:val="false"/>
+                <w:bCs w:val="false"/>
+                <w:sz w:val="18"/>
+                <w:szCs w:val="18"/>
+              </w:rPr>
+              <w:t xml:space="preserve">{ma_phieu_nhap, ma_ncc, ten_ncc, ma_nhan_vien, ten_nhan_vien, ngay_nhap, tong_tien_nhap, so_dong}</w:t>
             </w:r>
           </w:p>
         </w:tc>
@@ -15206,6 +16216,16 @@
             <w:pPr>
               <w:spacing w:after="20"/>
             </w:pPr>
+            <w:r>
+              <w:rPr>
+                <w:rFonts w:ascii="Arial" w:cs="Arial" w:eastAsia="Arial" w:hAnsi="Arial"/>
+                <w:b w:val="false"/>
+                <w:bCs w:val="false"/>
+                <w:sz w:val="18"/>
+                <w:szCs w:val="18"/>
+              </w:rPr>
+              <w:t xml:space="preserve">400</w:t>
+            </w:r>
           </w:p>
         </w:tc>
       </w:tr>
@@ -15307,6 +16327,26 @@
               </w:rPr>
               <w:t xml:space="preserve">chi_sap_het?</w:t>
             </w:r>
+            <w:r>
+              <w:rPr>
+                <w:rFonts w:ascii="Arial" w:cs="Arial" w:eastAsia="Arial" w:hAnsi="Arial"/>
+                <w:b w:val="false"/>
+                <w:bCs w:val="false"/>
+                <w:sz w:val="18"/>
+                <w:szCs w:val="18"/>
+              </w:rPr>
+              <w:t xml:space="preserve"> (true/false), </w:t>
+            </w:r>
+            <w:r>
+              <w:rPr>
+                <w:rFonts w:ascii="Consolas" w:cs="Consolas" w:eastAsia="Consolas" w:hAnsi="Consolas"/>
+                <w:b w:val="false"/>
+                <w:bCs w:val="false"/>
+                <w:sz w:val="18"/>
+                <w:szCs w:val="18"/>
+              </w:rPr>
+              <w:t xml:space="preserve">tu_khoa?</w:t>
+            </w:r>
           </w:p>
         </w:tc>
         <w:tc>
@@ -15337,17 +16377,47 @@
                 <w:sz w:val="18"/>
                 <w:szCs w:val="18"/>
               </w:rPr>
-              <w:t xml:space="preserve">Cảnh báo khi </w:t>
-            </w:r>
-            <w:r>
-              <w:rPr>
-                <w:rFonts w:ascii="Consolas" w:cs="Consolas" w:eastAsia="Consolas" w:hAnsi="Consolas"/>
-                <w:b w:val="false"/>
-                <w:bCs w:val="false"/>
-                <w:sz w:val="18"/>
-                <w:szCs w:val="18"/>
-              </w:rPr>
-              <w:t xml:space="preserve">so_luong_ton &lt;= muc_ton_toi_thieu</w:t>
+              <w:t xml:space="preserve">Cờ </w:t>
+            </w:r>
+            <w:r>
+              <w:rPr>
+                <w:rFonts w:ascii="Consolas" w:cs="Consolas" w:eastAsia="Consolas" w:hAnsi="Consolas"/>
+                <w:b w:val="false"/>
+                <w:bCs w:val="false"/>
+                <w:sz w:val="18"/>
+                <w:szCs w:val="18"/>
+              </w:rPr>
+              <w:t xml:space="preserve">sap_het = so_luong_ton &lt;= muc_ton_toi_thieu</w:t>
+            </w:r>
+            <w:r>
+              <w:rPr>
+                <w:rFonts w:ascii="Arial" w:cs="Arial" w:eastAsia="Arial" w:hAnsi="Arial"/>
+                <w:b w:val="false"/>
+                <w:bCs w:val="false"/>
+                <w:sz w:val="18"/>
+                <w:szCs w:val="18"/>
+              </w:rPr>
+              <w:t xml:space="preserve"> (cùng quy tắc </w:t>
+            </w:r>
+            <w:r>
+              <w:rPr>
+                <w:rFonts w:ascii="Consolas" w:cs="Consolas" w:eastAsia="Consolas" w:hAnsi="Consolas"/>
+                <w:b w:val="false"/>
+                <w:bCs w:val="false"/>
+                <w:sz w:val="18"/>
+                <w:szCs w:val="18"/>
+              </w:rPr>
+              <w:t xml:space="preserve">canh_bao_kho</w:t>
+            </w:r>
+            <w:r>
+              <w:rPr>
+                <w:rFonts w:ascii="Arial" w:cs="Arial" w:eastAsia="Arial" w:hAnsi="Arial"/>
+                <w:b w:val="false"/>
+                <w:bCs w:val="false"/>
+                <w:sz w:val="18"/>
+                <w:szCs w:val="18"/>
+              </w:rPr>
+              <w:t xml:space="preserve"> khi bán hàng); sắp hết đứng đầu, sau đó theo tên; không phân trang</w:t>
             </w:r>
           </w:p>
         </w:tc>
@@ -15389,7 +16459,7 @@
                 <w:sz w:val="18"/>
                 <w:szCs w:val="18"/>
               </w:rPr>
-              <w:t xml:space="preserve">{ma_nguyen_lieu, ten, so_luong_ton, don_vi_tinh}</w:t>
+              <w:t xml:space="preserve">{ma_nguyen_lieu, ten_nguyen_lieu, so_luong_ton, muc_ton_toi_thieu, don_vi_tinh, sap_het}</w:t>
             </w:r>
           </w:p>
         </w:tc>
@@ -15413,6 +16483,16 @@
             <w:pPr>
               <w:spacing w:after="20"/>
             </w:pPr>
+            <w:r>
+              <w:rPr>
+                <w:rFonts w:ascii="Arial" w:cs="Arial" w:eastAsia="Arial" w:hAnsi="Arial"/>
+                <w:b w:val="false"/>
+                <w:bCs w:val="false"/>
+                <w:sz w:val="18"/>
+                <w:szCs w:val="18"/>
+              </w:rPr>
+              <w:t xml:space="preserve">400</w:t>
+            </w:r>
           </w:p>
         </w:tc>
       </w:tr>
@@ -19314,7 +20394,7 @@
         <w:rPr>
           <w:rFonts w:ascii="Arial" w:cs="Arial" w:eastAsia="Arial" w:hAnsi="Arial"/>
         </w:rPr>
-        <w:t xml:space="preserve">Ba thay đổi phát sinh khi viết đặc tả, đã đưa vào ERD (file </w:t>
+        <w:t xml:space="preserve">Các thay đổi sau đã đưa vào ERD (file </w:t>
       </w:r>
       <w:r>
         <w:rPr>
@@ -19810,6 +20890,338 @@
                 <w:szCs w:val="18"/>
               </w:rPr>
               <w:t xml:space="preserve">Cho POS-04/05: một hóa đơn có nhiều dòng cùng sản phẩm khác ghi chú</w:t>
+            </w:r>
+          </w:p>
+        </w:tc>
+      </w:tr>
+      <w:tr>
+        <w:trPr>
+          <w:cantSplit/>
+        </w:trPr>
+        <w:tc>
+          <w:tcPr>
+            <w:tcW w:type="dxa" w:w="1000"/>
+            <w:tcBorders>
+              <w:top w:val="single" w:color="BFBFBF" w:sz="4"/>
+              <w:left w:val="single" w:color="BFBFBF" w:sz="4"/>
+              <w:bottom w:val="single" w:color="BFBFBF" w:sz="4"/>
+              <w:right w:val="single" w:color="BFBFBF" w:sz="4"/>
+            </w:tcBorders>
+            <w:tcMar>
+              <w:top w:type="dxa" w:w="60"/>
+              <w:left w:type="dxa" w:w="90"/>
+              <w:bottom w:type="dxa" w:w="60"/>
+              <w:right w:type="dxa" w:w="90"/>
+            </w:tcMar>
+          </w:tcPr>
+          <w:p>
+            <w:pPr>
+              <w:spacing w:after="20"/>
+            </w:pPr>
+            <w:r>
+              <w:rPr>
+                <w:rFonts w:ascii="Arial" w:cs="Arial" w:eastAsia="Arial" w:hAnsi="Arial"/>
+                <w:b w:val="false"/>
+                <w:bCs w:val="false"/>
+                <w:sz w:val="18"/>
+                <w:szCs w:val="18"/>
+              </w:rPr>
+              <w:t xml:space="preserve">4</w:t>
+            </w:r>
+          </w:p>
+        </w:tc>
+        <w:tc>
+          <w:tcPr>
+            <w:tcW w:type="dxa" w:w="5500"/>
+            <w:tcBorders>
+              <w:top w:val="single" w:color="BFBFBF" w:sz="4"/>
+              <w:left w:val="single" w:color="BFBFBF" w:sz="4"/>
+              <w:bottom w:val="single" w:color="BFBFBF" w:sz="4"/>
+              <w:right w:val="single" w:color="BFBFBF" w:sz="4"/>
+            </w:tcBorders>
+            <w:tcMar>
+              <w:top w:type="dxa" w:w="60"/>
+              <w:left w:type="dxa" w:w="90"/>
+              <w:bottom w:type="dxa" w:w="60"/>
+              <w:right w:type="dxa" w:w="90"/>
+            </w:tcMar>
+          </w:tcPr>
+          <w:p>
+            <w:pPr>
+              <w:spacing w:after="20"/>
+            </w:pPr>
+            <w:r>
+              <w:rPr>
+                <w:rFonts w:ascii="Arial" w:cs="Arial" w:eastAsia="Arial" w:hAnsi="Arial"/>
+                <w:b w:val="false"/>
+                <w:bCs w:val="false"/>
+                <w:sz w:val="18"/>
+                <w:szCs w:val="18"/>
+              </w:rPr>
+              <w:t xml:space="preserve">Bảng mới </w:t>
+            </w:r>
+            <w:r>
+              <w:rPr>
+                <w:rFonts w:ascii="Consolas" w:cs="Consolas" w:eastAsia="Consolas" w:hAnsi="Consolas"/>
+                <w:b w:val="false"/>
+                <w:bCs w:val="false"/>
+                <w:sz w:val="18"/>
+                <w:szCs w:val="18"/>
+              </w:rPr>
+              <w:t xml:space="preserve">HoaDonDaThanhToan</w:t>
+            </w:r>
+            <w:r>
+              <w:rPr>
+                <w:rFonts w:ascii="Arial" w:cs="Arial" w:eastAsia="Arial" w:hAnsi="Arial"/>
+                <w:b w:val="false"/>
+                <w:bCs w:val="false"/>
+                <w:sz w:val="18"/>
+                <w:szCs w:val="18"/>
+              </w:rPr>
+              <w:t xml:space="preserve"> (chỉ-thêm, trigger chặn sửa/xóa)</w:t>
+            </w:r>
+          </w:p>
+        </w:tc>
+        <w:tc>
+          <w:tcPr>
+            <w:tcW w:type="dxa" w:w="8178"/>
+            <w:tcBorders>
+              <w:top w:val="single" w:color="BFBFBF" w:sz="4"/>
+              <w:left w:val="single" w:color="BFBFBF" w:sz="4"/>
+              <w:bottom w:val="single" w:color="BFBFBF" w:sz="4"/>
+              <w:right w:val="single" w:color="BFBFBF" w:sz="4"/>
+            </w:tcBorders>
+            <w:tcMar>
+              <w:top w:type="dxa" w:w="60"/>
+              <w:left w:type="dxa" w:w="90"/>
+              <w:bottom w:type="dxa" w:w="60"/>
+              <w:right w:type="dxa" w:w="90"/>
+            </w:tcMar>
+          </w:tcPr>
+          <w:p>
+            <w:pPr>
+              <w:spacing w:after="20"/>
+            </w:pPr>
+            <w:r>
+              <w:rPr>
+                <w:rFonts w:ascii="Arial" w:cs="Arial" w:eastAsia="Arial" w:hAnsi="Arial"/>
+                <w:b w:val="false"/>
+                <w:bCs w:val="false"/>
+                <w:sz w:val="18"/>
+                <w:szCs w:val="18"/>
+              </w:rPr>
+              <w:t xml:space="preserve">Lưu biên lai bất biến của hóa đơn đã thanh toán; KH-04, KM-07, báo cáo đọc từ đây</w:t>
+            </w:r>
+          </w:p>
+        </w:tc>
+      </w:tr>
+      <w:tr>
+        <w:trPr>
+          <w:cantSplit/>
+        </w:trPr>
+        <w:tc>
+          <w:tcPr>
+            <w:tcW w:type="dxa" w:w="1000"/>
+            <w:tcBorders>
+              <w:top w:val="single" w:color="BFBFBF" w:sz="4"/>
+              <w:left w:val="single" w:color="BFBFBF" w:sz="4"/>
+              <w:bottom w:val="single" w:color="BFBFBF" w:sz="4"/>
+              <w:right w:val="single" w:color="BFBFBF" w:sz="4"/>
+            </w:tcBorders>
+            <w:tcMar>
+              <w:top w:type="dxa" w:w="60"/>
+              <w:left w:type="dxa" w:w="90"/>
+              <w:bottom w:type="dxa" w:w="60"/>
+              <w:right w:type="dxa" w:w="90"/>
+            </w:tcMar>
+          </w:tcPr>
+          <w:p>
+            <w:pPr>
+              <w:spacing w:after="20"/>
+            </w:pPr>
+            <w:r>
+              <w:rPr>
+                <w:rFonts w:ascii="Arial" w:cs="Arial" w:eastAsia="Arial" w:hAnsi="Arial"/>
+                <w:b w:val="false"/>
+                <w:bCs w:val="false"/>
+                <w:sz w:val="18"/>
+                <w:szCs w:val="18"/>
+              </w:rPr>
+              <w:t xml:space="preserve">5</w:t>
+            </w:r>
+          </w:p>
+        </w:tc>
+        <w:tc>
+          <w:tcPr>
+            <w:tcW w:type="dxa" w:w="5500"/>
+            <w:tcBorders>
+              <w:top w:val="single" w:color="BFBFBF" w:sz="4"/>
+              <w:left w:val="single" w:color="BFBFBF" w:sz="4"/>
+              <w:bottom w:val="single" w:color="BFBFBF" w:sz="4"/>
+              <w:right w:val="single" w:color="BFBFBF" w:sz="4"/>
+            </w:tcBorders>
+            <w:tcMar>
+              <w:top w:type="dxa" w:w="60"/>
+              <w:left w:type="dxa" w:w="90"/>
+              <w:bottom w:type="dxa" w:w="60"/>
+              <w:right w:type="dxa" w:w="90"/>
+            </w:tcMar>
+          </w:tcPr>
+          <w:p>
+            <w:pPr>
+              <w:spacing w:after="20"/>
+            </w:pPr>
+            <w:r>
+              <w:rPr>
+                <w:rFonts w:ascii="Arial" w:cs="Arial" w:eastAsia="Arial" w:hAnsi="Arial"/>
+                <w:b w:val="false"/>
+                <w:bCs w:val="false"/>
+                <w:sz w:val="18"/>
+                <w:szCs w:val="18"/>
+              </w:rPr>
+              <w:t xml:space="preserve">Bảng mới </w:t>
+            </w:r>
+            <w:r>
+              <w:rPr>
+                <w:rFonts w:ascii="Consolas" w:cs="Consolas" w:eastAsia="Consolas" w:hAnsi="Consolas"/>
+                <w:b w:val="false"/>
+                <w:bCs w:val="false"/>
+                <w:sz w:val="18"/>
+                <w:szCs w:val="18"/>
+              </w:rPr>
+              <w:t xml:space="preserve">ChiTietHoaDonKhuyenMai</w:t>
+            </w:r>
+            <w:r>
+              <w:rPr>
+                <w:rFonts w:ascii="Arial" w:cs="Arial" w:eastAsia="Arial" w:hAnsi="Arial"/>
+                <w:b w:val="false"/>
+                <w:bCs w:val="false"/>
+                <w:sz w:val="18"/>
+                <w:szCs w:val="18"/>
+              </w:rPr>
+              <w:t xml:space="preserve"> (</w:t>
+            </w:r>
+            <w:r>
+              <w:rPr>
+                <w:rFonts w:ascii="Consolas" w:cs="Consolas" w:eastAsia="Consolas" w:hAnsi="Consolas"/>
+                <w:b w:val="false"/>
+                <w:bCs w:val="false"/>
+                <w:sz w:val="18"/>
+                <w:szCs w:val="18"/>
+              </w:rPr>
+              <w:t xml:space="preserve">ma_chi_tiet</w:t>
+            </w:r>
+            <w:r>
+              <w:rPr>
+                <w:rFonts w:ascii="Arial" w:cs="Arial" w:eastAsia="Arial" w:hAnsi="Arial"/>
+                <w:b w:val="false"/>
+                <w:bCs w:val="false"/>
+                <w:sz w:val="18"/>
+                <w:szCs w:val="18"/>
+              </w:rPr>
+              <w:t xml:space="preserve">, </w:t>
+            </w:r>
+            <w:r>
+              <w:rPr>
+                <w:rFonts w:ascii="Consolas" w:cs="Consolas" w:eastAsia="Consolas" w:hAnsi="Consolas"/>
+                <w:b w:val="false"/>
+                <w:bCs w:val="false"/>
+                <w:sz w:val="18"/>
+                <w:szCs w:val="18"/>
+              </w:rPr>
+              <w:t xml:space="preserve">ma_khuyen_mai</w:t>
+            </w:r>
+            <w:r>
+              <w:rPr>
+                <w:rFonts w:ascii="Arial" w:cs="Arial" w:eastAsia="Arial" w:hAnsi="Arial"/>
+                <w:b w:val="false"/>
+                <w:bCs w:val="false"/>
+                <w:sz w:val="18"/>
+                <w:szCs w:val="18"/>
+              </w:rPr>
+              <w:t xml:space="preserve">, </w:t>
+            </w:r>
+            <w:r>
+              <w:rPr>
+                <w:rFonts w:ascii="Consolas" w:cs="Consolas" w:eastAsia="Consolas" w:hAnsi="Consolas"/>
+                <w:b w:val="false"/>
+                <w:bCs w:val="false"/>
+                <w:sz w:val="18"/>
+                <w:szCs w:val="18"/>
+              </w:rPr>
+              <w:t xml:space="preserve">muc_giam_moi_ly</w:t>
+            </w:r>
+            <w:r>
+              <w:rPr>
+                <w:rFonts w:ascii="Arial" w:cs="Arial" w:eastAsia="Arial" w:hAnsi="Arial"/>
+                <w:b w:val="false"/>
+                <w:bCs w:val="false"/>
+                <w:sz w:val="18"/>
+                <w:szCs w:val="18"/>
+              </w:rPr>
+              <w:t xml:space="preserve">); BỎ cột </w:t>
+            </w:r>
+            <w:r>
+              <w:rPr>
+                <w:rFonts w:ascii="Consolas" w:cs="Consolas" w:eastAsia="Consolas" w:hAnsi="Consolas"/>
+                <w:b w:val="false"/>
+                <w:bCs w:val="false"/>
+                <w:sz w:val="18"/>
+                <w:szCs w:val="18"/>
+              </w:rPr>
+              <w:t xml:space="preserve">ChiTietHoaDon.ma_khuyen_mai</w:t>
+            </w:r>
+          </w:p>
+        </w:tc>
+        <w:tc>
+          <w:tcPr>
+            <w:tcW w:type="dxa" w:w="8178"/>
+            <w:tcBorders>
+              <w:top w:val="single" w:color="BFBFBF" w:sz="4"/>
+              <w:left w:val="single" w:color="BFBFBF" w:sz="4"/>
+              <w:bottom w:val="single" w:color="BFBFBF" w:sz="4"/>
+              <w:right w:val="single" w:color="BFBFBF" w:sz="4"/>
+            </w:tcBorders>
+            <w:tcMar>
+              <w:top w:type="dxa" w:w="60"/>
+              <w:left w:type="dxa" w:w="90"/>
+              <w:bottom w:type="dxa" w:w="60"/>
+              <w:right w:type="dxa" w:w="90"/>
+            </w:tcMar>
+          </w:tcPr>
+          <w:p>
+            <w:pPr>
+              <w:spacing w:after="20"/>
+            </w:pPr>
+            <w:r>
+              <w:rPr>
+                <w:rFonts w:ascii="Arial" w:cs="Arial" w:eastAsia="Arial" w:hAnsi="Arial"/>
+                <w:b w:val="false"/>
+                <w:bCs w:val="false"/>
+                <w:sz w:val="18"/>
+                <w:szCs w:val="18"/>
+              </w:rPr>
+              <w:t xml:space="preserve">Một sản phẩm áp được NHIỀU khuyến mãi cùng lúc (cộng dồn trên giá gốc); mỗi mã lưu mức giảm trên từng ly để tính lượt dùng (theo ly) và hiệu quả từng mã (KM-07). </w:t>
+            </w:r>
+            <w:r>
+              <w:rPr>
+                <w:rFonts w:ascii="Consolas" w:cs="Consolas" w:eastAsia="Consolas" w:hAnsi="Consolas"/>
+                <w:b w:val="false"/>
+                <w:bCs w:val="false"/>
+                <w:sz w:val="18"/>
+                <w:szCs w:val="18"/>
+              </w:rPr>
+              <w:t xml:space="preserve">ChiTietHoaDon.giam_gia</w:t>
+            </w:r>
+            <w:r>
+              <w:rPr>
+                <w:rFonts w:ascii="Arial" w:cs="Arial" w:eastAsia="Arial" w:hAnsi="Arial"/>
+                <w:b w:val="false"/>
+                <w:bCs w:val="false"/>
+                <w:sz w:val="18"/>
+                <w:szCs w:val="18"/>
+              </w:rPr>
+              <w:t xml:space="preserve"> = tổng giảm của dòng</w:t>
             </w:r>
           </w:p>
         </w:tc>
@@ -20180,7 +21592,7 @@
         <w:rPr>
           <w:rFonts w:ascii="Arial" w:cs="Arial" w:eastAsia="Arial" w:hAnsi="Arial"/>
         </w:rPr>
-        <w:t xml:space="preserve">A.2 Khuyến mãi đang hiệu lực cho một sản phẩm (POS-01, POS-02): lấy mức giảm cao nhất</w:t>
+        <w:t xml:space="preserve">A.2 Khuyến mãi đang hiệu lực cho một sản phẩm (POS-01, POS-02): cộng dồn nhiều mã trên giá gốc</w:t>
       </w:r>
     </w:p>
     <w:p>
@@ -20194,7 +21606,7 @@
           <w:sz w:val="17"/>
           <w:szCs w:val="17"/>
         </w:rPr>
-        <w:t xml:space="preserve">SELECT km.ma_khuyen_mai,</w:t>
+        <w:t xml:space="preserve">-- Bước 1: các khuyến mãi đang hiệu lực của sản phẩm, theo mã tăng dần (thứ tự cộng dồn)</w:t>
       </w:r>
     </w:p>
     <w:p>
@@ -20208,49 +21620,7 @@
           <w:sz w:val="17"/>
           <w:szCs w:val="17"/>
         </w:rPr>
-        <w:t xml:space="preserve">       CASE km.loai_giam</w:t>
-      </w:r>
-    </w:p>
-    <w:p>
-      <w:pPr>
-        <w:shd w:fill="F2F2F2" w:color="auto" w:val="clear"/>
-        <w:spacing w:after="0"/>
-      </w:pPr>
-      <w:r>
-        <w:rPr>
-          <w:rFonts w:ascii="Consolas" w:cs="Consolas" w:eastAsia="Consolas" w:hAnsi="Consolas"/>
-          <w:sz w:val="17"/>
-          <w:szCs w:val="17"/>
-        </w:rPr>
-        <w:t xml:space="preserve">         WHEN 'phan_tram' THEN sp.gia_ban * km.gia_tri_giam / 100</w:t>
-      </w:r>
-    </w:p>
-    <w:p>
-      <w:pPr>
-        <w:shd w:fill="F2F2F2" w:color="auto" w:val="clear"/>
-        <w:spacing w:after="0"/>
-      </w:pPr>
-      <w:r>
-        <w:rPr>
-          <w:rFonts w:ascii="Consolas" w:cs="Consolas" w:eastAsia="Consolas" w:hAnsi="Consolas"/>
-          <w:sz w:val="17"/>
-          <w:szCs w:val="17"/>
-        </w:rPr>
-        <w:t xml:space="preserve">         ELSE km.gia_tri_giam</w:t>
-      </w:r>
-    </w:p>
-    <w:p>
-      <w:pPr>
-        <w:shd w:fill="F2F2F2" w:color="auto" w:val="clear"/>
-        <w:spacing w:after="0"/>
-      </w:pPr>
-      <w:r>
-        <w:rPr>
-          <w:rFonts w:ascii="Consolas" w:cs="Consolas" w:eastAsia="Consolas" w:hAnsi="Consolas"/>
-          <w:sz w:val="17"/>
-          <w:szCs w:val="17"/>
-        </w:rPr>
-        <w:t xml:space="preserve">       END AS so_tien_giam</w:t>
+        <w:t xml:space="preserve">SELECT km.ma_khuyen_mai, km.loai_giam, km.gia_tri_giam</w:t>
       </w:r>
     </w:p>
     <w:p>
@@ -20292,20 +21662,6 @@
           <w:sz w:val="17"/>
           <w:szCs w:val="17"/>
         </w:rPr>
-        <w:t xml:space="preserve">JOIN SanPham sp   ON sp.ma_san_pham  = kmsp.ma_san_pham</w:t>
-      </w:r>
-    </w:p>
-    <w:p>
-      <w:pPr>
-        <w:shd w:fill="F2F2F2" w:color="auto" w:val="clear"/>
-        <w:spacing w:after="0"/>
-      </w:pPr>
-      <w:r>
-        <w:rPr>
-          <w:rFonts w:ascii="Consolas" w:cs="Consolas" w:eastAsia="Consolas" w:hAnsi="Consolas"/>
-          <w:sz w:val="17"/>
-          <w:szCs w:val="17"/>
-        </w:rPr>
         <w:t xml:space="preserve">WHERE kmsp.ma_san_pham = :sp</w:t>
       </w:r>
     </w:p>
@@ -20334,7 +21690,7 @@
           <w:sz w:val="17"/>
           <w:szCs w:val="17"/>
         </w:rPr>
-        <w:t xml:space="preserve">ORDER BY so_tien_giam DESC</w:t>
+        <w:t xml:space="preserve">ORDER BY km.ma_khuyen_mai;</w:t>
       </w:r>
     </w:p>
     <w:p>
@@ -20348,7 +21704,119 @@
           <w:sz w:val="17"/>
           <w:szCs w:val="17"/>
         </w:rPr>
-        <w:t xml:space="preserve">LIMIT 1;</w:t>
+        <w:t xml:space="preserve"> </w:t>
+      </w:r>
+    </w:p>
+    <w:p>
+      <w:pPr>
+        <w:shd w:fill="F2F2F2" w:color="auto" w:val="clear"/>
+        <w:spacing w:after="0"/>
+      </w:pPr>
+      <w:r>
+        <w:rPr>
+          <w:rFonts w:ascii="Consolas" w:cs="Consolas" w:eastAsia="Consolas" w:hAnsi="Consolas"/>
+          <w:sz w:val="17"/>
+          <w:szCs w:val="17"/>
+        </w:rPr>
+        <w:t xml:space="preserve">-- Bước 2 (ở tầng ứng dụng, khuyen-mai.service.tinhKhuyenMai), với MỖI ly:</w:t>
+      </w:r>
+    </w:p>
+    <w:p>
+      <w:pPr>
+        <w:shd w:fill="F2F2F2" w:color="auto" w:val="clear"/>
+        <w:spacing w:after="0"/>
+      </w:pPr>
+      <w:r>
+        <w:rPr>
+          <w:rFonts w:ascii="Consolas" w:cs="Consolas" w:eastAsia="Consolas" w:hAnsi="Consolas"/>
+          <w:sz w:val="17"/>
+          <w:szCs w:val="17"/>
+        </w:rPr>
+        <w:t xml:space="preserve">--   con_lai = gia_ban</w:t>
+      </w:r>
+    </w:p>
+    <w:p>
+      <w:pPr>
+        <w:shd w:fill="F2F2F2" w:color="auto" w:val="clear"/>
+        <w:spacing w:after="0"/>
+      </w:pPr>
+      <w:r>
+        <w:rPr>
+          <w:rFonts w:ascii="Consolas" w:cs="Consolas" w:eastAsia="Consolas" w:hAnsi="Consolas"/>
+          <w:sz w:val="17"/>
+          <w:szCs w:val="17"/>
+        </w:rPr>
+        <w:t xml:space="preserve">--   với từng mã theo thứ tự:</w:t>
+      </w:r>
+    </w:p>
+    <w:p>
+      <w:pPr>
+        <w:shd w:fill="F2F2F2" w:color="auto" w:val="clear"/>
+        <w:spacing w:after="0"/>
+      </w:pPr>
+      <w:r>
+        <w:rPr>
+          <w:rFonts w:ascii="Consolas" w:cs="Consolas" w:eastAsia="Consolas" w:hAnsi="Consolas"/>
+          <w:sz w:val="17"/>
+          <w:szCs w:val="17"/>
+        </w:rPr>
+        <w:t xml:space="preserve">--     muc = FLOOR( phan_tram ? gia_ban * gia_tri_giam / 100 : gia_tri_giam )   -- luôn tính trên GIÁ GỐC</w:t>
+      </w:r>
+    </w:p>
+    <w:p>
+      <w:pPr>
+        <w:shd w:fill="F2F2F2" w:color="auto" w:val="clear"/>
+        <w:spacing w:after="0"/>
+      </w:pPr>
+      <w:r>
+        <w:rPr>
+          <w:rFonts w:ascii="Consolas" w:cs="Consolas" w:eastAsia="Consolas" w:hAnsi="Consolas"/>
+          <w:sz w:val="17"/>
+          <w:szCs w:val="17"/>
+        </w:rPr>
+        <w:t xml:space="preserve">--     muc = MIN(muc, con_lai);  nếu muc &lt;= 0 thì bỏ qua mã; ngược lại ghi</w:t>
+      </w:r>
+    </w:p>
+    <w:p>
+      <w:pPr>
+        <w:shd w:fill="F2F2F2" w:color="auto" w:val="clear"/>
+        <w:spacing w:after="0"/>
+      </w:pPr>
+      <w:r>
+        <w:rPr>
+          <w:rFonts w:ascii="Consolas" w:cs="Consolas" w:eastAsia="Consolas" w:hAnsi="Consolas"/>
+          <w:sz w:val="17"/>
+          <w:szCs w:val="17"/>
+        </w:rPr>
+        <w:t xml:space="preserve">--       INSERT INTO ChiTietHoaDonKhuyenMai (ma_chi_tiet, ma_khuyen_mai, muc_giam_moi_ly) VALUES (:dong, :km, muc)</w:t>
+      </w:r>
+    </w:p>
+    <w:p>
+      <w:pPr>
+        <w:shd w:fill="F2F2F2" w:color="auto" w:val="clear"/>
+        <w:spacing w:after="0"/>
+      </w:pPr>
+      <w:r>
+        <w:rPr>
+          <w:rFonts w:ascii="Consolas" w:cs="Consolas" w:eastAsia="Consolas" w:hAnsi="Consolas"/>
+          <w:sz w:val="17"/>
+          <w:szCs w:val="17"/>
+        </w:rPr>
+        <w:t xml:space="preserve">--     con_lai = con_lai - muc</w:t>
+      </w:r>
+    </w:p>
+    <w:p>
+      <w:pPr>
+        <w:shd w:fill="F2F2F2" w:color="auto" w:val="clear"/>
+        <w:spacing w:after="0"/>
+      </w:pPr>
+      <w:r>
+        <w:rPr>
+          <w:rFonts w:ascii="Consolas" w:cs="Consolas" w:eastAsia="Consolas" w:hAnsi="Consolas"/>
+          <w:sz w:val="17"/>
+          <w:szCs w:val="17"/>
+        </w:rPr>
+        <w:t xml:space="preserve">--   ChiTietHoaDon.giam_gia = so_luong * (gia_ban - con_lai)</w:t>
       </w:r>
     </w:p>
     <w:p>
@@ -20804,7 +22272,7 @@
         <w:rPr>
           <w:rFonts w:ascii="Arial" w:cs="Arial" w:eastAsia="Arial" w:hAnsi="Arial"/>
         </w:rPr>
-        <w:t xml:space="preserve">Lưu ý: nếu một sản phẩm có nhiều khuyến mãi cùng lúc, đoạn SQL trên chọn mức giảm cao nhất. Có thể đổi quy tắc ở tầng ứng dụng (ví dụ chỉ cho một khuyến mãi hoạt động tại một thời điểm).</w:t>
+        <w:t xml:space="preserve">Lưu ý: một sản phẩm áp được NHIỀU khuyến mãi cùng lúc, cộng dồn trên GIÁ GỐC (mã sau không tính trên giá đã giảm bởi mã trước), tính trên từng ly và làm tròn xuống đồng nguyên. Tổng giảm mỗi ly không vượt giá bán: mã cuối được cắt phần dư, mã không còn gì để giảm thì không ghi. Khi sửa số lượng dòng, mức giảm mỗi ly đã chụp được giữ nguyên.</w:t>
       </w:r>
     </w:p>
     <w:p>
@@ -21764,7 +23232,7 @@
                 <w:sz w:val="18"/>
                 <w:szCs w:val="18"/>
               </w:rPr>
-              <w:t xml:space="preserve">POS-01 menu (so_ly_toi_da, du_nguyen_lieu)</w:t>
+              <w:t xml:space="preserve">POS-01 menu (gia_sau_giam, khuyen_mai[], so_ly_toi_da, du_nguyen_lieu)</w:t>
             </w:r>
           </w:p>
         </w:tc>
@@ -23260,6 +24728,1735 @@
                 <w:szCs w:val="18"/>
               </w:rPr>
               <w:t xml:space="preserve">A/Q/N</w:t>
+            </w:r>
+          </w:p>
+        </w:tc>
+      </w:tr>
+      <w:tr>
+        <w:trPr>
+          <w:cantSplit/>
+        </w:trPr>
+        <w:tc>
+          <w:tcPr>
+            <w:tcW w:type="dxa" w:w="1800"/>
+            <w:tcBorders>
+              <w:top w:val="single" w:color="BFBFBF" w:sz="4"/>
+              <w:left w:val="single" w:color="BFBFBF" w:sz="4"/>
+              <w:bottom w:val="single" w:color="BFBFBF" w:sz="4"/>
+              <w:right w:val="single" w:color="BFBFBF" w:sz="4"/>
+            </w:tcBorders>
+            <w:tcMar>
+              <w:top w:type="dxa" w:w="60"/>
+              <w:left w:type="dxa" w:w="90"/>
+              <w:bottom w:type="dxa" w:w="60"/>
+              <w:right w:type="dxa" w:w="90"/>
+            </w:tcMar>
+          </w:tcPr>
+          <w:p>
+            <w:pPr>
+              <w:spacing w:after="20"/>
+            </w:pPr>
+            <w:r>
+              <w:rPr>
+                <w:rFonts w:ascii="Arial" w:cs="Arial" w:eastAsia="Arial" w:hAnsi="Arial"/>
+                <w:b w:val="false"/>
+                <w:bCs w:val="false"/>
+                <w:sz w:val="18"/>
+                <w:szCs w:val="18"/>
+              </w:rPr>
+              <w:t xml:space="preserve">POST, GET</w:t>
+            </w:r>
+          </w:p>
+        </w:tc>
+        <w:tc>
+          <w:tcPr>
+            <w:tcW w:type="dxa" w:w="5400"/>
+            <w:tcBorders>
+              <w:top w:val="single" w:color="BFBFBF" w:sz="4"/>
+              <w:left w:val="single" w:color="BFBFBF" w:sz="4"/>
+              <w:bottom w:val="single" w:color="BFBFBF" w:sz="4"/>
+              <w:right w:val="single" w:color="BFBFBF" w:sz="4"/>
+            </w:tcBorders>
+            <w:tcMar>
+              <w:top w:type="dxa" w:w="60"/>
+              <w:left w:type="dxa" w:w="90"/>
+              <w:bottom w:type="dxa" w:w="60"/>
+              <w:right w:type="dxa" w:w="90"/>
+            </w:tcMar>
+          </w:tcPr>
+          <w:p>
+            <w:pPr>
+              <w:spacing w:after="20"/>
+            </w:pPr>
+            <w:r>
+              <w:rPr>
+                <w:rFonts w:ascii="Arial" w:cs="Arial" w:eastAsia="Arial" w:hAnsi="Arial"/>
+                <w:b w:val="false"/>
+                <w:bCs w:val="false"/>
+                <w:sz w:val="18"/>
+                <w:szCs w:val="18"/>
+              </w:rPr>
+              <w:t xml:space="preserve">/api/khuyen-mai</w:t>
+            </w:r>
+          </w:p>
+        </w:tc>
+        <w:tc>
+          <w:tcPr>
+            <w:tcW w:type="dxa" w:w="4878"/>
+            <w:tcBorders>
+              <w:top w:val="single" w:color="BFBFBF" w:sz="4"/>
+              <w:left w:val="single" w:color="BFBFBF" w:sz="4"/>
+              <w:bottom w:val="single" w:color="BFBFBF" w:sz="4"/>
+              <w:right w:val="single" w:color="BFBFBF" w:sz="4"/>
+            </w:tcBorders>
+            <w:tcMar>
+              <w:top w:type="dxa" w:w="60"/>
+              <w:left w:type="dxa" w:w="90"/>
+              <w:bottom w:type="dxa" w:w="60"/>
+              <w:right w:type="dxa" w:w="90"/>
+            </w:tcMar>
+          </w:tcPr>
+          <w:p>
+            <w:pPr>
+              <w:spacing w:after="20"/>
+            </w:pPr>
+            <w:r>
+              <w:rPr>
+                <w:rFonts w:ascii="Arial" w:cs="Arial" w:eastAsia="Arial" w:hAnsi="Arial"/>
+                <w:b w:val="false"/>
+                <w:bCs w:val="false"/>
+                <w:sz w:val="18"/>
+                <w:szCs w:val="18"/>
+              </w:rPr>
+              <w:t xml:space="preserve">KM-01 tạo, KM-06 danh sách khuyến mãi (trang_thai, ma_san_pham)</w:t>
+            </w:r>
+          </w:p>
+        </w:tc>
+        <w:tc>
+          <w:tcPr>
+            <w:tcW w:type="dxa" w:w="2600"/>
+            <w:tcBorders>
+              <w:top w:val="single" w:color="BFBFBF" w:sz="4"/>
+              <w:left w:val="single" w:color="BFBFBF" w:sz="4"/>
+              <w:bottom w:val="single" w:color="BFBFBF" w:sz="4"/>
+              <w:right w:val="single" w:color="BFBFBF" w:sz="4"/>
+            </w:tcBorders>
+            <w:tcMar>
+              <w:top w:type="dxa" w:w="60"/>
+              <w:left w:type="dxa" w:w="90"/>
+              <w:bottom w:type="dxa" w:w="60"/>
+              <w:right w:type="dxa" w:w="90"/>
+            </w:tcMar>
+          </w:tcPr>
+          <w:p>
+            <w:pPr>
+              <w:spacing w:after="20"/>
+            </w:pPr>
+            <w:r>
+              <w:rPr>
+                <w:rFonts w:ascii="Arial" w:cs="Arial" w:eastAsia="Arial" w:hAnsi="Arial"/>
+                <w:b w:val="false"/>
+                <w:bCs w:val="false"/>
+                <w:sz w:val="18"/>
+                <w:szCs w:val="18"/>
+              </w:rPr>
+              <w:t xml:space="preserve">A/Q</w:t>
+            </w:r>
+          </w:p>
+        </w:tc>
+      </w:tr>
+      <w:tr>
+        <w:trPr>
+          <w:cantSplit/>
+        </w:trPr>
+        <w:tc>
+          <w:tcPr>
+            <w:tcW w:type="dxa" w:w="1800"/>
+            <w:tcBorders>
+              <w:top w:val="single" w:color="BFBFBF" w:sz="4"/>
+              <w:left w:val="single" w:color="BFBFBF" w:sz="4"/>
+              <w:bottom w:val="single" w:color="BFBFBF" w:sz="4"/>
+              <w:right w:val="single" w:color="BFBFBF" w:sz="4"/>
+            </w:tcBorders>
+            <w:tcMar>
+              <w:top w:type="dxa" w:w="60"/>
+              <w:left w:type="dxa" w:w="90"/>
+              <w:bottom w:type="dxa" w:w="60"/>
+              <w:right w:type="dxa" w:w="90"/>
+            </w:tcMar>
+          </w:tcPr>
+          <w:p>
+            <w:pPr>
+              <w:spacing w:after="20"/>
+            </w:pPr>
+            <w:r>
+              <w:rPr>
+                <w:rFonts w:ascii="Arial" w:cs="Arial" w:eastAsia="Arial" w:hAnsi="Arial"/>
+                <w:b w:val="false"/>
+                <w:bCs w:val="false"/>
+                <w:sz w:val="18"/>
+                <w:szCs w:val="18"/>
+              </w:rPr>
+              <w:t xml:space="preserve">GET</w:t>
+            </w:r>
+          </w:p>
+        </w:tc>
+        <w:tc>
+          <w:tcPr>
+            <w:tcW w:type="dxa" w:w="5400"/>
+            <w:tcBorders>
+              <w:top w:val="single" w:color="BFBFBF" w:sz="4"/>
+              <w:left w:val="single" w:color="BFBFBF" w:sz="4"/>
+              <w:bottom w:val="single" w:color="BFBFBF" w:sz="4"/>
+              <w:right w:val="single" w:color="BFBFBF" w:sz="4"/>
+            </w:tcBorders>
+            <w:tcMar>
+              <w:top w:type="dxa" w:w="60"/>
+              <w:left w:type="dxa" w:w="90"/>
+              <w:bottom w:type="dxa" w:w="60"/>
+              <w:right w:type="dxa" w:w="90"/>
+            </w:tcMar>
+          </w:tcPr>
+          <w:p>
+            <w:pPr>
+              <w:spacing w:after="20"/>
+            </w:pPr>
+            <w:r>
+              <w:rPr>
+                <w:rFonts w:ascii="Arial" w:cs="Arial" w:eastAsia="Arial" w:hAnsi="Arial"/>
+                <w:b w:val="false"/>
+                <w:bCs w:val="false"/>
+                <w:sz w:val="18"/>
+                <w:szCs w:val="18"/>
+              </w:rPr>
+              <w:t xml:space="preserve">/api/khuyen-mai/:ma/bao-cao</w:t>
+            </w:r>
+          </w:p>
+        </w:tc>
+        <w:tc>
+          <w:tcPr>
+            <w:tcW w:type="dxa" w:w="4878"/>
+            <w:tcBorders>
+              <w:top w:val="single" w:color="BFBFBF" w:sz="4"/>
+              <w:left w:val="single" w:color="BFBFBF" w:sz="4"/>
+              <w:bottom w:val="single" w:color="BFBFBF" w:sz="4"/>
+              <w:right w:val="single" w:color="BFBFBF" w:sz="4"/>
+            </w:tcBorders>
+            <w:tcMar>
+              <w:top w:type="dxa" w:w="60"/>
+              <w:left w:type="dxa" w:w="90"/>
+              <w:bottom w:type="dxa" w:w="60"/>
+              <w:right w:type="dxa" w:w="90"/>
+            </w:tcMar>
+          </w:tcPr>
+          <w:p>
+            <w:pPr>
+              <w:spacing w:after="20"/>
+            </w:pPr>
+            <w:r>
+              <w:rPr>
+                <w:rFonts w:ascii="Arial" w:cs="Arial" w:eastAsia="Arial" w:hAnsi="Arial"/>
+                <w:b w:val="false"/>
+                <w:bCs w:val="false"/>
+                <w:sz w:val="18"/>
+                <w:szCs w:val="18"/>
+              </w:rPr>
+              <w:t xml:space="preserve">KM-07 báo cáo hiệu quả (tu_ngay, den_ngay theo ngày thanh toán)</w:t>
+            </w:r>
+          </w:p>
+        </w:tc>
+        <w:tc>
+          <w:tcPr>
+            <w:tcW w:type="dxa" w:w="2600"/>
+            <w:tcBorders>
+              <w:top w:val="single" w:color="BFBFBF" w:sz="4"/>
+              <w:left w:val="single" w:color="BFBFBF" w:sz="4"/>
+              <w:bottom w:val="single" w:color="BFBFBF" w:sz="4"/>
+              <w:right w:val="single" w:color="BFBFBF" w:sz="4"/>
+            </w:tcBorders>
+            <w:tcMar>
+              <w:top w:type="dxa" w:w="60"/>
+              <w:left w:type="dxa" w:w="90"/>
+              <w:bottom w:type="dxa" w:w="60"/>
+              <w:right w:type="dxa" w:w="90"/>
+            </w:tcMar>
+          </w:tcPr>
+          <w:p>
+            <w:pPr>
+              <w:spacing w:after="20"/>
+            </w:pPr>
+            <w:r>
+              <w:rPr>
+                <w:rFonts w:ascii="Arial" w:cs="Arial" w:eastAsia="Arial" w:hAnsi="Arial"/>
+                <w:b w:val="false"/>
+                <w:bCs w:val="false"/>
+                <w:sz w:val="18"/>
+                <w:szCs w:val="18"/>
+              </w:rPr>
+              <w:t xml:space="preserve">A/Q</w:t>
+            </w:r>
+          </w:p>
+        </w:tc>
+      </w:tr>
+      <w:tr>
+        <w:trPr>
+          <w:cantSplit/>
+        </w:trPr>
+        <w:tc>
+          <w:tcPr>
+            <w:tcW w:type="dxa" w:w="1800"/>
+            <w:tcBorders>
+              <w:top w:val="single" w:color="BFBFBF" w:sz="4"/>
+              <w:left w:val="single" w:color="BFBFBF" w:sz="4"/>
+              <w:bottom w:val="single" w:color="BFBFBF" w:sz="4"/>
+              <w:right w:val="single" w:color="BFBFBF" w:sz="4"/>
+            </w:tcBorders>
+            <w:tcMar>
+              <w:top w:type="dxa" w:w="60"/>
+              <w:left w:type="dxa" w:w="90"/>
+              <w:bottom w:type="dxa" w:w="60"/>
+              <w:right w:type="dxa" w:w="90"/>
+            </w:tcMar>
+          </w:tcPr>
+          <w:p>
+            <w:pPr>
+              <w:spacing w:after="20"/>
+            </w:pPr>
+            <w:r>
+              <w:rPr>
+                <w:rFonts w:ascii="Arial" w:cs="Arial" w:eastAsia="Arial" w:hAnsi="Arial"/>
+                <w:b w:val="false"/>
+                <w:bCs w:val="false"/>
+                <w:sz w:val="18"/>
+                <w:szCs w:val="18"/>
+              </w:rPr>
+              <w:t xml:space="preserve">GET, PATCH, DELETE</w:t>
+            </w:r>
+          </w:p>
+        </w:tc>
+        <w:tc>
+          <w:tcPr>
+            <w:tcW w:type="dxa" w:w="5400"/>
+            <w:tcBorders>
+              <w:top w:val="single" w:color="BFBFBF" w:sz="4"/>
+              <w:left w:val="single" w:color="BFBFBF" w:sz="4"/>
+              <w:bottom w:val="single" w:color="BFBFBF" w:sz="4"/>
+              <w:right w:val="single" w:color="BFBFBF" w:sz="4"/>
+            </w:tcBorders>
+            <w:tcMar>
+              <w:top w:type="dxa" w:w="60"/>
+              <w:left w:type="dxa" w:w="90"/>
+              <w:bottom w:type="dxa" w:w="60"/>
+              <w:right w:type="dxa" w:w="90"/>
+            </w:tcMar>
+          </w:tcPr>
+          <w:p>
+            <w:pPr>
+              <w:spacing w:after="20"/>
+            </w:pPr>
+            <w:r>
+              <w:rPr>
+                <w:rFonts w:ascii="Arial" w:cs="Arial" w:eastAsia="Arial" w:hAnsi="Arial"/>
+                <w:b w:val="false"/>
+                <w:bCs w:val="false"/>
+                <w:sz w:val="18"/>
+                <w:szCs w:val="18"/>
+              </w:rPr>
+              <w:t xml:space="preserve">/api/khuyen-mai/:ma</w:t>
+            </w:r>
+          </w:p>
+        </w:tc>
+        <w:tc>
+          <w:tcPr>
+            <w:tcW w:type="dxa" w:w="4878"/>
+            <w:tcBorders>
+              <w:top w:val="single" w:color="BFBFBF" w:sz="4"/>
+              <w:left w:val="single" w:color="BFBFBF" w:sz="4"/>
+              <w:bottom w:val="single" w:color="BFBFBF" w:sz="4"/>
+              <w:right w:val="single" w:color="BFBFBF" w:sz="4"/>
+            </w:tcBorders>
+            <w:tcMar>
+              <w:top w:type="dxa" w:w="60"/>
+              <w:left w:type="dxa" w:w="90"/>
+              <w:bottom w:type="dxa" w:w="60"/>
+              <w:right w:type="dxa" w:w="90"/>
+            </w:tcMar>
+          </w:tcPr>
+          <w:p>
+            <w:pPr>
+              <w:spacing w:after="20"/>
+            </w:pPr>
+            <w:r>
+              <w:rPr>
+                <w:rFonts w:ascii="Arial" w:cs="Arial" w:eastAsia="Arial" w:hAnsi="Arial"/>
+                <w:b w:val="false"/>
+                <w:bCs w:val="false"/>
+                <w:sz w:val="18"/>
+                <w:szCs w:val="18"/>
+              </w:rPr>
+              <w:t xml:space="preserve">Xem chi tiết, KM-02 sửa, KM-03 xóa khuyến mãi</w:t>
+            </w:r>
+          </w:p>
+        </w:tc>
+        <w:tc>
+          <w:tcPr>
+            <w:tcW w:type="dxa" w:w="2600"/>
+            <w:tcBorders>
+              <w:top w:val="single" w:color="BFBFBF" w:sz="4"/>
+              <w:left w:val="single" w:color="BFBFBF" w:sz="4"/>
+              <w:bottom w:val="single" w:color="BFBFBF" w:sz="4"/>
+              <w:right w:val="single" w:color="BFBFBF" w:sz="4"/>
+            </w:tcBorders>
+            <w:tcMar>
+              <w:top w:type="dxa" w:w="60"/>
+              <w:left w:type="dxa" w:w="90"/>
+              <w:bottom w:type="dxa" w:w="60"/>
+              <w:right w:type="dxa" w:w="90"/>
+            </w:tcMar>
+          </w:tcPr>
+          <w:p>
+            <w:pPr>
+              <w:spacing w:after="20"/>
+            </w:pPr>
+            <w:r>
+              <w:rPr>
+                <w:rFonts w:ascii="Arial" w:cs="Arial" w:eastAsia="Arial" w:hAnsi="Arial"/>
+                <w:b w:val="false"/>
+                <w:bCs w:val="false"/>
+                <w:sz w:val="18"/>
+                <w:szCs w:val="18"/>
+              </w:rPr>
+              <w:t xml:space="preserve">A/Q</w:t>
+            </w:r>
+          </w:p>
+        </w:tc>
+      </w:tr>
+      <w:tr>
+        <w:trPr>
+          <w:cantSplit/>
+        </w:trPr>
+        <w:tc>
+          <w:tcPr>
+            <w:tcW w:type="dxa" w:w="1800"/>
+            <w:tcBorders>
+              <w:top w:val="single" w:color="BFBFBF" w:sz="4"/>
+              <w:left w:val="single" w:color="BFBFBF" w:sz="4"/>
+              <w:bottom w:val="single" w:color="BFBFBF" w:sz="4"/>
+              <w:right w:val="single" w:color="BFBFBF" w:sz="4"/>
+            </w:tcBorders>
+            <w:tcMar>
+              <w:top w:type="dxa" w:w="60"/>
+              <w:left w:type="dxa" w:w="90"/>
+              <w:bottom w:type="dxa" w:w="60"/>
+              <w:right w:type="dxa" w:w="90"/>
+            </w:tcMar>
+          </w:tcPr>
+          <w:p>
+            <w:pPr>
+              <w:spacing w:after="20"/>
+            </w:pPr>
+            <w:r>
+              <w:rPr>
+                <w:rFonts w:ascii="Arial" w:cs="Arial" w:eastAsia="Arial" w:hAnsi="Arial"/>
+                <w:b w:val="false"/>
+                <w:bCs w:val="false"/>
+                <w:sz w:val="18"/>
+                <w:szCs w:val="18"/>
+              </w:rPr>
+              <w:t xml:space="preserve">POST</w:t>
+            </w:r>
+          </w:p>
+        </w:tc>
+        <w:tc>
+          <w:tcPr>
+            <w:tcW w:type="dxa" w:w="5400"/>
+            <w:tcBorders>
+              <w:top w:val="single" w:color="BFBFBF" w:sz="4"/>
+              <w:left w:val="single" w:color="BFBFBF" w:sz="4"/>
+              <w:bottom w:val="single" w:color="BFBFBF" w:sz="4"/>
+              <w:right w:val="single" w:color="BFBFBF" w:sz="4"/>
+            </w:tcBorders>
+            <w:tcMar>
+              <w:top w:type="dxa" w:w="60"/>
+              <w:left w:type="dxa" w:w="90"/>
+              <w:bottom w:type="dxa" w:w="60"/>
+              <w:right w:type="dxa" w:w="90"/>
+            </w:tcMar>
+          </w:tcPr>
+          <w:p>
+            <w:pPr>
+              <w:spacing w:after="20"/>
+            </w:pPr>
+            <w:r>
+              <w:rPr>
+                <w:rFonts w:ascii="Arial" w:cs="Arial" w:eastAsia="Arial" w:hAnsi="Arial"/>
+                <w:b w:val="false"/>
+                <w:bCs w:val="false"/>
+                <w:sz w:val="18"/>
+                <w:szCs w:val="18"/>
+              </w:rPr>
+              <w:t xml:space="preserve">/api/khuyen-mai/:ma/san-pham</w:t>
+            </w:r>
+          </w:p>
+        </w:tc>
+        <w:tc>
+          <w:tcPr>
+            <w:tcW w:type="dxa" w:w="4878"/>
+            <w:tcBorders>
+              <w:top w:val="single" w:color="BFBFBF" w:sz="4"/>
+              <w:left w:val="single" w:color="BFBFBF" w:sz="4"/>
+              <w:bottom w:val="single" w:color="BFBFBF" w:sz="4"/>
+              <w:right w:val="single" w:color="BFBFBF" w:sz="4"/>
+            </w:tcBorders>
+            <w:tcMar>
+              <w:top w:type="dxa" w:w="60"/>
+              <w:left w:type="dxa" w:w="90"/>
+              <w:bottom w:type="dxa" w:w="60"/>
+              <w:right w:type="dxa" w:w="90"/>
+            </w:tcMar>
+          </w:tcPr>
+          <w:p>
+            <w:pPr>
+              <w:spacing w:after="20"/>
+            </w:pPr>
+            <w:r>
+              <w:rPr>
+                <w:rFonts w:ascii="Arial" w:cs="Arial" w:eastAsia="Arial" w:hAnsi="Arial"/>
+                <w:b w:val="false"/>
+                <w:bCs w:val="false"/>
+                <w:sz w:val="18"/>
+                <w:szCs w:val="18"/>
+              </w:rPr>
+              <w:t xml:space="preserve">KM-04 thêm sản phẩm vào khuyến mãi</w:t>
+            </w:r>
+          </w:p>
+        </w:tc>
+        <w:tc>
+          <w:tcPr>
+            <w:tcW w:type="dxa" w:w="2600"/>
+            <w:tcBorders>
+              <w:top w:val="single" w:color="BFBFBF" w:sz="4"/>
+              <w:left w:val="single" w:color="BFBFBF" w:sz="4"/>
+              <w:bottom w:val="single" w:color="BFBFBF" w:sz="4"/>
+              <w:right w:val="single" w:color="BFBFBF" w:sz="4"/>
+            </w:tcBorders>
+            <w:tcMar>
+              <w:top w:type="dxa" w:w="60"/>
+              <w:left w:type="dxa" w:w="90"/>
+              <w:bottom w:type="dxa" w:w="60"/>
+              <w:right w:type="dxa" w:w="90"/>
+            </w:tcMar>
+          </w:tcPr>
+          <w:p>
+            <w:pPr>
+              <w:spacing w:after="20"/>
+            </w:pPr>
+            <w:r>
+              <w:rPr>
+                <w:rFonts w:ascii="Arial" w:cs="Arial" w:eastAsia="Arial" w:hAnsi="Arial"/>
+                <w:b w:val="false"/>
+                <w:bCs w:val="false"/>
+                <w:sz w:val="18"/>
+                <w:szCs w:val="18"/>
+              </w:rPr>
+              <w:t xml:space="preserve">A/Q</w:t>
+            </w:r>
+          </w:p>
+        </w:tc>
+      </w:tr>
+      <w:tr>
+        <w:trPr>
+          <w:cantSplit/>
+        </w:trPr>
+        <w:tc>
+          <w:tcPr>
+            <w:tcW w:type="dxa" w:w="1800"/>
+            <w:tcBorders>
+              <w:top w:val="single" w:color="BFBFBF" w:sz="4"/>
+              <w:left w:val="single" w:color="BFBFBF" w:sz="4"/>
+              <w:bottom w:val="single" w:color="BFBFBF" w:sz="4"/>
+              <w:right w:val="single" w:color="BFBFBF" w:sz="4"/>
+            </w:tcBorders>
+            <w:tcMar>
+              <w:top w:type="dxa" w:w="60"/>
+              <w:left w:type="dxa" w:w="90"/>
+              <w:bottom w:type="dxa" w:w="60"/>
+              <w:right w:type="dxa" w:w="90"/>
+            </w:tcMar>
+          </w:tcPr>
+          <w:p>
+            <w:pPr>
+              <w:spacing w:after="20"/>
+            </w:pPr>
+            <w:r>
+              <w:rPr>
+                <w:rFonts w:ascii="Arial" w:cs="Arial" w:eastAsia="Arial" w:hAnsi="Arial"/>
+                <w:b w:val="false"/>
+                <w:bCs w:val="false"/>
+                <w:sz w:val="18"/>
+                <w:szCs w:val="18"/>
+              </w:rPr>
+              <w:t xml:space="preserve">DELETE</w:t>
+            </w:r>
+          </w:p>
+        </w:tc>
+        <w:tc>
+          <w:tcPr>
+            <w:tcW w:type="dxa" w:w="5400"/>
+            <w:tcBorders>
+              <w:top w:val="single" w:color="BFBFBF" w:sz="4"/>
+              <w:left w:val="single" w:color="BFBFBF" w:sz="4"/>
+              <w:bottom w:val="single" w:color="BFBFBF" w:sz="4"/>
+              <w:right w:val="single" w:color="BFBFBF" w:sz="4"/>
+            </w:tcBorders>
+            <w:tcMar>
+              <w:top w:type="dxa" w:w="60"/>
+              <w:left w:type="dxa" w:w="90"/>
+              <w:bottom w:type="dxa" w:w="60"/>
+              <w:right w:type="dxa" w:w="90"/>
+            </w:tcMar>
+          </w:tcPr>
+          <w:p>
+            <w:pPr>
+              <w:spacing w:after="20"/>
+            </w:pPr>
+            <w:r>
+              <w:rPr>
+                <w:rFonts w:ascii="Arial" w:cs="Arial" w:eastAsia="Arial" w:hAnsi="Arial"/>
+                <w:b w:val="false"/>
+                <w:bCs w:val="false"/>
+                <w:sz w:val="18"/>
+                <w:szCs w:val="18"/>
+              </w:rPr>
+              <w:t xml:space="preserve">/api/khuyen-mai/:ma/san-pham/:ma_san_pham</w:t>
+            </w:r>
+          </w:p>
+        </w:tc>
+        <w:tc>
+          <w:tcPr>
+            <w:tcW w:type="dxa" w:w="4878"/>
+            <w:tcBorders>
+              <w:top w:val="single" w:color="BFBFBF" w:sz="4"/>
+              <w:left w:val="single" w:color="BFBFBF" w:sz="4"/>
+              <w:bottom w:val="single" w:color="BFBFBF" w:sz="4"/>
+              <w:right w:val="single" w:color="BFBFBF" w:sz="4"/>
+            </w:tcBorders>
+            <w:tcMar>
+              <w:top w:type="dxa" w:w="60"/>
+              <w:left w:type="dxa" w:w="90"/>
+              <w:bottom w:type="dxa" w:w="60"/>
+              <w:right w:type="dxa" w:w="90"/>
+            </w:tcMar>
+          </w:tcPr>
+          <w:p>
+            <w:pPr>
+              <w:spacing w:after="20"/>
+            </w:pPr>
+            <w:r>
+              <w:rPr>
+                <w:rFonts w:ascii="Arial" w:cs="Arial" w:eastAsia="Arial" w:hAnsi="Arial"/>
+                <w:b w:val="false"/>
+                <w:bCs w:val="false"/>
+                <w:sz w:val="18"/>
+                <w:szCs w:val="18"/>
+              </w:rPr>
+              <w:t xml:space="preserve">KM-05 gỡ sản phẩm khỏi khuyến mãi</w:t>
+            </w:r>
+          </w:p>
+        </w:tc>
+        <w:tc>
+          <w:tcPr>
+            <w:tcW w:type="dxa" w:w="2600"/>
+            <w:tcBorders>
+              <w:top w:val="single" w:color="BFBFBF" w:sz="4"/>
+              <w:left w:val="single" w:color="BFBFBF" w:sz="4"/>
+              <w:bottom w:val="single" w:color="BFBFBF" w:sz="4"/>
+              <w:right w:val="single" w:color="BFBFBF" w:sz="4"/>
+            </w:tcBorders>
+            <w:tcMar>
+              <w:top w:type="dxa" w:w="60"/>
+              <w:left w:type="dxa" w:w="90"/>
+              <w:bottom w:type="dxa" w:w="60"/>
+              <w:right w:type="dxa" w:w="90"/>
+            </w:tcMar>
+          </w:tcPr>
+          <w:p>
+            <w:pPr>
+              <w:spacing w:after="20"/>
+            </w:pPr>
+            <w:r>
+              <w:rPr>
+                <w:rFonts w:ascii="Arial" w:cs="Arial" w:eastAsia="Arial" w:hAnsi="Arial"/>
+                <w:b w:val="false"/>
+                <w:bCs w:val="false"/>
+                <w:sz w:val="18"/>
+                <w:szCs w:val="18"/>
+              </w:rPr>
+              <w:t xml:space="preserve">A/Q</w:t>
+            </w:r>
+          </w:p>
+        </w:tc>
+      </w:tr>
+      <w:tr>
+        <w:trPr>
+          <w:cantSplit/>
+        </w:trPr>
+        <w:tc>
+          <w:tcPr>
+            <w:tcW w:type="dxa" w:w="1800"/>
+            <w:tcBorders>
+              <w:top w:val="single" w:color="BFBFBF" w:sz="4"/>
+              <w:left w:val="single" w:color="BFBFBF" w:sz="4"/>
+              <w:bottom w:val="single" w:color="BFBFBF" w:sz="4"/>
+              <w:right w:val="single" w:color="BFBFBF" w:sz="4"/>
+            </w:tcBorders>
+            <w:tcMar>
+              <w:top w:type="dxa" w:w="60"/>
+              <w:left w:type="dxa" w:w="90"/>
+              <w:bottom w:type="dxa" w:w="60"/>
+              <w:right w:type="dxa" w:w="90"/>
+            </w:tcMar>
+          </w:tcPr>
+          <w:p>
+            <w:pPr>
+              <w:spacing w:after="20"/>
+            </w:pPr>
+            <w:r>
+              <w:rPr>
+                <w:rFonts w:ascii="Arial" w:cs="Arial" w:eastAsia="Arial" w:hAnsi="Arial"/>
+                <w:b w:val="false"/>
+                <w:bCs w:val="false"/>
+                <w:sz w:val="18"/>
+                <w:szCs w:val="18"/>
+              </w:rPr>
+              <w:t xml:space="preserve">POST, GET</w:t>
+            </w:r>
+          </w:p>
+        </w:tc>
+        <w:tc>
+          <w:tcPr>
+            <w:tcW w:type="dxa" w:w="5400"/>
+            <w:tcBorders>
+              <w:top w:val="single" w:color="BFBFBF" w:sz="4"/>
+              <w:left w:val="single" w:color="BFBFBF" w:sz="4"/>
+              <w:bottom w:val="single" w:color="BFBFBF" w:sz="4"/>
+              <w:right w:val="single" w:color="BFBFBF" w:sz="4"/>
+            </w:tcBorders>
+            <w:tcMar>
+              <w:top w:type="dxa" w:w="60"/>
+              <w:left w:type="dxa" w:w="90"/>
+              <w:bottom w:type="dxa" w:w="60"/>
+              <w:right w:type="dxa" w:w="90"/>
+            </w:tcMar>
+          </w:tcPr>
+          <w:p>
+            <w:pPr>
+              <w:spacing w:after="20"/>
+            </w:pPr>
+            <w:r>
+              <w:rPr>
+                <w:rFonts w:ascii="Arial" w:cs="Arial" w:eastAsia="Arial" w:hAnsi="Arial"/>
+                <w:b w:val="false"/>
+                <w:bCs w:val="false"/>
+                <w:sz w:val="18"/>
+                <w:szCs w:val="18"/>
+              </w:rPr>
+              <w:t xml:space="preserve">/api/kho/nguyen-lieu</w:t>
+            </w:r>
+          </w:p>
+        </w:tc>
+        <w:tc>
+          <w:tcPr>
+            <w:tcW w:type="dxa" w:w="4878"/>
+            <w:tcBorders>
+              <w:top w:val="single" w:color="BFBFBF" w:sz="4"/>
+              <w:left w:val="single" w:color="BFBFBF" w:sz="4"/>
+              <w:bottom w:val="single" w:color="BFBFBF" w:sz="4"/>
+              <w:right w:val="single" w:color="BFBFBF" w:sz="4"/>
+            </w:tcBorders>
+            <w:tcMar>
+              <w:top w:type="dxa" w:w="60"/>
+              <w:left w:type="dxa" w:w="90"/>
+              <w:bottom w:type="dxa" w:w="60"/>
+              <w:right w:type="dxa" w:w="90"/>
+            </w:tcMar>
+          </w:tcPr>
+          <w:p>
+            <w:pPr>
+              <w:spacing w:after="20"/>
+            </w:pPr>
+            <w:r>
+              <w:rPr>
+                <w:rFonts w:ascii="Arial" w:cs="Arial" w:eastAsia="Arial" w:hAnsi="Arial"/>
+                <w:b w:val="false"/>
+                <w:bCs w:val="false"/>
+                <w:sz w:val="18"/>
+                <w:szCs w:val="18"/>
+              </w:rPr>
+              <w:t xml:space="preserve">KHO-01 tạo, danh sách nguyên liệu (tu_khoa, trang, moi_trang)</w:t>
+            </w:r>
+          </w:p>
+        </w:tc>
+        <w:tc>
+          <w:tcPr>
+            <w:tcW w:type="dxa" w:w="2600"/>
+            <w:tcBorders>
+              <w:top w:val="single" w:color="BFBFBF" w:sz="4"/>
+              <w:left w:val="single" w:color="BFBFBF" w:sz="4"/>
+              <w:bottom w:val="single" w:color="BFBFBF" w:sz="4"/>
+              <w:right w:val="single" w:color="BFBFBF" w:sz="4"/>
+            </w:tcBorders>
+            <w:tcMar>
+              <w:top w:type="dxa" w:w="60"/>
+              <w:left w:type="dxa" w:w="90"/>
+              <w:bottom w:type="dxa" w:w="60"/>
+              <w:right w:type="dxa" w:w="90"/>
+            </w:tcMar>
+          </w:tcPr>
+          <w:p>
+            <w:pPr>
+              <w:spacing w:after="20"/>
+            </w:pPr>
+            <w:r>
+              <w:rPr>
+                <w:rFonts w:ascii="Arial" w:cs="Arial" w:eastAsia="Arial" w:hAnsi="Arial"/>
+                <w:b w:val="false"/>
+                <w:bCs w:val="false"/>
+                <w:sz w:val="18"/>
+                <w:szCs w:val="18"/>
+              </w:rPr>
+              <w:t xml:space="preserve">A/Q</w:t>
+            </w:r>
+          </w:p>
+        </w:tc>
+      </w:tr>
+      <w:tr>
+        <w:trPr>
+          <w:cantSplit/>
+        </w:trPr>
+        <w:tc>
+          <w:tcPr>
+            <w:tcW w:type="dxa" w:w="1800"/>
+            <w:tcBorders>
+              <w:top w:val="single" w:color="BFBFBF" w:sz="4"/>
+              <w:left w:val="single" w:color="BFBFBF" w:sz="4"/>
+              <w:bottom w:val="single" w:color="BFBFBF" w:sz="4"/>
+              <w:right w:val="single" w:color="BFBFBF" w:sz="4"/>
+            </w:tcBorders>
+            <w:tcMar>
+              <w:top w:type="dxa" w:w="60"/>
+              <w:left w:type="dxa" w:w="90"/>
+              <w:bottom w:type="dxa" w:w="60"/>
+              <w:right w:type="dxa" w:w="90"/>
+            </w:tcMar>
+          </w:tcPr>
+          <w:p>
+            <w:pPr>
+              <w:spacing w:after="20"/>
+            </w:pPr>
+            <w:r>
+              <w:rPr>
+                <w:rFonts w:ascii="Arial" w:cs="Arial" w:eastAsia="Arial" w:hAnsi="Arial"/>
+                <w:b w:val="false"/>
+                <w:bCs w:val="false"/>
+                <w:sz w:val="18"/>
+                <w:szCs w:val="18"/>
+              </w:rPr>
+              <w:t xml:space="preserve">GET, PATCH, DELETE</w:t>
+            </w:r>
+          </w:p>
+        </w:tc>
+        <w:tc>
+          <w:tcPr>
+            <w:tcW w:type="dxa" w:w="5400"/>
+            <w:tcBorders>
+              <w:top w:val="single" w:color="BFBFBF" w:sz="4"/>
+              <w:left w:val="single" w:color="BFBFBF" w:sz="4"/>
+              <w:bottom w:val="single" w:color="BFBFBF" w:sz="4"/>
+              <w:right w:val="single" w:color="BFBFBF" w:sz="4"/>
+            </w:tcBorders>
+            <w:tcMar>
+              <w:top w:type="dxa" w:w="60"/>
+              <w:left w:type="dxa" w:w="90"/>
+              <w:bottom w:type="dxa" w:w="60"/>
+              <w:right w:type="dxa" w:w="90"/>
+            </w:tcMar>
+          </w:tcPr>
+          <w:p>
+            <w:pPr>
+              <w:spacing w:after="20"/>
+            </w:pPr>
+            <w:r>
+              <w:rPr>
+                <w:rFonts w:ascii="Arial" w:cs="Arial" w:eastAsia="Arial" w:hAnsi="Arial"/>
+                <w:b w:val="false"/>
+                <w:bCs w:val="false"/>
+                <w:sz w:val="18"/>
+                <w:szCs w:val="18"/>
+              </w:rPr>
+              <w:t xml:space="preserve">/api/kho/nguyen-lieu/:ma</w:t>
+            </w:r>
+          </w:p>
+        </w:tc>
+        <w:tc>
+          <w:tcPr>
+            <w:tcW w:type="dxa" w:w="4878"/>
+            <w:tcBorders>
+              <w:top w:val="single" w:color="BFBFBF" w:sz="4"/>
+              <w:left w:val="single" w:color="BFBFBF" w:sz="4"/>
+              <w:bottom w:val="single" w:color="BFBFBF" w:sz="4"/>
+              <w:right w:val="single" w:color="BFBFBF" w:sz="4"/>
+            </w:tcBorders>
+            <w:tcMar>
+              <w:top w:type="dxa" w:w="60"/>
+              <w:left w:type="dxa" w:w="90"/>
+              <w:bottom w:type="dxa" w:w="60"/>
+              <w:right w:type="dxa" w:w="90"/>
+            </w:tcMar>
+          </w:tcPr>
+          <w:p>
+            <w:pPr>
+              <w:spacing w:after="20"/>
+            </w:pPr>
+            <w:r>
+              <w:rPr>
+                <w:rFonts w:ascii="Arial" w:cs="Arial" w:eastAsia="Arial" w:hAnsi="Arial"/>
+                <w:b w:val="false"/>
+                <w:bCs w:val="false"/>
+                <w:sz w:val="18"/>
+                <w:szCs w:val="18"/>
+              </w:rPr>
+              <w:t xml:space="preserve">KHO-01 xem, sửa, xóa nguyên liệu</w:t>
+            </w:r>
+          </w:p>
+        </w:tc>
+        <w:tc>
+          <w:tcPr>
+            <w:tcW w:type="dxa" w:w="2600"/>
+            <w:tcBorders>
+              <w:top w:val="single" w:color="BFBFBF" w:sz="4"/>
+              <w:left w:val="single" w:color="BFBFBF" w:sz="4"/>
+              <w:bottom w:val="single" w:color="BFBFBF" w:sz="4"/>
+              <w:right w:val="single" w:color="BFBFBF" w:sz="4"/>
+            </w:tcBorders>
+            <w:tcMar>
+              <w:top w:type="dxa" w:w="60"/>
+              <w:left w:type="dxa" w:w="90"/>
+              <w:bottom w:type="dxa" w:w="60"/>
+              <w:right w:type="dxa" w:w="90"/>
+            </w:tcMar>
+          </w:tcPr>
+          <w:p>
+            <w:pPr>
+              <w:spacing w:after="20"/>
+            </w:pPr>
+            <w:r>
+              <w:rPr>
+                <w:rFonts w:ascii="Arial" w:cs="Arial" w:eastAsia="Arial" w:hAnsi="Arial"/>
+                <w:b w:val="false"/>
+                <w:bCs w:val="false"/>
+                <w:sz w:val="18"/>
+                <w:szCs w:val="18"/>
+              </w:rPr>
+              <w:t xml:space="preserve">A/Q</w:t>
+            </w:r>
+          </w:p>
+        </w:tc>
+      </w:tr>
+      <w:tr>
+        <w:trPr>
+          <w:cantSplit/>
+        </w:trPr>
+        <w:tc>
+          <w:tcPr>
+            <w:tcW w:type="dxa" w:w="1800"/>
+            <w:tcBorders>
+              <w:top w:val="single" w:color="BFBFBF" w:sz="4"/>
+              <w:left w:val="single" w:color="BFBFBF" w:sz="4"/>
+              <w:bottom w:val="single" w:color="BFBFBF" w:sz="4"/>
+              <w:right w:val="single" w:color="BFBFBF" w:sz="4"/>
+            </w:tcBorders>
+            <w:tcMar>
+              <w:top w:type="dxa" w:w="60"/>
+              <w:left w:type="dxa" w:w="90"/>
+              <w:bottom w:type="dxa" w:w="60"/>
+              <w:right w:type="dxa" w:w="90"/>
+            </w:tcMar>
+          </w:tcPr>
+          <w:p>
+            <w:pPr>
+              <w:spacing w:after="20"/>
+            </w:pPr>
+            <w:r>
+              <w:rPr>
+                <w:rFonts w:ascii="Arial" w:cs="Arial" w:eastAsia="Arial" w:hAnsi="Arial"/>
+                <w:b w:val="false"/>
+                <w:bCs w:val="false"/>
+                <w:sz w:val="18"/>
+                <w:szCs w:val="18"/>
+              </w:rPr>
+              <w:t xml:space="preserve">POST, GET</w:t>
+            </w:r>
+          </w:p>
+        </w:tc>
+        <w:tc>
+          <w:tcPr>
+            <w:tcW w:type="dxa" w:w="5400"/>
+            <w:tcBorders>
+              <w:top w:val="single" w:color="BFBFBF" w:sz="4"/>
+              <w:left w:val="single" w:color="BFBFBF" w:sz="4"/>
+              <w:bottom w:val="single" w:color="BFBFBF" w:sz="4"/>
+              <w:right w:val="single" w:color="BFBFBF" w:sz="4"/>
+            </w:tcBorders>
+            <w:tcMar>
+              <w:top w:type="dxa" w:w="60"/>
+              <w:left w:type="dxa" w:w="90"/>
+              <w:bottom w:type="dxa" w:w="60"/>
+              <w:right w:type="dxa" w:w="90"/>
+            </w:tcMar>
+          </w:tcPr>
+          <w:p>
+            <w:pPr>
+              <w:spacing w:after="20"/>
+            </w:pPr>
+            <w:r>
+              <w:rPr>
+                <w:rFonts w:ascii="Arial" w:cs="Arial" w:eastAsia="Arial" w:hAnsi="Arial"/>
+                <w:b w:val="false"/>
+                <w:bCs w:val="false"/>
+                <w:sz w:val="18"/>
+                <w:szCs w:val="18"/>
+              </w:rPr>
+              <w:t xml:space="preserve">/api/kho/nha-cung-cap</w:t>
+            </w:r>
+          </w:p>
+        </w:tc>
+        <w:tc>
+          <w:tcPr>
+            <w:tcW w:type="dxa" w:w="4878"/>
+            <w:tcBorders>
+              <w:top w:val="single" w:color="BFBFBF" w:sz="4"/>
+              <w:left w:val="single" w:color="BFBFBF" w:sz="4"/>
+              <w:bottom w:val="single" w:color="BFBFBF" w:sz="4"/>
+              <w:right w:val="single" w:color="BFBFBF" w:sz="4"/>
+            </w:tcBorders>
+            <w:tcMar>
+              <w:top w:type="dxa" w:w="60"/>
+              <w:left w:type="dxa" w:w="90"/>
+              <w:bottom w:type="dxa" w:w="60"/>
+              <w:right w:type="dxa" w:w="90"/>
+            </w:tcMar>
+          </w:tcPr>
+          <w:p>
+            <w:pPr>
+              <w:spacing w:after="20"/>
+            </w:pPr>
+            <w:r>
+              <w:rPr>
+                <w:rFonts w:ascii="Arial" w:cs="Arial" w:eastAsia="Arial" w:hAnsi="Arial"/>
+                <w:b w:val="false"/>
+                <w:bCs w:val="false"/>
+                <w:sz w:val="18"/>
+                <w:szCs w:val="18"/>
+              </w:rPr>
+              <w:t xml:space="preserve">KHO-02 tạo, danh sách nhà cung cấp (tu_khoa, trang, moi_trang)</w:t>
+            </w:r>
+          </w:p>
+        </w:tc>
+        <w:tc>
+          <w:tcPr>
+            <w:tcW w:type="dxa" w:w="2600"/>
+            <w:tcBorders>
+              <w:top w:val="single" w:color="BFBFBF" w:sz="4"/>
+              <w:left w:val="single" w:color="BFBFBF" w:sz="4"/>
+              <w:bottom w:val="single" w:color="BFBFBF" w:sz="4"/>
+              <w:right w:val="single" w:color="BFBFBF" w:sz="4"/>
+            </w:tcBorders>
+            <w:tcMar>
+              <w:top w:type="dxa" w:w="60"/>
+              <w:left w:type="dxa" w:w="90"/>
+              <w:bottom w:type="dxa" w:w="60"/>
+              <w:right w:type="dxa" w:w="90"/>
+            </w:tcMar>
+          </w:tcPr>
+          <w:p>
+            <w:pPr>
+              <w:spacing w:after="20"/>
+            </w:pPr>
+            <w:r>
+              <w:rPr>
+                <w:rFonts w:ascii="Arial" w:cs="Arial" w:eastAsia="Arial" w:hAnsi="Arial"/>
+                <w:b w:val="false"/>
+                <w:bCs w:val="false"/>
+                <w:sz w:val="18"/>
+                <w:szCs w:val="18"/>
+              </w:rPr>
+              <w:t xml:space="preserve">A/Q</w:t>
+            </w:r>
+          </w:p>
+        </w:tc>
+      </w:tr>
+      <w:tr>
+        <w:trPr>
+          <w:cantSplit/>
+        </w:trPr>
+        <w:tc>
+          <w:tcPr>
+            <w:tcW w:type="dxa" w:w="1800"/>
+            <w:tcBorders>
+              <w:top w:val="single" w:color="BFBFBF" w:sz="4"/>
+              <w:left w:val="single" w:color="BFBFBF" w:sz="4"/>
+              <w:bottom w:val="single" w:color="BFBFBF" w:sz="4"/>
+              <w:right w:val="single" w:color="BFBFBF" w:sz="4"/>
+            </w:tcBorders>
+            <w:tcMar>
+              <w:top w:type="dxa" w:w="60"/>
+              <w:left w:type="dxa" w:w="90"/>
+              <w:bottom w:type="dxa" w:w="60"/>
+              <w:right w:type="dxa" w:w="90"/>
+            </w:tcMar>
+          </w:tcPr>
+          <w:p>
+            <w:pPr>
+              <w:spacing w:after="20"/>
+            </w:pPr>
+            <w:r>
+              <w:rPr>
+                <w:rFonts w:ascii="Arial" w:cs="Arial" w:eastAsia="Arial" w:hAnsi="Arial"/>
+                <w:b w:val="false"/>
+                <w:bCs w:val="false"/>
+                <w:sz w:val="18"/>
+                <w:szCs w:val="18"/>
+              </w:rPr>
+              <w:t xml:space="preserve">GET, PATCH, DELETE</w:t>
+            </w:r>
+          </w:p>
+        </w:tc>
+        <w:tc>
+          <w:tcPr>
+            <w:tcW w:type="dxa" w:w="5400"/>
+            <w:tcBorders>
+              <w:top w:val="single" w:color="BFBFBF" w:sz="4"/>
+              <w:left w:val="single" w:color="BFBFBF" w:sz="4"/>
+              <w:bottom w:val="single" w:color="BFBFBF" w:sz="4"/>
+              <w:right w:val="single" w:color="BFBFBF" w:sz="4"/>
+            </w:tcBorders>
+            <w:tcMar>
+              <w:top w:type="dxa" w:w="60"/>
+              <w:left w:type="dxa" w:w="90"/>
+              <w:bottom w:type="dxa" w:w="60"/>
+              <w:right w:type="dxa" w:w="90"/>
+            </w:tcMar>
+          </w:tcPr>
+          <w:p>
+            <w:pPr>
+              <w:spacing w:after="20"/>
+            </w:pPr>
+            <w:r>
+              <w:rPr>
+                <w:rFonts w:ascii="Arial" w:cs="Arial" w:eastAsia="Arial" w:hAnsi="Arial"/>
+                <w:b w:val="false"/>
+                <w:bCs w:val="false"/>
+                <w:sz w:val="18"/>
+                <w:szCs w:val="18"/>
+              </w:rPr>
+              <w:t xml:space="preserve">/api/kho/nha-cung-cap/:ma</w:t>
+            </w:r>
+          </w:p>
+        </w:tc>
+        <w:tc>
+          <w:tcPr>
+            <w:tcW w:type="dxa" w:w="4878"/>
+            <w:tcBorders>
+              <w:top w:val="single" w:color="BFBFBF" w:sz="4"/>
+              <w:left w:val="single" w:color="BFBFBF" w:sz="4"/>
+              <w:bottom w:val="single" w:color="BFBFBF" w:sz="4"/>
+              <w:right w:val="single" w:color="BFBFBF" w:sz="4"/>
+            </w:tcBorders>
+            <w:tcMar>
+              <w:top w:type="dxa" w:w="60"/>
+              <w:left w:type="dxa" w:w="90"/>
+              <w:bottom w:type="dxa" w:w="60"/>
+              <w:right w:type="dxa" w:w="90"/>
+            </w:tcMar>
+          </w:tcPr>
+          <w:p>
+            <w:pPr>
+              <w:spacing w:after="20"/>
+            </w:pPr>
+            <w:r>
+              <w:rPr>
+                <w:rFonts w:ascii="Arial" w:cs="Arial" w:eastAsia="Arial" w:hAnsi="Arial"/>
+                <w:b w:val="false"/>
+                <w:bCs w:val="false"/>
+                <w:sz w:val="18"/>
+                <w:szCs w:val="18"/>
+              </w:rPr>
+              <w:t xml:space="preserve">KHO-02 xem, sửa, xóa nhà cung cấp</w:t>
+            </w:r>
+          </w:p>
+        </w:tc>
+        <w:tc>
+          <w:tcPr>
+            <w:tcW w:type="dxa" w:w="2600"/>
+            <w:tcBorders>
+              <w:top w:val="single" w:color="BFBFBF" w:sz="4"/>
+              <w:left w:val="single" w:color="BFBFBF" w:sz="4"/>
+              <w:bottom w:val="single" w:color="BFBFBF" w:sz="4"/>
+              <w:right w:val="single" w:color="BFBFBF" w:sz="4"/>
+            </w:tcBorders>
+            <w:tcMar>
+              <w:top w:type="dxa" w:w="60"/>
+              <w:left w:type="dxa" w:w="90"/>
+              <w:bottom w:type="dxa" w:w="60"/>
+              <w:right w:type="dxa" w:w="90"/>
+            </w:tcMar>
+          </w:tcPr>
+          <w:p>
+            <w:pPr>
+              <w:spacing w:after="20"/>
+            </w:pPr>
+            <w:r>
+              <w:rPr>
+                <w:rFonts w:ascii="Arial" w:cs="Arial" w:eastAsia="Arial" w:hAnsi="Arial"/>
+                <w:b w:val="false"/>
+                <w:bCs w:val="false"/>
+                <w:sz w:val="18"/>
+                <w:szCs w:val="18"/>
+              </w:rPr>
+              <w:t xml:space="preserve">A/Q</w:t>
+            </w:r>
+          </w:p>
+        </w:tc>
+      </w:tr>
+      <w:tr>
+        <w:trPr>
+          <w:cantSplit/>
+        </w:trPr>
+        <w:tc>
+          <w:tcPr>
+            <w:tcW w:type="dxa" w:w="1800"/>
+            <w:tcBorders>
+              <w:top w:val="single" w:color="BFBFBF" w:sz="4"/>
+              <w:left w:val="single" w:color="BFBFBF" w:sz="4"/>
+              <w:bottom w:val="single" w:color="BFBFBF" w:sz="4"/>
+              <w:right w:val="single" w:color="BFBFBF" w:sz="4"/>
+            </w:tcBorders>
+            <w:tcMar>
+              <w:top w:type="dxa" w:w="60"/>
+              <w:left w:type="dxa" w:w="90"/>
+              <w:bottom w:type="dxa" w:w="60"/>
+              <w:right w:type="dxa" w:w="90"/>
+            </w:tcMar>
+          </w:tcPr>
+          <w:p>
+            <w:pPr>
+              <w:spacing w:after="20"/>
+            </w:pPr>
+            <w:r>
+              <w:rPr>
+                <w:rFonts w:ascii="Arial" w:cs="Arial" w:eastAsia="Arial" w:hAnsi="Arial"/>
+                <w:b w:val="false"/>
+                <w:bCs w:val="false"/>
+                <w:sz w:val="18"/>
+                <w:szCs w:val="18"/>
+              </w:rPr>
+              <w:t xml:space="preserve">GET, PUT</w:t>
+            </w:r>
+          </w:p>
+        </w:tc>
+        <w:tc>
+          <w:tcPr>
+            <w:tcW w:type="dxa" w:w="5400"/>
+            <w:tcBorders>
+              <w:top w:val="single" w:color="BFBFBF" w:sz="4"/>
+              <w:left w:val="single" w:color="BFBFBF" w:sz="4"/>
+              <w:bottom w:val="single" w:color="BFBFBF" w:sz="4"/>
+              <w:right w:val="single" w:color="BFBFBF" w:sz="4"/>
+            </w:tcBorders>
+            <w:tcMar>
+              <w:top w:type="dxa" w:w="60"/>
+              <w:left w:type="dxa" w:w="90"/>
+              <w:bottom w:type="dxa" w:w="60"/>
+              <w:right w:type="dxa" w:w="90"/>
+            </w:tcMar>
+          </w:tcPr>
+          <w:p>
+            <w:pPr>
+              <w:spacing w:after="20"/>
+            </w:pPr>
+            <w:r>
+              <w:rPr>
+                <w:rFonts w:ascii="Arial" w:cs="Arial" w:eastAsia="Arial" w:hAnsi="Arial"/>
+                <w:b w:val="false"/>
+                <w:bCs w:val="false"/>
+                <w:sz w:val="18"/>
+                <w:szCs w:val="18"/>
+              </w:rPr>
+              <w:t xml:space="preserve">/api/kho/cong-thuc/:ma</w:t>
+            </w:r>
+          </w:p>
+        </w:tc>
+        <w:tc>
+          <w:tcPr>
+            <w:tcW w:type="dxa" w:w="4878"/>
+            <w:tcBorders>
+              <w:top w:val="single" w:color="BFBFBF" w:sz="4"/>
+              <w:left w:val="single" w:color="BFBFBF" w:sz="4"/>
+              <w:bottom w:val="single" w:color="BFBFBF" w:sz="4"/>
+              <w:right w:val="single" w:color="BFBFBF" w:sz="4"/>
+            </w:tcBorders>
+            <w:tcMar>
+              <w:top w:type="dxa" w:w="60"/>
+              <w:left w:type="dxa" w:w="90"/>
+              <w:bottom w:type="dxa" w:w="60"/>
+              <w:right w:type="dxa" w:w="90"/>
+            </w:tcMar>
+          </w:tcPr>
+          <w:p>
+            <w:pPr>
+              <w:spacing w:after="20"/>
+            </w:pPr>
+            <w:r>
+              <w:rPr>
+                <w:rFonts w:ascii="Arial" w:cs="Arial" w:eastAsia="Arial" w:hAnsi="Arial"/>
+                <w:b w:val="false"/>
+                <w:bCs w:val="false"/>
+                <w:sz w:val="18"/>
+                <w:szCs w:val="18"/>
+              </w:rPr>
+              <w:t xml:space="preserve">KHO-03 xem, đặt (thay toàn bộ) công thức của sản phẩm</w:t>
+            </w:r>
+          </w:p>
+        </w:tc>
+        <w:tc>
+          <w:tcPr>
+            <w:tcW w:type="dxa" w:w="2600"/>
+            <w:tcBorders>
+              <w:top w:val="single" w:color="BFBFBF" w:sz="4"/>
+              <w:left w:val="single" w:color="BFBFBF" w:sz="4"/>
+              <w:bottom w:val="single" w:color="BFBFBF" w:sz="4"/>
+              <w:right w:val="single" w:color="BFBFBF" w:sz="4"/>
+            </w:tcBorders>
+            <w:tcMar>
+              <w:top w:type="dxa" w:w="60"/>
+              <w:left w:type="dxa" w:w="90"/>
+              <w:bottom w:type="dxa" w:w="60"/>
+              <w:right w:type="dxa" w:w="90"/>
+            </w:tcMar>
+          </w:tcPr>
+          <w:p>
+            <w:pPr>
+              <w:spacing w:after="20"/>
+            </w:pPr>
+            <w:r>
+              <w:rPr>
+                <w:rFonts w:ascii="Arial" w:cs="Arial" w:eastAsia="Arial" w:hAnsi="Arial"/>
+                <w:b w:val="false"/>
+                <w:bCs w:val="false"/>
+                <w:sz w:val="18"/>
+                <w:szCs w:val="18"/>
+              </w:rPr>
+              <w:t xml:space="preserve">A/Q</w:t>
+            </w:r>
+          </w:p>
+        </w:tc>
+      </w:tr>
+      <w:tr>
+        <w:trPr>
+          <w:cantSplit/>
+        </w:trPr>
+        <w:tc>
+          <w:tcPr>
+            <w:tcW w:type="dxa" w:w="1800"/>
+            <w:tcBorders>
+              <w:top w:val="single" w:color="BFBFBF" w:sz="4"/>
+              <w:left w:val="single" w:color="BFBFBF" w:sz="4"/>
+              <w:bottom w:val="single" w:color="BFBFBF" w:sz="4"/>
+              <w:right w:val="single" w:color="BFBFBF" w:sz="4"/>
+            </w:tcBorders>
+            <w:tcMar>
+              <w:top w:type="dxa" w:w="60"/>
+              <w:left w:type="dxa" w:w="90"/>
+              <w:bottom w:type="dxa" w:w="60"/>
+              <w:right w:type="dxa" w:w="90"/>
+            </w:tcMar>
+          </w:tcPr>
+          <w:p>
+            <w:pPr>
+              <w:spacing w:after="20"/>
+            </w:pPr>
+            <w:r>
+              <w:rPr>
+                <w:rFonts w:ascii="Arial" w:cs="Arial" w:eastAsia="Arial" w:hAnsi="Arial"/>
+                <w:b w:val="false"/>
+                <w:bCs w:val="false"/>
+                <w:sz w:val="18"/>
+                <w:szCs w:val="18"/>
+              </w:rPr>
+              <w:t xml:space="preserve">POST, GET</w:t>
+            </w:r>
+          </w:p>
+        </w:tc>
+        <w:tc>
+          <w:tcPr>
+            <w:tcW w:type="dxa" w:w="5400"/>
+            <w:tcBorders>
+              <w:top w:val="single" w:color="BFBFBF" w:sz="4"/>
+              <w:left w:val="single" w:color="BFBFBF" w:sz="4"/>
+              <w:bottom w:val="single" w:color="BFBFBF" w:sz="4"/>
+              <w:right w:val="single" w:color="BFBFBF" w:sz="4"/>
+            </w:tcBorders>
+            <w:tcMar>
+              <w:top w:type="dxa" w:w="60"/>
+              <w:left w:type="dxa" w:w="90"/>
+              <w:bottom w:type="dxa" w:w="60"/>
+              <w:right w:type="dxa" w:w="90"/>
+            </w:tcMar>
+          </w:tcPr>
+          <w:p>
+            <w:pPr>
+              <w:spacing w:after="20"/>
+            </w:pPr>
+            <w:r>
+              <w:rPr>
+                <w:rFonts w:ascii="Arial" w:cs="Arial" w:eastAsia="Arial" w:hAnsi="Arial"/>
+                <w:b w:val="false"/>
+                <w:bCs w:val="false"/>
+                <w:sz w:val="18"/>
+                <w:szCs w:val="18"/>
+              </w:rPr>
+              <w:t xml:space="preserve">/api/kho/phieu-nhap</w:t>
+            </w:r>
+          </w:p>
+        </w:tc>
+        <w:tc>
+          <w:tcPr>
+            <w:tcW w:type="dxa" w:w="4878"/>
+            <w:tcBorders>
+              <w:top w:val="single" w:color="BFBFBF" w:sz="4"/>
+              <w:left w:val="single" w:color="BFBFBF" w:sz="4"/>
+              <w:bottom w:val="single" w:color="BFBFBF" w:sz="4"/>
+              <w:right w:val="single" w:color="BFBFBF" w:sz="4"/>
+            </w:tcBorders>
+            <w:tcMar>
+              <w:top w:type="dxa" w:w="60"/>
+              <w:left w:type="dxa" w:w="90"/>
+              <w:bottom w:type="dxa" w:w="60"/>
+              <w:right w:type="dxa" w:w="90"/>
+            </w:tcMar>
+          </w:tcPr>
+          <w:p>
+            <w:pPr>
+              <w:spacing w:after="20"/>
+            </w:pPr>
+            <w:r>
+              <w:rPr>
+                <w:rFonts w:ascii="Arial" w:cs="Arial" w:eastAsia="Arial" w:hAnsi="Arial"/>
+                <w:b w:val="false"/>
+                <w:bCs w:val="false"/>
+                <w:sz w:val="18"/>
+                <w:szCs w:val="18"/>
+              </w:rPr>
+              <w:t xml:space="preserve">KHO-04 lập phiếu nhập, KHO-05 lịch sử nhập (tu_ngay, den_ngay, ma_ncc)</w:t>
+            </w:r>
+          </w:p>
+        </w:tc>
+        <w:tc>
+          <w:tcPr>
+            <w:tcW w:type="dxa" w:w="2600"/>
+            <w:tcBorders>
+              <w:top w:val="single" w:color="BFBFBF" w:sz="4"/>
+              <w:left w:val="single" w:color="BFBFBF" w:sz="4"/>
+              <w:bottom w:val="single" w:color="BFBFBF" w:sz="4"/>
+              <w:right w:val="single" w:color="BFBFBF" w:sz="4"/>
+            </w:tcBorders>
+            <w:tcMar>
+              <w:top w:type="dxa" w:w="60"/>
+              <w:left w:type="dxa" w:w="90"/>
+              <w:bottom w:type="dxa" w:w="60"/>
+              <w:right w:type="dxa" w:w="90"/>
+            </w:tcMar>
+          </w:tcPr>
+          <w:p>
+            <w:pPr>
+              <w:spacing w:after="20"/>
+            </w:pPr>
+            <w:r>
+              <w:rPr>
+                <w:rFonts w:ascii="Arial" w:cs="Arial" w:eastAsia="Arial" w:hAnsi="Arial"/>
+                <w:b w:val="false"/>
+                <w:bCs w:val="false"/>
+                <w:sz w:val="18"/>
+                <w:szCs w:val="18"/>
+              </w:rPr>
+              <w:t xml:space="preserve">A/Q</w:t>
+            </w:r>
+          </w:p>
+        </w:tc>
+      </w:tr>
+      <w:tr>
+        <w:trPr>
+          <w:cantSplit/>
+        </w:trPr>
+        <w:tc>
+          <w:tcPr>
+            <w:tcW w:type="dxa" w:w="1800"/>
+            <w:tcBorders>
+              <w:top w:val="single" w:color="BFBFBF" w:sz="4"/>
+              <w:left w:val="single" w:color="BFBFBF" w:sz="4"/>
+              <w:bottom w:val="single" w:color="BFBFBF" w:sz="4"/>
+              <w:right w:val="single" w:color="BFBFBF" w:sz="4"/>
+            </w:tcBorders>
+            <w:tcMar>
+              <w:top w:type="dxa" w:w="60"/>
+              <w:left w:type="dxa" w:w="90"/>
+              <w:bottom w:type="dxa" w:w="60"/>
+              <w:right w:type="dxa" w:w="90"/>
+            </w:tcMar>
+          </w:tcPr>
+          <w:p>
+            <w:pPr>
+              <w:spacing w:after="20"/>
+            </w:pPr>
+            <w:r>
+              <w:rPr>
+                <w:rFonts w:ascii="Arial" w:cs="Arial" w:eastAsia="Arial" w:hAnsi="Arial"/>
+                <w:b w:val="false"/>
+                <w:bCs w:val="false"/>
+                <w:sz w:val="18"/>
+                <w:szCs w:val="18"/>
+              </w:rPr>
+              <w:t xml:space="preserve">GET</w:t>
+            </w:r>
+          </w:p>
+        </w:tc>
+        <w:tc>
+          <w:tcPr>
+            <w:tcW w:type="dxa" w:w="5400"/>
+            <w:tcBorders>
+              <w:top w:val="single" w:color="BFBFBF" w:sz="4"/>
+              <w:left w:val="single" w:color="BFBFBF" w:sz="4"/>
+              <w:bottom w:val="single" w:color="BFBFBF" w:sz="4"/>
+              <w:right w:val="single" w:color="BFBFBF" w:sz="4"/>
+            </w:tcBorders>
+            <w:tcMar>
+              <w:top w:type="dxa" w:w="60"/>
+              <w:left w:type="dxa" w:w="90"/>
+              <w:bottom w:type="dxa" w:w="60"/>
+              <w:right w:type="dxa" w:w="90"/>
+            </w:tcMar>
+          </w:tcPr>
+          <w:p>
+            <w:pPr>
+              <w:spacing w:after="20"/>
+            </w:pPr>
+            <w:r>
+              <w:rPr>
+                <w:rFonts w:ascii="Arial" w:cs="Arial" w:eastAsia="Arial" w:hAnsi="Arial"/>
+                <w:b w:val="false"/>
+                <w:bCs w:val="false"/>
+                <w:sz w:val="18"/>
+                <w:szCs w:val="18"/>
+              </w:rPr>
+              <w:t xml:space="preserve">/api/kho/phieu-nhap/:ma</w:t>
+            </w:r>
+          </w:p>
+        </w:tc>
+        <w:tc>
+          <w:tcPr>
+            <w:tcW w:type="dxa" w:w="4878"/>
+            <w:tcBorders>
+              <w:top w:val="single" w:color="BFBFBF" w:sz="4"/>
+              <w:left w:val="single" w:color="BFBFBF" w:sz="4"/>
+              <w:bottom w:val="single" w:color="BFBFBF" w:sz="4"/>
+              <w:right w:val="single" w:color="BFBFBF" w:sz="4"/>
+            </w:tcBorders>
+            <w:tcMar>
+              <w:top w:type="dxa" w:w="60"/>
+              <w:left w:type="dxa" w:w="90"/>
+              <w:bottom w:type="dxa" w:w="60"/>
+              <w:right w:type="dxa" w:w="90"/>
+            </w:tcMar>
+          </w:tcPr>
+          <w:p>
+            <w:pPr>
+              <w:spacing w:after="20"/>
+            </w:pPr>
+            <w:r>
+              <w:rPr>
+                <w:rFonts w:ascii="Arial" w:cs="Arial" w:eastAsia="Arial" w:hAnsi="Arial"/>
+                <w:b w:val="false"/>
+                <w:bCs w:val="false"/>
+                <w:sz w:val="18"/>
+                <w:szCs w:val="18"/>
+              </w:rPr>
+              <w:t xml:space="preserve">KHO-05 chi tiết phiếu nhập</w:t>
+            </w:r>
+          </w:p>
+        </w:tc>
+        <w:tc>
+          <w:tcPr>
+            <w:tcW w:type="dxa" w:w="2600"/>
+            <w:tcBorders>
+              <w:top w:val="single" w:color="BFBFBF" w:sz="4"/>
+              <w:left w:val="single" w:color="BFBFBF" w:sz="4"/>
+              <w:bottom w:val="single" w:color="BFBFBF" w:sz="4"/>
+              <w:right w:val="single" w:color="BFBFBF" w:sz="4"/>
+            </w:tcBorders>
+            <w:tcMar>
+              <w:top w:type="dxa" w:w="60"/>
+              <w:left w:type="dxa" w:w="90"/>
+              <w:bottom w:type="dxa" w:w="60"/>
+              <w:right w:type="dxa" w:w="90"/>
+            </w:tcMar>
+          </w:tcPr>
+          <w:p>
+            <w:pPr>
+              <w:spacing w:after="20"/>
+            </w:pPr>
+            <w:r>
+              <w:rPr>
+                <w:rFonts w:ascii="Arial" w:cs="Arial" w:eastAsia="Arial" w:hAnsi="Arial"/>
+                <w:b w:val="false"/>
+                <w:bCs w:val="false"/>
+                <w:sz w:val="18"/>
+                <w:szCs w:val="18"/>
+              </w:rPr>
+              <w:t xml:space="preserve">A/Q</w:t>
+            </w:r>
+          </w:p>
+        </w:tc>
+      </w:tr>
+      <w:tr>
+        <w:trPr>
+          <w:cantSplit/>
+        </w:trPr>
+        <w:tc>
+          <w:tcPr>
+            <w:tcW w:type="dxa" w:w="1800"/>
+            <w:tcBorders>
+              <w:top w:val="single" w:color="BFBFBF" w:sz="4"/>
+              <w:left w:val="single" w:color="BFBFBF" w:sz="4"/>
+              <w:bottom w:val="single" w:color="BFBFBF" w:sz="4"/>
+              <w:right w:val="single" w:color="BFBFBF" w:sz="4"/>
+            </w:tcBorders>
+            <w:tcMar>
+              <w:top w:type="dxa" w:w="60"/>
+              <w:left w:type="dxa" w:w="90"/>
+              <w:bottom w:type="dxa" w:w="60"/>
+              <w:right w:type="dxa" w:w="90"/>
+            </w:tcMar>
+          </w:tcPr>
+          <w:p>
+            <w:pPr>
+              <w:spacing w:after="20"/>
+            </w:pPr>
+            <w:r>
+              <w:rPr>
+                <w:rFonts w:ascii="Arial" w:cs="Arial" w:eastAsia="Arial" w:hAnsi="Arial"/>
+                <w:b w:val="false"/>
+                <w:bCs w:val="false"/>
+                <w:sz w:val="18"/>
+                <w:szCs w:val="18"/>
+              </w:rPr>
+              <w:t xml:space="preserve">GET</w:t>
+            </w:r>
+          </w:p>
+        </w:tc>
+        <w:tc>
+          <w:tcPr>
+            <w:tcW w:type="dxa" w:w="5400"/>
+            <w:tcBorders>
+              <w:top w:val="single" w:color="BFBFBF" w:sz="4"/>
+              <w:left w:val="single" w:color="BFBFBF" w:sz="4"/>
+              <w:bottom w:val="single" w:color="BFBFBF" w:sz="4"/>
+              <w:right w:val="single" w:color="BFBFBF" w:sz="4"/>
+            </w:tcBorders>
+            <w:tcMar>
+              <w:top w:type="dxa" w:w="60"/>
+              <w:left w:type="dxa" w:w="90"/>
+              <w:bottom w:type="dxa" w:w="60"/>
+              <w:right w:type="dxa" w:w="90"/>
+            </w:tcMar>
+          </w:tcPr>
+          <w:p>
+            <w:pPr>
+              <w:spacing w:after="20"/>
+            </w:pPr>
+            <w:r>
+              <w:rPr>
+                <w:rFonts w:ascii="Arial" w:cs="Arial" w:eastAsia="Arial" w:hAnsi="Arial"/>
+                <w:b w:val="false"/>
+                <w:bCs w:val="false"/>
+                <w:sz w:val="18"/>
+                <w:szCs w:val="18"/>
+              </w:rPr>
+              <w:t xml:space="preserve">/api/kho/ton-kho?chi_sap_het=&amp;tu_khoa=</w:t>
+            </w:r>
+          </w:p>
+        </w:tc>
+        <w:tc>
+          <w:tcPr>
+            <w:tcW w:type="dxa" w:w="4878"/>
+            <w:tcBorders>
+              <w:top w:val="single" w:color="BFBFBF" w:sz="4"/>
+              <w:left w:val="single" w:color="BFBFBF" w:sz="4"/>
+              <w:bottom w:val="single" w:color="BFBFBF" w:sz="4"/>
+              <w:right w:val="single" w:color="BFBFBF" w:sz="4"/>
+            </w:tcBorders>
+            <w:tcMar>
+              <w:top w:type="dxa" w:w="60"/>
+              <w:left w:type="dxa" w:w="90"/>
+              <w:bottom w:type="dxa" w:w="60"/>
+              <w:right w:type="dxa" w:w="90"/>
+            </w:tcMar>
+          </w:tcPr>
+          <w:p>
+            <w:pPr>
+              <w:spacing w:after="20"/>
+            </w:pPr>
+            <w:r>
+              <w:rPr>
+                <w:rFonts w:ascii="Arial" w:cs="Arial" w:eastAsia="Arial" w:hAnsi="Arial"/>
+                <w:b w:val="false"/>
+                <w:bCs w:val="false"/>
+                <w:sz w:val="18"/>
+                <w:szCs w:val="18"/>
+              </w:rPr>
+              <w:t xml:space="preserve">KHO-06 tồn kho kèm cờ sap_het</w:t>
+            </w:r>
+          </w:p>
+        </w:tc>
+        <w:tc>
+          <w:tcPr>
+            <w:tcW w:type="dxa" w:w="2600"/>
+            <w:tcBorders>
+              <w:top w:val="single" w:color="BFBFBF" w:sz="4"/>
+              <w:left w:val="single" w:color="BFBFBF" w:sz="4"/>
+              <w:bottom w:val="single" w:color="BFBFBF" w:sz="4"/>
+              <w:right w:val="single" w:color="BFBFBF" w:sz="4"/>
+            </w:tcBorders>
+            <w:tcMar>
+              <w:top w:type="dxa" w:w="60"/>
+              <w:left w:type="dxa" w:w="90"/>
+              <w:bottom w:type="dxa" w:w="60"/>
+              <w:right w:type="dxa" w:w="90"/>
+            </w:tcMar>
+          </w:tcPr>
+          <w:p>
+            <w:pPr>
+              <w:spacing w:after="20"/>
+            </w:pPr>
+            <w:r>
+              <w:rPr>
+                <w:rFonts w:ascii="Arial" w:cs="Arial" w:eastAsia="Arial" w:hAnsi="Arial"/>
+                <w:b w:val="false"/>
+                <w:bCs w:val="false"/>
+                <w:sz w:val="18"/>
+                <w:szCs w:val="18"/>
+              </w:rPr>
+              <w:t xml:space="preserve">A/Q</w:t>
             </w:r>
           </w:p>
         </w:tc>

</xml_diff>

<commit_message>
api nhân sự, báo cáo, kho,khách hàng
</commit_message>
<xml_diff>
--- a/docs/Dac_ta_tinh_nang_quan_ly_quan_ca_phe.docx
+++ b/docs/Dac_ta_tinh_nang_quan_ly_quan_ca_phe.docx
@@ -2826,7 +2826,7 @@
                 <w:sz w:val="18"/>
                 <w:szCs w:val="18"/>
               </w:rPr>
-              <w:t xml:space="preserve">Đổi mật khẩu (A/Q/N)</w:t>
+              <w:t xml:space="preserve">Đổi mật khẩu (A/Q/N, của chính mình)</w:t>
             </w:r>
           </w:p>
         </w:tc>
@@ -2910,7 +2910,77 @@
                 <w:sz w:val="18"/>
                 <w:szCs w:val="18"/>
               </w:rPr>
-              <w:t xml:space="preserve">Đúng mật khẩu cũ; mới ≥ 8 ký tự, khác cũ; băm bcrypt</w:t>
+              <w:t xml:space="preserve">Thứ tự: mật khẩu cũ đúng (401 </w:t>
+            </w:r>
+            <w:r>
+              <w:rPr>
+                <w:rFonts w:ascii="Consolas" w:cs="Consolas" w:eastAsia="Consolas" w:hAnsi="Consolas"/>
+                <w:b w:val="false"/>
+                <w:bCs w:val="false"/>
+                <w:sz w:val="18"/>
+                <w:szCs w:val="18"/>
+              </w:rPr>
+              <w:t xml:space="preserve">SAI_MAT_KHAU_CU</w:t>
+            </w:r>
+            <w:r>
+              <w:rPr>
+                <w:rFonts w:ascii="Arial" w:cs="Arial" w:eastAsia="Arial" w:hAnsi="Arial"/>
+                <w:b w:val="false"/>
+                <w:bCs w:val="false"/>
+                <w:sz w:val="18"/>
+                <w:szCs w:val="18"/>
+              </w:rPr>
+              <w:t xml:space="preserve">) rồi mới khác cũ (400 </w:t>
+            </w:r>
+            <w:r>
+              <w:rPr>
+                <w:rFonts w:ascii="Consolas" w:cs="Consolas" w:eastAsia="Consolas" w:hAnsi="Consolas"/>
+                <w:b w:val="false"/>
+                <w:bCs w:val="false"/>
+                <w:sz w:val="18"/>
+                <w:szCs w:val="18"/>
+              </w:rPr>
+              <w:t xml:space="preserve">MAT_KHAU_MOI_TRUNG_CU</w:t>
+            </w:r>
+            <w:r>
+              <w:rPr>
+                <w:rFonts w:ascii="Arial" w:cs="Arial" w:eastAsia="Arial" w:hAnsi="Arial"/>
+                <w:b w:val="false"/>
+                <w:bCs w:val="false"/>
+                <w:sz w:val="18"/>
+                <w:szCs w:val="18"/>
+              </w:rPr>
+              <w:t xml:space="preserve">)</w:t>
+            </w:r>
+          </w:p>
+          <w:p>
+            <w:pPr>
+              <w:spacing w:after="20"/>
+            </w:pPr>
+            <w:r>
+              <w:rPr>
+                <w:rFonts w:ascii="Arial" w:cs="Arial" w:eastAsia="Arial" w:hAnsi="Arial"/>
+                <w:b w:val="false"/>
+                <w:bCs w:val="false"/>
+                <w:sz w:val="18"/>
+                <w:szCs w:val="18"/>
+              </w:rPr>
+              <w:t xml:space="preserve">Mật khẩu mới: 8–72 byte, có ít nhất một chữ cái và một chữ số; băm bcrypt; khóa dòng tài khoản nên hai lần đổi đồng thời chạy nối tiếp</w:t>
+            </w:r>
+          </w:p>
+          <w:p>
+            <w:pPr>
+              <w:spacing w:after="20"/>
+            </w:pPr>
+            <w:r>
+              <w:rPr>
+                <w:rFonts w:ascii="Arial" w:cs="Arial" w:eastAsia="Arial" w:hAnsi="Arial"/>
+                <w:b w:val="false"/>
+                <w:bCs w:val="false"/>
+                <w:sz w:val="18"/>
+                <w:szCs w:val="18"/>
+              </w:rPr>
+              <w:t xml:space="preserve">Token đã cấp vẫn dùng được đến khi hết hạn (không có cột phiên bản mật khẩu)</w:t>
             </w:r>
           </w:p>
         </w:tc>
@@ -13775,13 +13845,23 @@
             </w:pPr>
             <w:r>
               <w:rPr>
-                <w:rFonts w:ascii="Consolas" w:cs="Consolas" w:eastAsia="Consolas" w:hAnsi="Consolas"/>
-                <w:b w:val="false"/>
-                <w:bCs w:val="false"/>
-                <w:sz w:val="18"/>
-                <w:szCs w:val="18"/>
-              </w:rPr>
-              <w:t xml:space="preserve">tu_ngay</w:t>
+                <w:rFonts w:ascii="Arial" w:cs="Arial" w:eastAsia="Arial" w:hAnsi="Arial"/>
+                <w:b w:val="false"/>
+                <w:bCs w:val="false"/>
+                <w:sz w:val="18"/>
+                <w:szCs w:val="18"/>
+              </w:rPr>
+              <w:t xml:space="preserve">Query </w:t>
+            </w:r>
+            <w:r>
+              <w:rPr>
+                <w:rFonts w:ascii="Consolas" w:cs="Consolas" w:eastAsia="Consolas" w:hAnsi="Consolas"/>
+                <w:b w:val="false"/>
+                <w:bCs w:val="false"/>
+                <w:sz w:val="18"/>
+                <w:szCs w:val="18"/>
+              </w:rPr>
+              <w:t xml:space="preserve">tu_ngay?</w:t>
             </w:r>
             <w:r>
               <w:rPr>
@@ -13801,7 +13881,89 @@
                 <w:sz w:val="18"/>
                 <w:szCs w:val="18"/>
               </w:rPr>
-              <w:t xml:space="preserve">den_ngay</w:t>
+              <w:t xml:space="preserve">den_ngay?</w:t>
+            </w:r>
+            <w:r>
+              <w:rPr>
+                <w:rFonts w:ascii="Arial" w:cs="Arial" w:eastAsia="Arial" w:hAnsi="Arial"/>
+                <w:b w:val="false"/>
+                <w:bCs w:val="false"/>
+                <w:sz w:val="18"/>
+                <w:szCs w:val="18"/>
+              </w:rPr>
+              <w:t xml:space="preserve"> (gồm cả hai đầu, theo ngày thanh toán), </w:t>
+            </w:r>
+            <w:r>
+              <w:rPr>
+                <w:rFonts w:ascii="Consolas" w:cs="Consolas" w:eastAsia="Consolas" w:hAnsi="Consolas"/>
+                <w:b w:val="false"/>
+                <w:bCs w:val="false"/>
+                <w:sz w:val="18"/>
+                <w:szCs w:val="18"/>
+              </w:rPr>
+              <w:t xml:space="preserve">top?</w:t>
+            </w:r>
+            <w:r>
+              <w:rPr>
+                <w:rFonts w:ascii="Arial" w:cs="Arial" w:eastAsia="Arial" w:hAnsi="Arial"/>
+                <w:b w:val="false"/>
+                <w:bCs w:val="false"/>
+                <w:sz w:val="18"/>
+                <w:szCs w:val="18"/>
+              </w:rPr>
+              <w:t xml:space="preserve"> (mặc định 10, tối đa 100) — </w:t>
+            </w:r>
+            <w:r>
+              <w:rPr>
+                <w:rFonts w:ascii="Consolas" w:cs="Consolas" w:eastAsia="Consolas" w:hAnsi="Consolas"/>
+                <w:b w:val="false"/>
+                <w:bCs w:val="false"/>
+                <w:sz w:val="18"/>
+                <w:szCs w:val="18"/>
+              </w:rPr>
+              <w:t xml:space="preserve">GET /api/khach-hang/top</w:t>
+            </w:r>
+          </w:p>
+        </w:tc>
+        <w:tc>
+          <w:tcPr>
+            <w:tcW w:type="dxa" w:w="3900"/>
+            <w:tcBorders>
+              <w:top w:val="single" w:color="BFBFBF" w:sz="4"/>
+              <w:left w:val="single" w:color="BFBFBF" w:sz="4"/>
+              <w:bottom w:val="single" w:color="BFBFBF" w:sz="4"/>
+              <w:right w:val="single" w:color="BFBFBF" w:sz="4"/>
+            </w:tcBorders>
+            <w:tcMar>
+              <w:top w:type="dxa" w:w="60"/>
+              <w:left w:type="dxa" w:w="90"/>
+              <w:bottom w:type="dxa" w:w="60"/>
+              <w:right w:type="dxa" w:w="90"/>
+            </w:tcMar>
+          </w:tcPr>
+          <w:p>
+            <w:pPr>
+              <w:spacing w:after="20"/>
+            </w:pPr>
+            <w:r>
+              <w:rPr>
+                <w:rFonts w:ascii="Arial" w:cs="Arial" w:eastAsia="Arial" w:hAnsi="Arial"/>
+                <w:b w:val="false"/>
+                <w:bCs w:val="false"/>
+                <w:sz w:val="18"/>
+                <w:szCs w:val="18"/>
+              </w:rPr>
+              <w:t xml:space="preserve">Chỉ hóa đơn đã thanh toán có khách hàng (bỏ khách vãng lai); </w:t>
+            </w:r>
+            <w:r>
+              <w:rPr>
+                <w:rFonts w:ascii="Consolas" w:cs="Consolas" w:eastAsia="Consolas" w:hAnsi="Consolas"/>
+                <w:b w:val="false"/>
+                <w:bCs w:val="false"/>
+                <w:sz w:val="18"/>
+                <w:szCs w:val="18"/>
+              </w:rPr>
+              <w:t xml:space="preserve">GROUP BY ma_khach_hang</w:t>
             </w:r>
             <w:r>
               <w:rPr>
@@ -13821,71 +13983,24 @@
                 <w:sz w:val="18"/>
                 <w:szCs w:val="18"/>
               </w:rPr>
-              <w:t xml:space="preserve">top</w:t>
-            </w:r>
-            <w:r>
-              <w:rPr>
-                <w:rFonts w:ascii="Arial" w:cs="Arial" w:eastAsia="Arial" w:hAnsi="Arial"/>
-                <w:b w:val="false"/>
-                <w:bCs w:val="false"/>
-                <w:sz w:val="18"/>
-                <w:szCs w:val="18"/>
-              </w:rPr>
-              <w:t xml:space="preserve"> (mặc định 10)</w:t>
-            </w:r>
-          </w:p>
-        </w:tc>
-        <w:tc>
-          <w:tcPr>
-            <w:tcW w:type="dxa" w:w="3900"/>
-            <w:tcBorders>
-              <w:top w:val="single" w:color="BFBFBF" w:sz="4"/>
-              <w:left w:val="single" w:color="BFBFBF" w:sz="4"/>
-              <w:bottom w:val="single" w:color="BFBFBF" w:sz="4"/>
-              <w:right w:val="single" w:color="BFBFBF" w:sz="4"/>
-            </w:tcBorders>
-            <w:tcMar>
-              <w:top w:type="dxa" w:w="60"/>
-              <w:left w:type="dxa" w:w="90"/>
-              <w:bottom w:type="dxa" w:w="60"/>
-              <w:right w:type="dxa" w:w="90"/>
-            </w:tcMar>
-          </w:tcPr>
-          <w:p>
-            <w:pPr>
-              <w:spacing w:after="20"/>
-            </w:pPr>
-            <w:r>
-              <w:rPr>
-                <w:rFonts w:ascii="Consolas" w:cs="Consolas" w:eastAsia="Consolas" w:hAnsi="Consolas"/>
-                <w:b w:val="false"/>
-                <w:bCs w:val="false"/>
-                <w:sz w:val="18"/>
-                <w:szCs w:val="18"/>
-              </w:rPr>
-              <w:t xml:space="preserve">GROUP BY ma_khach_hang</w:t>
-            </w:r>
-            <w:r>
-              <w:rPr>
-                <w:rFonts w:ascii="Arial" w:cs="Arial" w:eastAsia="Arial" w:hAnsi="Arial"/>
-                <w:b w:val="false"/>
-                <w:bCs w:val="false"/>
-                <w:sz w:val="18"/>
-                <w:szCs w:val="18"/>
-              </w:rPr>
-              <w:t xml:space="preserve">, </w:t>
-            </w:r>
-            <w:r>
-              <w:rPr>
-                <w:rFonts w:ascii="Consolas" w:cs="Consolas" w:eastAsia="Consolas" w:hAnsi="Consolas"/>
-                <w:b w:val="false"/>
-                <w:bCs w:val="false"/>
-                <w:sz w:val="18"/>
-                <w:szCs w:val="18"/>
-              </w:rPr>
               <w:t xml:space="preserve">SUM(tong_tien)</w:t>
             </w:r>
           </w:p>
+          <w:p>
+            <w:pPr>
+              <w:spacing w:after="20"/>
+            </w:pPr>
+            <w:r>
+              <w:rPr>
+                <w:rFonts w:ascii="Arial" w:cs="Arial" w:eastAsia="Arial" w:hAnsi="Arial"/>
+                <w:b w:val="false"/>
+                <w:bCs w:val="false"/>
+                <w:sz w:val="18"/>
+                <w:szCs w:val="18"/>
+              </w:rPr>
+              <w:t xml:space="preserve">Xếp theo tổng chi tiêu giảm dần, đồng hạng: nhiều đơn hơn trước, rồi mã khách nhỏ trước</w:t>
+            </w:r>
+          </w:p>
         </w:tc>
         <w:tc>
           <w:tcPr>
@@ -13925,7 +14040,7 @@
                 <w:sz w:val="18"/>
                 <w:szCs w:val="18"/>
               </w:rPr>
-              <w:t xml:space="preserve">{ma_khach_hang, ten, so_don, tong_chi_tieu}</w:t>
+              <w:t xml:space="preserve">{ma_khach_hang, ten, so_dien_thoai, so_don, tong_chi_tieu}</w:t>
             </w:r>
           </w:p>
         </w:tc>
@@ -13949,6 +14064,31 @@
             <w:pPr>
               <w:spacing w:after="20"/>
             </w:pPr>
+            <w:r>
+              <w:rPr>
+                <w:rFonts w:ascii="Arial" w:cs="Arial" w:eastAsia="Arial" w:hAnsi="Arial"/>
+                <w:b w:val="false"/>
+                <w:bCs w:val="false"/>
+                <w:sz w:val="18"/>
+                <w:szCs w:val="18"/>
+              </w:rPr>
+              <w:t xml:space="preserve">400</w:t>
+            </w:r>
+          </w:p>
+          <w:p>
+            <w:pPr>
+              <w:spacing w:after="20"/>
+            </w:pPr>
+            <w:r>
+              <w:rPr>
+                <w:rFonts w:ascii="Arial" w:cs="Arial" w:eastAsia="Arial" w:hAnsi="Arial"/>
+                <w:b w:val="false"/>
+                <w:bCs w:val="false"/>
+                <w:sz w:val="18"/>
+                <w:szCs w:val="18"/>
+              </w:rPr>
+              <w:t xml:space="preserve">403</w:t>
+            </w:r>
           </w:p>
         </w:tc>
       </w:tr>
@@ -16935,7 +17075,7 @@
                 <w:sz w:val="18"/>
                 <w:szCs w:val="18"/>
               </w:rPr>
-              <w:t xml:space="preserve">so_dien_thoai</w:t>
+              <w:t xml:space="preserve">so_dien_thoai?</w:t>
             </w:r>
             <w:r>
               <w:rPr>
@@ -17027,7 +17167,27 @@
                 <w:sz w:val="18"/>
                 <w:szCs w:val="18"/>
               </w:rPr>
-              <w:t xml:space="preserve">Một transaction; </w:t>
+              <w:t xml:space="preserve">Một transaction (NhanVien + TaiKhoan), chạy dưới khóa tên </w:t>
+            </w:r>
+            <w:r>
+              <w:rPr>
+                <w:rFonts w:ascii="Consolas" w:cs="Consolas" w:eastAsia="Consolas" w:hAnsi="Consolas"/>
+                <w:b w:val="false"/>
+                <w:bCs w:val="false"/>
+                <w:sz w:val="18"/>
+                <w:szCs w:val="18"/>
+              </w:rPr>
+              <w:t xml:space="preserve">nhan_su</w:t>
+            </w:r>
+            <w:r>
+              <w:rPr>
+                <w:rFonts w:ascii="Arial" w:cs="Arial" w:eastAsia="Arial" w:hAnsi="Arial"/>
+                <w:b w:val="false"/>
+                <w:bCs w:val="false"/>
+                <w:sz w:val="18"/>
+                <w:szCs w:val="18"/>
+              </w:rPr>
+              <w:t xml:space="preserve">; </w:t>
             </w:r>
             <w:r>
               <w:rPr>
@@ -17047,7 +17207,62 @@
                 <w:sz w:val="18"/>
                 <w:szCs w:val="18"/>
               </w:rPr>
-              <w:t xml:space="preserve"> UNIQUE; băm mật khẩu</w:t>
+              <w:t xml:space="preserve"> 3–50 ký tự (chữ không dấu, số, </w:t>
+            </w:r>
+            <w:r>
+              <w:rPr>
+                <w:rFonts w:ascii="Consolas" w:cs="Consolas" w:eastAsia="Consolas" w:hAnsi="Consolas"/>
+                <w:b w:val="false"/>
+                <w:bCs w:val="false"/>
+                <w:sz w:val="18"/>
+                <w:szCs w:val="18"/>
+              </w:rPr>
+              <w:t xml:space="preserve">. _ -</w:t>
+            </w:r>
+            <w:r>
+              <w:rPr>
+                <w:rFonts w:ascii="Arial" w:cs="Arial" w:eastAsia="Arial" w:hAnsi="Arial"/>
+                <w:b w:val="false"/>
+                <w:bCs w:val="false"/>
+                <w:sz w:val="18"/>
+                <w:szCs w:val="18"/>
+              </w:rPr>
+              <w:t xml:space="preserve">), UNIQUE không phân biệt hoa thường; mật khẩu cùng chính sách AUTH-02; băm bcrypt ngoài transaction</w:t>
+            </w:r>
+          </w:p>
+          <w:p>
+            <w:pPr>
+              <w:spacing w:after="20"/>
+            </w:pPr>
+            <w:r>
+              <w:rPr>
+                <w:rFonts w:ascii="Arial" w:cs="Arial" w:eastAsia="Arial" w:hAnsi="Arial"/>
+                <w:b w:val="false"/>
+                <w:bCs w:val="false"/>
+                <w:sz w:val="18"/>
+                <w:szCs w:val="18"/>
+              </w:rPr>
+              <w:t xml:space="preserve">Trường lạ (ví dụ </w:t>
+            </w:r>
+            <w:r>
+              <w:rPr>
+                <w:rFonts w:ascii="Consolas" w:cs="Consolas" w:eastAsia="Consolas" w:hAnsi="Consolas"/>
+                <w:b w:val="false"/>
+                <w:bCs w:val="false"/>
+                <w:sz w:val="18"/>
+                <w:szCs w:val="18"/>
+              </w:rPr>
+              <w:t xml:space="preserve">trang_thai</w:t>
+            </w:r>
+            <w:r>
+              <w:rPr>
+                <w:rFonts w:ascii="Arial" w:cs="Arial" w:eastAsia="Arial" w:hAnsi="Arial"/>
+                <w:b w:val="false"/>
+                <w:bCs w:val="false"/>
+                <w:sz w:val="18"/>
+                <w:szCs w:val="18"/>
+              </w:rPr>
+              <w:t xml:space="preserve">): 400</w:t>
             </w:r>
           </w:p>
         </w:tc>
@@ -17079,17 +17294,17 @@
                 <w:sz w:val="18"/>
                 <w:szCs w:val="18"/>
               </w:rPr>
-              <w:t xml:space="preserve">{ma_nhan_vien, ma_tai_khoan}</w:t>
-            </w:r>
-            <w:r>
-              <w:rPr>
-                <w:rFonts w:ascii="Arial" w:cs="Arial" w:eastAsia="Arial" w:hAnsi="Arial"/>
-                <w:b w:val="false"/>
-                <w:bCs w:val="false"/>
-                <w:sz w:val="18"/>
-                <w:szCs w:val="18"/>
-              </w:rPr>
-              <w:t xml:space="preserve"> (không trả mật khẩu)</w:t>
+              <w:t xml:space="preserve">{ma_nhan_vien, ma_tai_khoan, ho_ten, chuc_vu, so_dien_thoai, ten_dang_nhap, quyen_truy_cap, trang_thai}</w:t>
+            </w:r>
+            <w:r>
+              <w:rPr>
+                <w:rFonts w:ascii="Arial" w:cs="Arial" w:eastAsia="Arial" w:hAnsi="Arial"/>
+                <w:b w:val="false"/>
+                <w:bCs w:val="false"/>
+                <w:sz w:val="18"/>
+                <w:szCs w:val="18"/>
+              </w:rPr>
+              <w:t xml:space="preserve"> (không trả mật khẩu/băm)</w:t>
             </w:r>
           </w:p>
         </w:tc>
@@ -17121,7 +17336,42 @@
                 <w:sz w:val="18"/>
                 <w:szCs w:val="18"/>
               </w:rPr>
-              <w:t xml:space="preserve">409 trùng tên đăng nhập</w:t>
+              <w:t xml:space="preserve">400</w:t>
+            </w:r>
+          </w:p>
+          <w:p>
+            <w:pPr>
+              <w:spacing w:after="20"/>
+            </w:pPr>
+            <w:r>
+              <w:rPr>
+                <w:rFonts w:ascii="Arial" w:cs="Arial" w:eastAsia="Arial" w:hAnsi="Arial"/>
+                <w:b w:val="false"/>
+                <w:bCs w:val="false"/>
+                <w:sz w:val="18"/>
+                <w:szCs w:val="18"/>
+              </w:rPr>
+              <w:t xml:space="preserve">409 </w:t>
+            </w:r>
+            <w:r>
+              <w:rPr>
+                <w:rFonts w:ascii="Consolas" w:cs="Consolas" w:eastAsia="Consolas" w:hAnsi="Consolas"/>
+                <w:b w:val="false"/>
+                <w:bCs w:val="false"/>
+                <w:sz w:val="18"/>
+                <w:szCs w:val="18"/>
+              </w:rPr>
+              <w:t xml:space="preserve">TRUNG_TEN_DANG_NHAP</w:t>
+            </w:r>
+            <w:r>
+              <w:rPr>
+                <w:rFonts w:ascii="Arial" w:cs="Arial" w:eastAsia="Arial" w:hAnsi="Arial"/>
+                <w:b w:val="false"/>
+                <w:bCs w:val="false"/>
+                <w:sz w:val="18"/>
+                <w:szCs w:val="18"/>
+              </w:rPr>
+              <w:t xml:space="preserve"> (không để lại nhân viên mồ côi)</w:t>
             </w:r>
           </w:p>
         </w:tc>
@@ -17264,7 +17514,97 @@
                 <w:sz w:val="18"/>
                 <w:szCs w:val="18"/>
               </w:rPr>
-              <w:t xml:space="preserve">, các trường cần đổi</w:t>
+              <w:t xml:space="preserve"> (đường dẫn); </w:t>
+            </w:r>
+            <w:r>
+              <w:rPr>
+                <w:rFonts w:ascii="Consolas" w:cs="Consolas" w:eastAsia="Consolas" w:hAnsi="Consolas"/>
+                <w:b w:val="false"/>
+                <w:bCs w:val="false"/>
+                <w:sz w:val="18"/>
+                <w:szCs w:val="18"/>
+              </w:rPr>
+              <w:t xml:space="preserve">ho_ten?</w:t>
+            </w:r>
+            <w:r>
+              <w:rPr>
+                <w:rFonts w:ascii="Arial" w:cs="Arial" w:eastAsia="Arial" w:hAnsi="Arial"/>
+                <w:b w:val="false"/>
+                <w:bCs w:val="false"/>
+                <w:sz w:val="18"/>
+                <w:szCs w:val="18"/>
+              </w:rPr>
+              <w:t xml:space="preserve">, </w:t>
+            </w:r>
+            <w:r>
+              <w:rPr>
+                <w:rFonts w:ascii="Consolas" w:cs="Consolas" w:eastAsia="Consolas" w:hAnsi="Consolas"/>
+                <w:b w:val="false"/>
+                <w:bCs w:val="false"/>
+                <w:sz w:val="18"/>
+                <w:szCs w:val="18"/>
+              </w:rPr>
+              <w:t xml:space="preserve">chuc_vu?</w:t>
+            </w:r>
+            <w:r>
+              <w:rPr>
+                <w:rFonts w:ascii="Arial" w:cs="Arial" w:eastAsia="Arial" w:hAnsi="Arial"/>
+                <w:b w:val="false"/>
+                <w:bCs w:val="false"/>
+                <w:sz w:val="18"/>
+                <w:szCs w:val="18"/>
+              </w:rPr>
+              <w:t xml:space="preserve">, </w:t>
+            </w:r>
+            <w:r>
+              <w:rPr>
+                <w:rFonts w:ascii="Consolas" w:cs="Consolas" w:eastAsia="Consolas" w:hAnsi="Consolas"/>
+                <w:b w:val="false"/>
+                <w:bCs w:val="false"/>
+                <w:sz w:val="18"/>
+                <w:szCs w:val="18"/>
+              </w:rPr>
+              <w:t xml:space="preserve">so_dien_thoai?</w:t>
+            </w:r>
+            <w:r>
+              <w:rPr>
+                <w:rFonts w:ascii="Arial" w:cs="Arial" w:eastAsia="Arial" w:hAnsi="Arial"/>
+                <w:b w:val="false"/>
+                <w:bCs w:val="false"/>
+                <w:sz w:val="18"/>
+                <w:szCs w:val="18"/>
+              </w:rPr>
+              <w:t xml:space="preserve"> (null = xóa), </w:t>
+            </w:r>
+            <w:r>
+              <w:rPr>
+                <w:rFonts w:ascii="Consolas" w:cs="Consolas" w:eastAsia="Consolas" w:hAnsi="Consolas"/>
+                <w:b w:val="false"/>
+                <w:bCs w:val="false"/>
+                <w:sz w:val="18"/>
+                <w:szCs w:val="18"/>
+              </w:rPr>
+              <w:t xml:space="preserve">quyen_truy_cap?</w:t>
+            </w:r>
+            <w:r>
+              <w:rPr>
+                <w:rFonts w:ascii="Arial" w:cs="Arial" w:eastAsia="Arial" w:hAnsi="Arial"/>
+                <w:b w:val="false"/>
+                <w:bCs w:val="false"/>
+                <w:sz w:val="18"/>
+                <w:szCs w:val="18"/>
+              </w:rPr>
+              <w:t xml:space="preserve">, </w:t>
+            </w:r>
+            <w:r>
+              <w:rPr>
+                <w:rFonts w:ascii="Consolas" w:cs="Consolas" w:eastAsia="Consolas" w:hAnsi="Consolas"/>
+                <w:b w:val="false"/>
+                <w:bCs w:val="false"/>
+                <w:sz w:val="18"/>
+                <w:szCs w:val="18"/>
+              </w:rPr>
+              <w:t xml:space="preserve">mat_khau?</w:t>
             </w:r>
           </w:p>
         </w:tc>
@@ -17316,7 +17656,232 @@
                 <w:sz w:val="18"/>
                 <w:szCs w:val="18"/>
               </w:rPr>
-              <w:t xml:space="preserve">; Q không sửa tài khoản admin</w:t>
+              <w:t xml:space="preserve"> và đặt lại </w:t>
+            </w:r>
+            <w:r>
+              <w:rPr>
+                <w:rFonts w:ascii="Consolas" w:cs="Consolas" w:eastAsia="Consolas" w:hAnsi="Consolas"/>
+                <w:b w:val="false"/>
+                <w:bCs w:val="false"/>
+                <w:sz w:val="18"/>
+                <w:szCs w:val="18"/>
+              </w:rPr>
+              <w:t xml:space="preserve">mat_khau</w:t>
+            </w:r>
+            <w:r>
+              <w:rPr>
+                <w:rFonts w:ascii="Arial" w:cs="Arial" w:eastAsia="Arial" w:hAnsi="Arial"/>
+                <w:b w:val="false"/>
+                <w:bCs w:val="false"/>
+                <w:sz w:val="18"/>
+                <w:szCs w:val="18"/>
+              </w:rPr>
+              <w:t xml:space="preserve">; Q gửi các trường này hoặc sửa tài khoản admin: 403 (không ghi gì)</w:t>
+            </w:r>
+          </w:p>
+          <w:p>
+            <w:pPr>
+              <w:spacing w:after="20"/>
+            </w:pPr>
+            <w:r>
+              <w:rPr>
+                <w:rFonts w:ascii="Arial" w:cs="Arial" w:eastAsia="Arial" w:hAnsi="Arial"/>
+                <w:b w:val="false"/>
+                <w:bCs w:val="false"/>
+                <w:sz w:val="18"/>
+                <w:szCs w:val="18"/>
+              </w:rPr>
+              <w:t xml:space="preserve">Không đổi </w:t>
+            </w:r>
+            <w:r>
+              <w:rPr>
+                <w:rFonts w:ascii="Consolas" w:cs="Consolas" w:eastAsia="Consolas" w:hAnsi="Consolas"/>
+                <w:b w:val="false"/>
+                <w:bCs w:val="false"/>
+                <w:sz w:val="18"/>
+                <w:szCs w:val="18"/>
+              </w:rPr>
+              <w:t xml:space="preserve">ten_dang_nhap</w:t>
+            </w:r>
+            <w:r>
+              <w:rPr>
+                <w:rFonts w:ascii="Arial" w:cs="Arial" w:eastAsia="Arial" w:hAnsi="Arial"/>
+                <w:b w:val="false"/>
+                <w:bCs w:val="false"/>
+                <w:sz w:val="18"/>
+                <w:szCs w:val="18"/>
+              </w:rPr>
+              <w:t xml:space="preserve">/</w:t>
+            </w:r>
+            <w:r>
+              <w:rPr>
+                <w:rFonts w:ascii="Consolas" w:cs="Consolas" w:eastAsia="Consolas" w:hAnsi="Consolas"/>
+                <w:b w:val="false"/>
+                <w:bCs w:val="false"/>
+                <w:sz w:val="18"/>
+                <w:szCs w:val="18"/>
+              </w:rPr>
+              <w:t xml:space="preserve">trang_thai</w:t>
+            </w:r>
+            <w:r>
+              <w:rPr>
+                <w:rFonts w:ascii="Arial" w:cs="Arial" w:eastAsia="Arial" w:hAnsi="Arial"/>
+                <w:b w:val="false"/>
+                <w:bCs w:val="false"/>
+                <w:sz w:val="18"/>
+                <w:szCs w:val="18"/>
+              </w:rPr>
+              <w:t xml:space="preserve"> (400); nhân viên chưa có tài khoản mà đổi quyền/mật khẩu: 409 </w:t>
+            </w:r>
+            <w:r>
+              <w:rPr>
+                <w:rFonts w:ascii="Consolas" w:cs="Consolas" w:eastAsia="Consolas" w:hAnsi="Consolas"/>
+                <w:b w:val="false"/>
+                <w:bCs w:val="false"/>
+                <w:sz w:val="18"/>
+                <w:szCs w:val="18"/>
+              </w:rPr>
+              <w:t xml:space="preserve">NHAN_VIEN_KHONG_CO_TAI_KHOAN</w:t>
+            </w:r>
+          </w:p>
+          <w:p>
+            <w:pPr>
+              <w:spacing w:after="20"/>
+            </w:pPr>
+            <w:r>
+              <w:rPr>
+                <w:rFonts w:ascii="Arial" w:cs="Arial" w:eastAsia="Arial" w:hAnsi="Arial"/>
+                <w:b w:val="false"/>
+                <w:bCs w:val="false"/>
+                <w:sz w:val="18"/>
+                <w:szCs w:val="18"/>
+              </w:rPr>
+              <w:t xml:space="preserve">Không hạ quyền admin cuối cùng đang làm việc: 409 </w:t>
+            </w:r>
+            <w:r>
+              <w:rPr>
+                <w:rFonts w:ascii="Consolas" w:cs="Consolas" w:eastAsia="Consolas" w:hAnsi="Consolas"/>
+                <w:b w:val="false"/>
+                <w:bCs w:val="false"/>
+                <w:sz w:val="18"/>
+                <w:szCs w:val="18"/>
+              </w:rPr>
+              <w:t xml:space="preserve">ADMIN_CUOI_CUNG</w:t>
+            </w:r>
+            <w:r>
+              <w:rPr>
+                <w:rFonts w:ascii="Arial" w:cs="Arial" w:eastAsia="Arial" w:hAnsi="Arial"/>
+                <w:b w:val="false"/>
+                <w:bCs w:val="false"/>
+                <w:sz w:val="18"/>
+                <w:szCs w:val="18"/>
+              </w:rPr>
+              <w:t xml:space="preserve">; quyền mới có hiệu lực ngay với token đã cấp</w:t>
+            </w:r>
+          </w:p>
+          <w:p>
+            <w:pPr>
+              <w:spacing w:after="20"/>
+            </w:pPr>
+            <w:r>
+              <w:rPr>
+                <w:rFonts w:ascii="Arial" w:cs="Arial" w:eastAsia="Arial" w:hAnsi="Arial"/>
+                <w:b w:val="false"/>
+                <w:bCs w:val="false"/>
+                <w:sz w:val="18"/>
+                <w:szCs w:val="18"/>
+              </w:rPr>
+              <w:t xml:space="preserve">Bổ sung: GET </w:t>
+            </w:r>
+            <w:r>
+              <w:rPr>
+                <w:rFonts w:ascii="Consolas" w:cs="Consolas" w:eastAsia="Consolas" w:hAnsi="Consolas"/>
+                <w:b w:val="false"/>
+                <w:bCs w:val="false"/>
+                <w:sz w:val="18"/>
+                <w:szCs w:val="18"/>
+              </w:rPr>
+              <w:t xml:space="preserve">/api/nhan-su</w:t>
+            </w:r>
+            <w:r>
+              <w:rPr>
+                <w:rFonts w:ascii="Arial" w:cs="Arial" w:eastAsia="Arial" w:hAnsi="Arial"/>
+                <w:b w:val="false"/>
+                <w:bCs w:val="false"/>
+                <w:sz w:val="18"/>
+                <w:szCs w:val="18"/>
+              </w:rPr>
+              <w:t xml:space="preserve"> (A/Q; </w:t>
+            </w:r>
+            <w:r>
+              <w:rPr>
+                <w:rFonts w:ascii="Consolas" w:cs="Consolas" w:eastAsia="Consolas" w:hAnsi="Consolas"/>
+                <w:b w:val="false"/>
+                <w:bCs w:val="false"/>
+                <w:sz w:val="18"/>
+                <w:szCs w:val="18"/>
+              </w:rPr>
+              <w:t xml:space="preserve">tu_khoa</w:t>
+            </w:r>
+            <w:r>
+              <w:rPr>
+                <w:rFonts w:ascii="Arial" w:cs="Arial" w:eastAsia="Arial" w:hAnsi="Arial"/>
+                <w:b w:val="false"/>
+                <w:bCs w:val="false"/>
+                <w:sz w:val="18"/>
+                <w:szCs w:val="18"/>
+              </w:rPr>
+              <w:t xml:space="preserve">, </w:t>
+            </w:r>
+            <w:r>
+              <w:rPr>
+                <w:rFonts w:ascii="Consolas" w:cs="Consolas" w:eastAsia="Consolas" w:hAnsi="Consolas"/>
+                <w:b w:val="false"/>
+                <w:bCs w:val="false"/>
+                <w:sz w:val="18"/>
+                <w:szCs w:val="18"/>
+              </w:rPr>
+              <w:t xml:space="preserve">trang_thai</w:t>
+            </w:r>
+            <w:r>
+              <w:rPr>
+                <w:rFonts w:ascii="Arial" w:cs="Arial" w:eastAsia="Arial" w:hAnsi="Arial"/>
+                <w:b w:val="false"/>
+                <w:bCs w:val="false"/>
+                <w:sz w:val="18"/>
+                <w:szCs w:val="18"/>
+              </w:rPr>
+              <w:t xml:space="preserve">, </w:t>
+            </w:r>
+            <w:r>
+              <w:rPr>
+                <w:rFonts w:ascii="Consolas" w:cs="Consolas" w:eastAsia="Consolas" w:hAnsi="Consolas"/>
+                <w:b w:val="false"/>
+                <w:bCs w:val="false"/>
+                <w:sz w:val="18"/>
+                <w:szCs w:val="18"/>
+              </w:rPr>
+              <w:t xml:space="preserve">quyen_truy_cap</w:t>
+            </w:r>
+            <w:r>
+              <w:rPr>
+                <w:rFonts w:ascii="Arial" w:cs="Arial" w:eastAsia="Arial" w:hAnsi="Arial"/>
+                <w:b w:val="false"/>
+                <w:bCs w:val="false"/>
+                <w:sz w:val="18"/>
+                <w:szCs w:val="18"/>
+              </w:rPr>
+              <w:t xml:space="preserve">, phân trang) và GET </w:t>
+            </w:r>
+            <w:r>
+              <w:rPr>
+                <w:rFonts w:ascii="Consolas" w:cs="Consolas" w:eastAsia="Consolas" w:hAnsi="Consolas"/>
+                <w:b w:val="false"/>
+                <w:bCs w:val="false"/>
+                <w:sz w:val="18"/>
+                <w:szCs w:val="18"/>
+              </w:rPr>
+              <w:t xml:space="preserve">/api/nhan-su/:ma</w:t>
             </w:r>
           </w:p>
         </w:tc>
@@ -17348,7 +17913,7 @@
                 <w:sz w:val="18"/>
                 <w:szCs w:val="18"/>
               </w:rPr>
-              <w:t xml:space="preserve">Nhân viên cập nhật</w:t>
+              <w:t xml:space="preserve">Nhân viên cập nhật (kèm tài khoản)</w:t>
             </w:r>
           </w:p>
         </w:tc>
@@ -17380,7 +17945,52 @@
                 <w:sz w:val="18"/>
                 <w:szCs w:val="18"/>
               </w:rPr>
+              <w:t xml:space="preserve">400</w:t>
+            </w:r>
+          </w:p>
+          <w:p>
+            <w:pPr>
+              <w:spacing w:after="20"/>
+            </w:pPr>
+            <w:r>
+              <w:rPr>
+                <w:rFonts w:ascii="Arial" w:cs="Arial" w:eastAsia="Arial" w:hAnsi="Arial"/>
+                <w:b w:val="false"/>
+                <w:bCs w:val="false"/>
+                <w:sz w:val="18"/>
+                <w:szCs w:val="18"/>
+              </w:rPr>
               <w:t xml:space="preserve">403</w:t>
+            </w:r>
+          </w:p>
+          <w:p>
+            <w:pPr>
+              <w:spacing w:after="20"/>
+            </w:pPr>
+            <w:r>
+              <w:rPr>
+                <w:rFonts w:ascii="Arial" w:cs="Arial" w:eastAsia="Arial" w:hAnsi="Arial"/>
+                <w:b w:val="false"/>
+                <w:bCs w:val="false"/>
+                <w:sz w:val="18"/>
+                <w:szCs w:val="18"/>
+              </w:rPr>
+              <w:t xml:space="preserve">404</w:t>
+            </w:r>
+          </w:p>
+          <w:p>
+            <w:pPr>
+              <w:spacing w:after="20"/>
+            </w:pPr>
+            <w:r>
+              <w:rPr>
+                <w:rFonts w:ascii="Arial" w:cs="Arial" w:eastAsia="Arial" w:hAnsi="Arial"/>
+                <w:b w:val="false"/>
+                <w:bCs w:val="false"/>
+                <w:sz w:val="18"/>
+                <w:szCs w:val="18"/>
+              </w:rPr>
+              <w:t xml:space="preserve">409</w:t>
             </w:r>
           </w:p>
         </w:tc>
@@ -17545,27 +18155,222 @@
                 <w:sz w:val="18"/>
                 <w:szCs w:val="18"/>
               </w:rPr>
-              <w:t xml:space="preserve">Đã có hóa đơn/phiếu nhập thì không xóa mà đặt </w:t>
-            </w:r>
-            <w:r>
-              <w:rPr>
-                <w:rFonts w:ascii="Consolas" w:cs="Consolas" w:eastAsia="Consolas" w:hAnsi="Consolas"/>
-                <w:b w:val="false"/>
-                <w:bCs w:val="false"/>
-                <w:sz w:val="18"/>
-                <w:szCs w:val="18"/>
-              </w:rPr>
-              <w:t xml:space="preserve">trang_thai = 'nghi_viec'</w:t>
-            </w:r>
-            <w:r>
-              <w:rPr>
-                <w:rFonts w:ascii="Arial" w:cs="Arial" w:eastAsia="Arial" w:hAnsi="Arial"/>
-                <w:b w:val="false"/>
-                <w:bCs w:val="false"/>
-                <w:sz w:val="18"/>
-                <w:szCs w:val="18"/>
-              </w:rPr>
-              <w:t xml:space="preserve">; nhân viên nghỉ việc bị chặn đăng nhập, không được chọn khi tạo order/xếp ca</w:t>
+              <w:t xml:space="preserve">Chưa có </w:t>
+            </w:r>
+            <w:r>
+              <w:rPr>
+                <w:rFonts w:ascii="Consolas" w:cs="Consolas" w:eastAsia="Consolas" w:hAnsi="Consolas"/>
+                <w:b w:val="false"/>
+                <w:bCs w:val="false"/>
+                <w:sz w:val="18"/>
+                <w:szCs w:val="18"/>
+              </w:rPr>
+              <w:t xml:space="preserve">HoaDon</w:t>
+            </w:r>
+            <w:r>
+              <w:rPr>
+                <w:rFonts w:ascii="Arial" w:cs="Arial" w:eastAsia="Arial" w:hAnsi="Arial"/>
+                <w:b w:val="false"/>
+                <w:bCs w:val="false"/>
+                <w:sz w:val="18"/>
+                <w:szCs w:val="18"/>
+              </w:rPr>
+              <w:t xml:space="preserve">/</w:t>
+            </w:r>
+            <w:r>
+              <w:rPr>
+                <w:rFonts w:ascii="Consolas" w:cs="Consolas" w:eastAsia="Consolas" w:hAnsi="Consolas"/>
+                <w:b w:val="false"/>
+                <w:bCs w:val="false"/>
+                <w:sz w:val="18"/>
+                <w:szCs w:val="18"/>
+              </w:rPr>
+              <w:t xml:space="preserve">PhieuNhap</w:t>
+            </w:r>
+            <w:r>
+              <w:rPr>
+                <w:rFonts w:ascii="Arial" w:cs="Arial" w:eastAsia="Arial" w:hAnsi="Arial"/>
+                <w:b w:val="false"/>
+                <w:bCs w:val="false"/>
+                <w:sz w:val="18"/>
+                <w:szCs w:val="18"/>
+              </w:rPr>
+              <w:t xml:space="preserve">/</w:t>
+            </w:r>
+            <w:r>
+              <w:rPr>
+                <w:rFonts w:ascii="Consolas" w:cs="Consolas" w:eastAsia="Consolas" w:hAnsi="Consolas"/>
+                <w:b w:val="false"/>
+                <w:bCs w:val="false"/>
+                <w:sz w:val="18"/>
+                <w:szCs w:val="18"/>
+              </w:rPr>
+              <w:t xml:space="preserve">PhanCong</w:t>
+            </w:r>
+            <w:r>
+              <w:rPr>
+                <w:rFonts w:ascii="Arial" w:cs="Arial" w:eastAsia="Arial" w:hAnsi="Arial"/>
+                <w:b w:val="false"/>
+                <w:bCs w:val="false"/>
+                <w:sz w:val="18"/>
+                <w:szCs w:val="18"/>
+              </w:rPr>
+              <w:t xml:space="preserve"> trước hôm nay: xóa hẳn (kèm tài khoản và phân công từ hôm nay): </w:t>
+            </w:r>
+            <w:r>
+              <w:rPr>
+                <w:rFonts w:ascii="Consolas" w:cs="Consolas" w:eastAsia="Consolas" w:hAnsi="Consolas"/>
+                <w:b w:val="false"/>
+                <w:bCs w:val="false"/>
+                <w:sz w:val="18"/>
+                <w:szCs w:val="18"/>
+              </w:rPr>
+              <w:t xml:space="preserve">{ "da_xoa": true }</w:t>
+            </w:r>
+          </w:p>
+          <w:p>
+            <w:pPr>
+              <w:spacing w:after="20"/>
+            </w:pPr>
+            <w:r>
+              <w:rPr>
+                <w:rFonts w:ascii="Arial" w:cs="Arial" w:eastAsia="Arial" w:hAnsi="Arial"/>
+                <w:b w:val="false"/>
+                <w:bCs w:val="false"/>
+                <w:sz w:val="18"/>
+                <w:szCs w:val="18"/>
+              </w:rPr>
+              <w:t xml:space="preserve">Đã có lịch sử: KHÔNG xóa, đặt </w:t>
+            </w:r>
+            <w:r>
+              <w:rPr>
+                <w:rFonts w:ascii="Consolas" w:cs="Consolas" w:eastAsia="Consolas" w:hAnsi="Consolas"/>
+                <w:b w:val="false"/>
+                <w:bCs w:val="false"/>
+                <w:sz w:val="18"/>
+                <w:szCs w:val="18"/>
+              </w:rPr>
+              <w:t xml:space="preserve">trang_thai = nghi_viec</w:t>
+            </w:r>
+            <w:r>
+              <w:rPr>
+                <w:rFonts w:ascii="Arial" w:cs="Arial" w:eastAsia="Arial" w:hAnsi="Arial"/>
+                <w:b w:val="false"/>
+                <w:bCs w:val="false"/>
+                <w:sz w:val="18"/>
+                <w:szCs w:val="18"/>
+              </w:rPr>
+              <w:t xml:space="preserve">, gỡ phân công từ hôm nay: </w:t>
+            </w:r>
+            <w:r>
+              <w:rPr>
+                <w:rFonts w:ascii="Consolas" w:cs="Consolas" w:eastAsia="Consolas" w:hAnsi="Consolas"/>
+                <w:b w:val="false"/>
+                <w:bCs w:val="false"/>
+                <w:sz w:val="18"/>
+                <w:szCs w:val="18"/>
+              </w:rPr>
+              <w:t xml:space="preserve">{ "da_xoa": false, "trang_thai": "nghi_viec", "ly_do", "so_phan_cong_da_go" }</w:t>
+            </w:r>
+            <w:r>
+              <w:rPr>
+                <w:rFonts w:ascii="Arial" w:cs="Arial" w:eastAsia="Arial" w:hAnsi="Arial"/>
+                <w:b w:val="false"/>
+                <w:bCs w:val="false"/>
+                <w:sz w:val="18"/>
+                <w:szCs w:val="18"/>
+              </w:rPr>
+              <w:t xml:space="preserve"> (gọi lại vẫn 200)</w:t>
+            </w:r>
+          </w:p>
+          <w:p>
+            <w:pPr>
+              <w:spacing w:after="20"/>
+            </w:pPr>
+            <w:r>
+              <w:rPr>
+                <w:rFonts w:ascii="Arial" w:cs="Arial" w:eastAsia="Arial" w:hAnsi="Arial"/>
+                <w:b w:val="false"/>
+                <w:bCs w:val="false"/>
+                <w:sz w:val="18"/>
+                <w:szCs w:val="18"/>
+              </w:rPr>
+              <w:t xml:space="preserve">Nhân viên nghỉ việc bị chặn đăng nhập (403 </w:t>
+            </w:r>
+            <w:r>
+              <w:rPr>
+                <w:rFonts w:ascii="Consolas" w:cs="Consolas" w:eastAsia="Consolas" w:hAnsi="Consolas"/>
+                <w:b w:val="false"/>
+                <w:bCs w:val="false"/>
+                <w:sz w:val="18"/>
+                <w:szCs w:val="18"/>
+              </w:rPr>
+              <w:t xml:space="preserve">TAI_KHOAN_BI_KHOA</w:t>
+            </w:r>
+            <w:r>
+              <w:rPr>
+                <w:rFonts w:ascii="Arial" w:cs="Arial" w:eastAsia="Arial" w:hAnsi="Arial"/>
+                <w:b w:val="false"/>
+                <w:bCs w:val="false"/>
+                <w:sz w:val="18"/>
+                <w:szCs w:val="18"/>
+              </w:rPr>
+              <w:t xml:space="preserve">), token cũ mất hiệu lực ngay, không được xếp ca</w:t>
+            </w:r>
+          </w:p>
+          <w:p>
+            <w:pPr>
+              <w:spacing w:after="20"/>
+            </w:pPr>
+            <w:r>
+              <w:rPr>
+                <w:rFonts w:ascii="Arial" w:cs="Arial" w:eastAsia="Arial" w:hAnsi="Arial"/>
+                <w:b w:val="false"/>
+                <w:bCs w:val="false"/>
+                <w:sz w:val="18"/>
+                <w:szCs w:val="18"/>
+              </w:rPr>
+              <w:t xml:space="preserve">Không tự xóa mình (409 </w:t>
+            </w:r>
+            <w:r>
+              <w:rPr>
+                <w:rFonts w:ascii="Consolas" w:cs="Consolas" w:eastAsia="Consolas" w:hAnsi="Consolas"/>
+                <w:b w:val="false"/>
+                <w:bCs w:val="false"/>
+                <w:sz w:val="18"/>
+                <w:szCs w:val="18"/>
+              </w:rPr>
+              <w:t xml:space="preserve">KHONG_XOA_CHINH_MINH</w:t>
+            </w:r>
+            <w:r>
+              <w:rPr>
+                <w:rFonts w:ascii="Arial" w:cs="Arial" w:eastAsia="Arial" w:hAnsi="Arial"/>
+                <w:b w:val="false"/>
+                <w:bCs w:val="false"/>
+                <w:sz w:val="18"/>
+                <w:szCs w:val="18"/>
+              </w:rPr>
+              <w:t xml:space="preserve">), không xóa admin cuối (409 </w:t>
+            </w:r>
+            <w:r>
+              <w:rPr>
+                <w:rFonts w:ascii="Consolas" w:cs="Consolas" w:eastAsia="Consolas" w:hAnsi="Consolas"/>
+                <w:b w:val="false"/>
+                <w:bCs w:val="false"/>
+                <w:sz w:val="18"/>
+                <w:szCs w:val="18"/>
+              </w:rPr>
+              <w:t xml:space="preserve">ADMIN_CUOI_CUNG</w:t>
+            </w:r>
+            <w:r>
+              <w:rPr>
+                <w:rFonts w:ascii="Arial" w:cs="Arial" w:eastAsia="Arial" w:hAnsi="Arial"/>
+                <w:b w:val="false"/>
+                <w:bCs w:val="false"/>
+                <w:sz w:val="18"/>
+                <w:szCs w:val="18"/>
+              </w:rPr>
+              <w:t xml:space="preserve">)</w:t>
             </w:r>
           </w:p>
         </w:tc>
@@ -17599,6 +18404,16 @@
               </w:rPr>
               <w:t xml:space="preserve">{ "da_xoa": true }</w:t>
             </w:r>
+            <w:r>
+              <w:rPr>
+                <w:rFonts w:ascii="Arial" w:cs="Arial" w:eastAsia="Arial" w:hAnsi="Arial"/>
+                <w:b w:val="false"/>
+                <w:bCs w:val="false"/>
+                <w:sz w:val="18"/>
+                <w:szCs w:val="18"/>
+              </w:rPr>
+              <w:t xml:space="preserve"> hoặc như trên</w:t>
+            </w:r>
           </w:p>
         </w:tc>
         <w:tc>
@@ -17617,6 +18432,21 @@
               <w:right w:type="dxa" w:w="90"/>
             </w:tcMar>
           </w:tcPr>
+          <w:p>
+            <w:pPr>
+              <w:spacing w:after="20"/>
+            </w:pPr>
+            <w:r>
+              <w:rPr>
+                <w:rFonts w:ascii="Arial" w:cs="Arial" w:eastAsia="Arial" w:hAnsi="Arial"/>
+                <w:b w:val="false"/>
+                <w:bCs w:val="false"/>
+                <w:sz w:val="18"/>
+                <w:szCs w:val="18"/>
+              </w:rPr>
+              <w:t xml:space="preserve">404</w:t>
+            </w:r>
+          </w:p>
           <w:p>
             <w:pPr>
               <w:spacing w:after="20"/>
@@ -17772,6 +18602,26 @@
                 <w:sz w:val="18"/>
                 <w:szCs w:val="18"/>
               </w:rPr>
+              <w:t xml:space="preserve"> (≤50), </w:t>
+            </w:r>
+            <w:r>
+              <w:rPr>
+                <w:rFonts w:ascii="Consolas" w:cs="Consolas" w:eastAsia="Consolas" w:hAnsi="Consolas"/>
+                <w:b w:val="false"/>
+                <w:bCs w:val="false"/>
+                <w:sz w:val="18"/>
+                <w:szCs w:val="18"/>
+              </w:rPr>
+              <w:t xml:space="preserve">thoi_gian_bat_dau</w:t>
+            </w:r>
+            <w:r>
+              <w:rPr>
+                <w:rFonts w:ascii="Arial" w:cs="Arial" w:eastAsia="Arial" w:hAnsi="Arial"/>
+                <w:b w:val="false"/>
+                <w:bCs w:val="false"/>
+                <w:sz w:val="18"/>
+                <w:szCs w:val="18"/>
+              </w:rPr>
               <w:t xml:space="preserve">, </w:t>
             </w:r>
             <w:r>
@@ -17782,28 +18632,108 @@
                 <w:sz w:val="18"/>
                 <w:szCs w:val="18"/>
               </w:rPr>
-              <w:t xml:space="preserve">thoi_gian_bat_dau</w:t>
-            </w:r>
-            <w:r>
-              <w:rPr>
-                <w:rFonts w:ascii="Arial" w:cs="Arial" w:eastAsia="Arial" w:hAnsi="Arial"/>
-                <w:b w:val="false"/>
-                <w:bCs w:val="false"/>
-                <w:sz w:val="18"/>
-                <w:szCs w:val="18"/>
-              </w:rPr>
-              <w:t xml:space="preserve">, </w:t>
-            </w:r>
-            <w:r>
-              <w:rPr>
-                <w:rFonts w:ascii="Consolas" w:cs="Consolas" w:eastAsia="Consolas" w:hAnsi="Consolas"/>
-                <w:b w:val="false"/>
-                <w:bCs w:val="false"/>
-                <w:sz w:val="18"/>
-                <w:szCs w:val="18"/>
-              </w:rPr>
               <w:t xml:space="preserve">thoi_gian_ket_thuc</w:t>
             </w:r>
+            <w:r>
+              <w:rPr>
+                <w:rFonts w:ascii="Arial" w:cs="Arial" w:eastAsia="Arial" w:hAnsi="Arial"/>
+                <w:b w:val="false"/>
+                <w:bCs w:val="false"/>
+                <w:sz w:val="18"/>
+                <w:szCs w:val="18"/>
+              </w:rPr>
+              <w:t xml:space="preserve"> (</w:t>
+            </w:r>
+            <w:r>
+              <w:rPr>
+                <w:rFonts w:ascii="Consolas" w:cs="Consolas" w:eastAsia="Consolas" w:hAnsi="Consolas"/>
+                <w:b w:val="false"/>
+                <w:bCs w:val="false"/>
+                <w:sz w:val="18"/>
+                <w:szCs w:val="18"/>
+              </w:rPr>
+              <w:t xml:space="preserve">HH:mm</w:t>
+            </w:r>
+            <w:r>
+              <w:rPr>
+                <w:rFonts w:ascii="Arial" w:cs="Arial" w:eastAsia="Arial" w:hAnsi="Arial"/>
+                <w:b w:val="false"/>
+                <w:bCs w:val="false"/>
+                <w:sz w:val="18"/>
+                <w:szCs w:val="18"/>
+              </w:rPr>
+              <w:t xml:space="preserve"> hoặc </w:t>
+            </w:r>
+            <w:r>
+              <w:rPr>
+                <w:rFonts w:ascii="Consolas" w:cs="Consolas" w:eastAsia="Consolas" w:hAnsi="Consolas"/>
+                <w:b w:val="false"/>
+                <w:bCs w:val="false"/>
+                <w:sz w:val="18"/>
+                <w:szCs w:val="18"/>
+              </w:rPr>
+              <w:t xml:space="preserve">HH:mm:ss</w:t>
+            </w:r>
+            <w:r>
+              <w:rPr>
+                <w:rFonts w:ascii="Arial" w:cs="Arial" w:eastAsia="Arial" w:hAnsi="Arial"/>
+                <w:b w:val="false"/>
+                <w:bCs w:val="false"/>
+                <w:sz w:val="18"/>
+                <w:szCs w:val="18"/>
+              </w:rPr>
+              <w:t xml:space="preserve">; trả </w:t>
+            </w:r>
+            <w:r>
+              <w:rPr>
+                <w:rFonts w:ascii="Consolas" w:cs="Consolas" w:eastAsia="Consolas" w:hAnsi="Consolas"/>
+                <w:b w:val="false"/>
+                <w:bCs w:val="false"/>
+                <w:sz w:val="18"/>
+                <w:szCs w:val="18"/>
+              </w:rPr>
+              <w:t xml:space="preserve">HH:mm:ss</w:t>
+            </w:r>
+            <w:r>
+              <w:rPr>
+                <w:rFonts w:ascii="Arial" w:cs="Arial" w:eastAsia="Arial" w:hAnsi="Arial"/>
+                <w:b w:val="false"/>
+                <w:bCs w:val="false"/>
+                <w:sz w:val="18"/>
+                <w:szCs w:val="18"/>
+              </w:rPr>
+              <w:t xml:space="preserve">); POST/GET/GET </w:t>
+            </w:r>
+            <w:r>
+              <w:rPr>
+                <w:rFonts w:ascii="Consolas" w:cs="Consolas" w:eastAsia="Consolas" w:hAnsi="Consolas"/>
+                <w:b w:val="false"/>
+                <w:bCs w:val="false"/>
+                <w:sz w:val="18"/>
+                <w:szCs w:val="18"/>
+              </w:rPr>
+              <w:t xml:space="preserve">:ma</w:t>
+            </w:r>
+            <w:r>
+              <w:rPr>
+                <w:rFonts w:ascii="Arial" w:cs="Arial" w:eastAsia="Arial" w:hAnsi="Arial"/>
+                <w:b w:val="false"/>
+                <w:bCs w:val="false"/>
+                <w:sz w:val="18"/>
+                <w:szCs w:val="18"/>
+              </w:rPr>
+              <w:t xml:space="preserve">/PATCH/DELETE tại </w:t>
+            </w:r>
+            <w:r>
+              <w:rPr>
+                <w:rFonts w:ascii="Consolas" w:cs="Consolas" w:eastAsia="Consolas" w:hAnsi="Consolas"/>
+                <w:b w:val="false"/>
+                <w:bCs w:val="false"/>
+                <w:sz w:val="18"/>
+                <w:szCs w:val="18"/>
+              </w:rPr>
+              <w:t xml:space="preserve">/api/nhan-su/ca-lam-viec</w:t>
+            </w:r>
           </w:p>
         </w:tc>
         <w:tc>
@@ -17834,6 +18764,21 @@
                 <w:sz w:val="18"/>
                 <w:szCs w:val="18"/>
               </w:rPr>
+              <w:t xml:space="preserve">Bắt đầu phải &lt; kết thúc (không qua nửa đêm; kiểm tra trên dữ liệu đã gộp khi sửa); tên ca được trùng</w:t>
+            </w:r>
+          </w:p>
+          <w:p>
+            <w:pPr>
+              <w:spacing w:after="20"/>
+            </w:pPr>
+            <w:r>
+              <w:rPr>
+                <w:rFonts w:ascii="Arial" w:cs="Arial" w:eastAsia="Arial" w:hAnsi="Arial"/>
+                <w:b w:val="false"/>
+                <w:bCs w:val="false"/>
+                <w:sz w:val="18"/>
+                <w:szCs w:val="18"/>
+              </w:rPr>
               <w:t xml:space="preserve">Xóa bị chặn nếu đã có </w:t>
             </w:r>
             <w:r>
@@ -17846,6 +18791,61 @@
               </w:rPr>
               <w:t xml:space="preserve">PhanCong</w:t>
             </w:r>
+            <w:r>
+              <w:rPr>
+                <w:rFonts w:ascii="Arial" w:cs="Arial" w:eastAsia="Arial" w:hAnsi="Arial"/>
+                <w:b w:val="false"/>
+                <w:bCs w:val="false"/>
+                <w:sz w:val="18"/>
+                <w:szCs w:val="18"/>
+              </w:rPr>
+              <w:t xml:space="preserve">: 409 </w:t>
+            </w:r>
+            <w:r>
+              <w:rPr>
+                <w:rFonts w:ascii="Consolas" w:cs="Consolas" w:eastAsia="Consolas" w:hAnsi="Consolas"/>
+                <w:b w:val="false"/>
+                <w:bCs w:val="false"/>
+                <w:sz w:val="18"/>
+                <w:szCs w:val="18"/>
+              </w:rPr>
+              <w:t xml:space="preserve">CA_DA_CO_PHAN_CONG</w:t>
+            </w:r>
+            <w:r>
+              <w:rPr>
+                <w:rFonts w:ascii="Arial" w:cs="Arial" w:eastAsia="Arial" w:hAnsi="Arial"/>
+                <w:b w:val="false"/>
+                <w:bCs w:val="false"/>
+                <w:sz w:val="18"/>
+                <w:szCs w:val="18"/>
+              </w:rPr>
+              <w:t xml:space="preserve"> (khóa dòng ca + khóa ngoại là chốt cuối)</w:t>
+            </w:r>
+          </w:p>
+          <w:p>
+            <w:pPr>
+              <w:spacing w:after="20"/>
+            </w:pPr>
+            <w:r>
+              <w:rPr>
+                <w:rFonts w:ascii="Arial" w:cs="Arial" w:eastAsia="Arial" w:hAnsi="Arial"/>
+                <w:b w:val="false"/>
+                <w:bCs w:val="false"/>
+                <w:sz w:val="18"/>
+                <w:szCs w:val="18"/>
+              </w:rPr>
+              <w:t xml:space="preserve">Danh sách kèm </w:t>
+            </w:r>
+            <w:r>
+              <w:rPr>
+                <w:rFonts w:ascii="Consolas" w:cs="Consolas" w:eastAsia="Consolas" w:hAnsi="Consolas"/>
+                <w:b w:val="false"/>
+                <w:bCs w:val="false"/>
+                <w:sz w:val="18"/>
+                <w:szCs w:val="18"/>
+              </w:rPr>
+              <w:t xml:space="preserve">so_phan_cong</w:t>
+            </w:r>
           </w:p>
         </w:tc>
         <w:tc>
@@ -17896,6 +18896,36 @@
               <w:right w:type="dxa" w:w="90"/>
             </w:tcMar>
           </w:tcPr>
+          <w:p>
+            <w:pPr>
+              <w:spacing w:after="20"/>
+            </w:pPr>
+            <w:r>
+              <w:rPr>
+                <w:rFonts w:ascii="Arial" w:cs="Arial" w:eastAsia="Arial" w:hAnsi="Arial"/>
+                <w:b w:val="false"/>
+                <w:bCs w:val="false"/>
+                <w:sz w:val="18"/>
+                <w:szCs w:val="18"/>
+              </w:rPr>
+              <w:t xml:space="preserve">400</w:t>
+            </w:r>
+          </w:p>
+          <w:p>
+            <w:pPr>
+              <w:spacing w:after="20"/>
+            </w:pPr>
+            <w:r>
+              <w:rPr>
+                <w:rFonts w:ascii="Arial" w:cs="Arial" w:eastAsia="Arial" w:hAnsi="Arial"/>
+                <w:b w:val="false"/>
+                <w:bCs w:val="false"/>
+                <w:sz w:val="18"/>
+                <w:szCs w:val="18"/>
+              </w:rPr>
+              <w:t xml:space="preserve">404</w:t>
+            </w:r>
+          </w:p>
           <w:p>
             <w:pPr>
               <w:spacing w:after="20"/>
@@ -18091,7 +19121,27 @@
                 <w:sz w:val="18"/>
                 <w:szCs w:val="18"/>
               </w:rPr>
-              <w:t xml:space="preserve"> (hoặc mảng nhiều ngày)</w:t>
+              <w:t xml:space="preserve"> (một ngày </w:t>
+            </w:r>
+            <w:r>
+              <w:rPr>
+                <w:rFonts w:ascii="Consolas" w:cs="Consolas" w:eastAsia="Consolas" w:hAnsi="Consolas"/>
+                <w:b w:val="false"/>
+                <w:bCs w:val="false"/>
+                <w:sz w:val="18"/>
+                <w:szCs w:val="18"/>
+              </w:rPr>
+              <w:t xml:space="preserve">YYYY-MM-DD</w:t>
+            </w:r>
+            <w:r>
+              <w:rPr>
+                <w:rFonts w:ascii="Arial" w:cs="Arial" w:eastAsia="Arial" w:hAnsi="Arial"/>
+                <w:b w:val="false"/>
+                <w:bCs w:val="false"/>
+                <w:sz w:val="18"/>
+                <w:szCs w:val="18"/>
+              </w:rPr>
+              <w:t xml:space="preserve"> hoặc mảng 1–62 ngày không trùng)</w:t>
             </w:r>
           </w:p>
         </w:tc>
@@ -18123,7 +19173,102 @@
                 <w:sz w:val="18"/>
                 <w:szCs w:val="18"/>
               </w:rPr>
-              <w:t xml:space="preserve">Khóa chính chặn trùng; ngày ≥ hôm nay</w:t>
+              <w:t xml:space="preserve">Chỉ ngày ≥ hôm nay (theo ngày của DB): 400</w:t>
+            </w:r>
+          </w:p>
+          <w:p>
+            <w:pPr>
+              <w:spacing w:after="20"/>
+            </w:pPr>
+            <w:r>
+              <w:rPr>
+                <w:rFonts w:ascii="Arial" w:cs="Arial" w:eastAsia="Arial" w:hAnsi="Arial"/>
+                <w:b w:val="false"/>
+                <w:bCs w:val="false"/>
+                <w:sz w:val="18"/>
+                <w:szCs w:val="18"/>
+              </w:rPr>
+              <w:t xml:space="preserve">Nhân viên nghỉ việc: 409 </w:t>
+            </w:r>
+            <w:r>
+              <w:rPr>
+                <w:rFonts w:ascii="Consolas" w:cs="Consolas" w:eastAsia="Consolas" w:hAnsi="Consolas"/>
+                <w:b w:val="false"/>
+                <w:bCs w:val="false"/>
+                <w:sz w:val="18"/>
+                <w:szCs w:val="18"/>
+              </w:rPr>
+              <w:t xml:space="preserve">NHAN_VIEN_NGHI_VIEC</w:t>
+            </w:r>
+          </w:p>
+          <w:p>
+            <w:pPr>
+              <w:spacing w:after="20"/>
+            </w:pPr>
+            <w:r>
+              <w:rPr>
+                <w:rFonts w:ascii="Arial" w:cs="Arial" w:eastAsia="Arial" w:hAnsi="Arial"/>
+                <w:b w:val="false"/>
+                <w:bCs w:val="false"/>
+                <w:sz w:val="18"/>
+                <w:szCs w:val="18"/>
+              </w:rPr>
+              <w:t xml:space="preserve">Tất cả hoặc không gì: có ngày đã xếp → 409 </w:t>
+            </w:r>
+            <w:r>
+              <w:rPr>
+                <w:rFonts w:ascii="Consolas" w:cs="Consolas" w:eastAsia="Consolas" w:hAnsi="Consolas"/>
+                <w:b w:val="false"/>
+                <w:bCs w:val="false"/>
+                <w:sz w:val="18"/>
+                <w:szCs w:val="18"/>
+              </w:rPr>
+              <w:t xml:space="preserve">DA_XEP_LICH</w:t>
+            </w:r>
+            <w:r>
+              <w:rPr>
+                <w:rFonts w:ascii="Arial" w:cs="Arial" w:eastAsia="Arial" w:hAnsi="Arial"/>
+                <w:b w:val="false"/>
+                <w:bCs w:val="false"/>
+                <w:sz w:val="18"/>
+                <w:szCs w:val="18"/>
+              </w:rPr>
+              <w:t xml:space="preserve"> (</w:t>
+            </w:r>
+            <w:r>
+              <w:rPr>
+                <w:rFonts w:ascii="Consolas" w:cs="Consolas" w:eastAsia="Consolas" w:hAnsi="Consolas"/>
+                <w:b w:val="false"/>
+                <w:bCs w:val="false"/>
+                <w:sz w:val="18"/>
+                <w:szCs w:val="18"/>
+              </w:rPr>
+              <w:t xml:space="preserve">chi_tiet.ngay_da_xep</w:t>
+            </w:r>
+            <w:r>
+              <w:rPr>
+                <w:rFonts w:ascii="Arial" w:cs="Arial" w:eastAsia="Arial" w:hAnsi="Arial"/>
+                <w:b w:val="false"/>
+                <w:bCs w:val="false"/>
+                <w:sz w:val="18"/>
+                <w:szCs w:val="18"/>
+              </w:rPr>
+              <w:t xml:space="preserve">); khóa chính chặn cả khi hai yêu cầu chạy song song</w:t>
+            </w:r>
+          </w:p>
+          <w:p>
+            <w:pPr>
+              <w:spacing w:after="20"/>
+            </w:pPr>
+            <w:r>
+              <w:rPr>
+                <w:rFonts w:ascii="Arial" w:cs="Arial" w:eastAsia="Arial" w:hAnsi="Arial"/>
+                <w:b w:val="false"/>
+                <w:bCs w:val="false"/>
+                <w:sz w:val="18"/>
+                <w:szCs w:val="18"/>
+              </w:rPr>
+              <w:t xml:space="preserve">Một nhân viên được nhiều ca khác nhau trong cùng ngày</w:t>
             </w:r>
           </w:p>
         </w:tc>
@@ -18155,7 +19300,7 @@
                 <w:sz w:val="18"/>
                 <w:szCs w:val="18"/>
               </w:rPr>
-              <w:t xml:space="preserve">Danh sách phân công vừa tạo</w:t>
+              <w:t xml:space="preserve">Danh sách phân công vừa tạo, sắp theo ngày</w:t>
             </w:r>
           </w:p>
         </w:tc>
@@ -18187,7 +19332,37 @@
                 <w:sz w:val="18"/>
                 <w:szCs w:val="18"/>
               </w:rPr>
-              <w:t xml:space="preserve">409 đã xếp</w:t>
+              <w:t xml:space="preserve">400</w:t>
+            </w:r>
+          </w:p>
+          <w:p>
+            <w:pPr>
+              <w:spacing w:after="20"/>
+            </w:pPr>
+            <w:r>
+              <w:rPr>
+                <w:rFonts w:ascii="Arial" w:cs="Arial" w:eastAsia="Arial" w:hAnsi="Arial"/>
+                <w:b w:val="false"/>
+                <w:bCs w:val="false"/>
+                <w:sz w:val="18"/>
+                <w:szCs w:val="18"/>
+              </w:rPr>
+              <w:t xml:space="preserve">404</w:t>
+            </w:r>
+          </w:p>
+          <w:p>
+            <w:pPr>
+              <w:spacing w:after="20"/>
+            </w:pPr>
+            <w:r>
+              <w:rPr>
+                <w:rFonts w:ascii="Arial" w:cs="Arial" w:eastAsia="Arial" w:hAnsi="Arial"/>
+                <w:b w:val="false"/>
+                <w:bCs w:val="false"/>
+                <w:sz w:val="18"/>
+                <w:szCs w:val="18"/>
+              </w:rPr>
+              <w:t xml:space="preserve">409</w:t>
             </w:r>
           </w:p>
         </w:tc>
@@ -18314,6 +19489,16 @@
             </w:pPr>
             <w:r>
               <w:rPr>
+                <w:rFonts w:ascii="Arial" w:cs="Arial" w:eastAsia="Arial" w:hAnsi="Arial"/>
+                <w:b w:val="false"/>
+                <w:bCs w:val="false"/>
+                <w:sz w:val="18"/>
+                <w:szCs w:val="18"/>
+              </w:rPr>
+              <w:t xml:space="preserve">Query </w:t>
+            </w:r>
+            <w:r>
+              <w:rPr>
                 <w:rFonts w:ascii="Consolas" w:cs="Consolas" w:eastAsia="Consolas" w:hAnsi="Consolas"/>
                 <w:b w:val="false"/>
                 <w:bCs w:val="false"/>
@@ -18362,6 +19547,36 @@
               </w:rPr>
               <w:t xml:space="preserve">ngay_lam</w:t>
             </w:r>
+            <w:r>
+              <w:rPr>
+                <w:rFonts w:ascii="Arial" w:cs="Arial" w:eastAsia="Arial" w:hAnsi="Arial"/>
+                <w:b w:val="false"/>
+                <w:bCs w:val="false"/>
+                <w:sz w:val="18"/>
+                <w:szCs w:val="18"/>
+              </w:rPr>
+              <w:t xml:space="preserve"> (</w:t>
+            </w:r>
+            <w:r>
+              <w:rPr>
+                <w:rFonts w:ascii="Consolas" w:cs="Consolas" w:eastAsia="Consolas" w:hAnsi="Consolas"/>
+                <w:b w:val="false"/>
+                <w:bCs w:val="false"/>
+                <w:sz w:val="18"/>
+                <w:szCs w:val="18"/>
+              </w:rPr>
+              <w:t xml:space="preserve">DELETE /api/nhan-su/phan-cong</w:t>
+            </w:r>
+            <w:r>
+              <w:rPr>
+                <w:rFonts w:ascii="Arial" w:cs="Arial" w:eastAsia="Arial" w:hAnsi="Arial"/>
+                <w:b w:val="false"/>
+                <w:bCs w:val="false"/>
+                <w:sz w:val="18"/>
+                <w:szCs w:val="18"/>
+              </w:rPr>
+              <w:t xml:space="preserve">)</w:t>
+            </w:r>
           </w:p>
         </w:tc>
         <w:tc>
@@ -18384,6 +19599,16 @@
             <w:pPr>
               <w:spacing w:after="20"/>
             </w:pPr>
+            <w:r>
+              <w:rPr>
+                <w:rFonts w:ascii="Arial" w:cs="Arial" w:eastAsia="Arial" w:hAnsi="Arial"/>
+                <w:b w:val="false"/>
+                <w:bCs w:val="false"/>
+                <w:sz w:val="18"/>
+                <w:szCs w:val="18"/>
+              </w:rPr>
+              <w:t xml:space="preserve">Xóa được cả ngày đã qua</w:t>
+            </w:r>
           </w:p>
         </w:tc>
         <w:tc>
@@ -18434,6 +19659,21 @@
               <w:right w:type="dxa" w:w="90"/>
             </w:tcMar>
           </w:tcPr>
+          <w:p>
+            <w:pPr>
+              <w:spacing w:after="20"/>
+            </w:pPr>
+            <w:r>
+              <w:rPr>
+                <w:rFonts w:ascii="Arial" w:cs="Arial" w:eastAsia="Arial" w:hAnsi="Arial"/>
+                <w:b w:val="false"/>
+                <w:bCs w:val="false"/>
+                <w:sz w:val="18"/>
+                <w:szCs w:val="18"/>
+              </w:rPr>
+              <w:t xml:space="preserve">400</w:t>
+            </w:r>
+          </w:p>
           <w:p>
             <w:pPr>
               <w:spacing w:after="20"/>
@@ -18547,7 +19787,7 @@
                 <w:sz w:val="18"/>
                 <w:szCs w:val="18"/>
               </w:rPr>
-              <w:t xml:space="preserve">A/Q (N chỉ của mình)</w:t>
+              <w:t xml:space="preserve">A/Q xem tất cả hoặc lọc; N chỉ của mình</w:t>
             </w:r>
           </w:p>
         </w:tc>
@@ -18573,6 +19813,108 @@
             </w:pPr>
             <w:r>
               <w:rPr>
+                <w:rFonts w:ascii="Arial" w:cs="Arial" w:eastAsia="Arial" w:hAnsi="Arial"/>
+                <w:b w:val="false"/>
+                <w:bCs w:val="false"/>
+                <w:sz w:val="18"/>
+                <w:szCs w:val="18"/>
+              </w:rPr>
+              <w:t xml:space="preserve">Query </w:t>
+            </w:r>
+            <w:r>
+              <w:rPr>
+                <w:rFonts w:ascii="Consolas" w:cs="Consolas" w:eastAsia="Consolas" w:hAnsi="Consolas"/>
+                <w:b w:val="false"/>
+                <w:bCs w:val="false"/>
+                <w:sz w:val="18"/>
+                <w:szCs w:val="18"/>
+              </w:rPr>
+              <w:t xml:space="preserve">tu_ngay?</w:t>
+            </w:r>
+            <w:r>
+              <w:rPr>
+                <w:rFonts w:ascii="Arial" w:cs="Arial" w:eastAsia="Arial" w:hAnsi="Arial"/>
+                <w:b w:val="false"/>
+                <w:bCs w:val="false"/>
+                <w:sz w:val="18"/>
+                <w:szCs w:val="18"/>
+              </w:rPr>
+              <w:t xml:space="preserve"> (phải là thứ Hai; mặc định thứ Hai tuần hiện tại), </w:t>
+            </w:r>
+            <w:r>
+              <w:rPr>
+                <w:rFonts w:ascii="Consolas" w:cs="Consolas" w:eastAsia="Consolas" w:hAnsi="Consolas"/>
+                <w:b w:val="false"/>
+                <w:bCs w:val="false"/>
+                <w:sz w:val="18"/>
+                <w:szCs w:val="18"/>
+              </w:rPr>
+              <w:t xml:space="preserve">ma_nhan_vien?</w:t>
+            </w:r>
+            <w:r>
+              <w:rPr>
+                <w:rFonts w:ascii="Arial" w:cs="Arial" w:eastAsia="Arial" w:hAnsi="Arial"/>
+                <w:b w:val="false"/>
+                <w:bCs w:val="false"/>
+                <w:sz w:val="18"/>
+                <w:szCs w:val="18"/>
+              </w:rPr>
+              <w:t xml:space="preserve"> (</w:t>
+            </w:r>
+            <w:r>
+              <w:rPr>
+                <w:rFonts w:ascii="Consolas" w:cs="Consolas" w:eastAsia="Consolas" w:hAnsi="Consolas"/>
+                <w:b w:val="false"/>
+                <w:bCs w:val="false"/>
+                <w:sz w:val="18"/>
+                <w:szCs w:val="18"/>
+              </w:rPr>
+              <w:t xml:space="preserve">GET /api/nhan-su/lich-tuan</w:t>
+            </w:r>
+            <w:r>
+              <w:rPr>
+                <w:rFonts w:ascii="Arial" w:cs="Arial" w:eastAsia="Arial" w:hAnsi="Arial"/>
+                <w:b w:val="false"/>
+                <w:bCs w:val="false"/>
+                <w:sz w:val="18"/>
+                <w:szCs w:val="18"/>
+              </w:rPr>
+              <w:t xml:space="preserve">)</w:t>
+            </w:r>
+          </w:p>
+        </w:tc>
+        <w:tc>
+          <w:tcPr>
+            <w:tcW w:type="dxa" w:w="3900"/>
+            <w:tcBorders>
+              <w:top w:val="single" w:color="BFBFBF" w:sz="4"/>
+              <w:left w:val="single" w:color="BFBFBF" w:sz="4"/>
+              <w:bottom w:val="single" w:color="BFBFBF" w:sz="4"/>
+              <w:right w:val="single" w:color="BFBFBF" w:sz="4"/>
+            </w:tcBorders>
+            <w:tcMar>
+              <w:top w:type="dxa" w:w="60"/>
+              <w:left w:type="dxa" w:w="90"/>
+              <w:bottom w:type="dxa" w:w="60"/>
+              <w:right w:type="dxa" w:w="90"/>
+            </w:tcMar>
+          </w:tcPr>
+          <w:p>
+            <w:pPr>
+              <w:spacing w:after="20"/>
+            </w:pPr>
+            <w:r>
+              <w:rPr>
+                <w:rFonts w:ascii="Arial" w:cs="Arial" w:eastAsia="Arial" w:hAnsi="Arial"/>
+                <w:b w:val="false"/>
+                <w:bCs w:val="false"/>
+                <w:sz w:val="18"/>
+                <w:szCs w:val="18"/>
+              </w:rPr>
+              <w:t xml:space="preserve">Cửa sổ 7 ngày [</w:t>
+            </w:r>
+            <w:r>
+              <w:rPr>
                 <w:rFonts w:ascii="Consolas" w:cs="Consolas" w:eastAsia="Consolas" w:hAnsi="Consolas"/>
                 <w:b w:val="false"/>
                 <w:bCs w:val="false"/>
@@ -18589,68 +19931,6 @@
                 <w:sz w:val="18"/>
                 <w:szCs w:val="18"/>
               </w:rPr>
-              <w:t xml:space="preserve"> (đầu tuần), </w:t>
-            </w:r>
-            <w:r>
-              <w:rPr>
-                <w:rFonts w:ascii="Consolas" w:cs="Consolas" w:eastAsia="Consolas" w:hAnsi="Consolas"/>
-                <w:b w:val="false"/>
-                <w:bCs w:val="false"/>
-                <w:sz w:val="18"/>
-                <w:szCs w:val="18"/>
-              </w:rPr>
-              <w:t xml:space="preserve">ma_nhan_vien?</w:t>
-            </w:r>
-          </w:p>
-        </w:tc>
-        <w:tc>
-          <w:tcPr>
-            <w:tcW w:type="dxa" w:w="3900"/>
-            <w:tcBorders>
-              <w:top w:val="single" w:color="BFBFBF" w:sz="4"/>
-              <w:left w:val="single" w:color="BFBFBF" w:sz="4"/>
-              <w:bottom w:val="single" w:color="BFBFBF" w:sz="4"/>
-              <w:right w:val="single" w:color="BFBFBF" w:sz="4"/>
-            </w:tcBorders>
-            <w:tcMar>
-              <w:top w:type="dxa" w:w="60"/>
-              <w:left w:type="dxa" w:w="90"/>
-              <w:bottom w:type="dxa" w:w="60"/>
-              <w:right w:type="dxa" w:w="90"/>
-            </w:tcMar>
-          </w:tcPr>
-          <w:p>
-            <w:pPr>
-              <w:spacing w:after="20"/>
-            </w:pPr>
-            <w:r>
-              <w:rPr>
-                <w:rFonts w:ascii="Arial" w:cs="Arial" w:eastAsia="Arial" w:hAnsi="Arial"/>
-                <w:b w:val="false"/>
-                <w:bCs w:val="false"/>
-                <w:sz w:val="18"/>
-                <w:szCs w:val="18"/>
-              </w:rPr>
-              <w:t xml:space="preserve">Join </w:t>
-            </w:r>
-            <w:r>
-              <w:rPr>
-                <w:rFonts w:ascii="Consolas" w:cs="Consolas" w:eastAsia="Consolas" w:hAnsi="Consolas"/>
-                <w:b w:val="false"/>
-                <w:bCs w:val="false"/>
-                <w:sz w:val="18"/>
-                <w:szCs w:val="18"/>
-              </w:rPr>
-              <w:t xml:space="preserve">PhanCong</w:t>
-            </w:r>
-            <w:r>
-              <w:rPr>
-                <w:rFonts w:ascii="Arial" w:cs="Arial" w:eastAsia="Arial" w:hAnsi="Arial"/>
-                <w:b w:val="false"/>
-                <w:bCs w:val="false"/>
-                <w:sz w:val="18"/>
-                <w:szCs w:val="18"/>
-              </w:rPr>
               <w:t xml:space="preserve">, </w:t>
             </w:r>
             <w:r>
@@ -18661,27 +19941,32 @@
                 <w:sz w:val="18"/>
                 <w:szCs w:val="18"/>
               </w:rPr>
-              <w:t xml:space="preserve">CaLamViec</w:t>
-            </w:r>
-            <w:r>
-              <w:rPr>
-                <w:rFonts w:ascii="Arial" w:cs="Arial" w:eastAsia="Arial" w:hAnsi="Arial"/>
-                <w:b w:val="false"/>
-                <w:bCs w:val="false"/>
-                <w:sz w:val="18"/>
-                <w:szCs w:val="18"/>
-              </w:rPr>
-              <w:t xml:space="preserve">, </w:t>
-            </w:r>
-            <w:r>
-              <w:rPr>
-                <w:rFonts w:ascii="Consolas" w:cs="Consolas" w:eastAsia="Consolas" w:hAnsi="Consolas"/>
-                <w:b w:val="false"/>
-                <w:bCs w:val="false"/>
-                <w:sz w:val="18"/>
-                <w:szCs w:val="18"/>
-              </w:rPr>
-              <w:t xml:space="preserve">NhanVien</w:t>
+              <w:t xml:space="preserve">tu_ngay</w:t>
+            </w:r>
+            <w:r>
+              <w:rPr>
+                <w:rFonts w:ascii="Arial" w:cs="Arial" w:eastAsia="Arial" w:hAnsi="Arial"/>
+                <w:b w:val="false"/>
+                <w:bCs w:val="false"/>
+                <w:sz w:val="18"/>
+                <w:szCs w:val="18"/>
+              </w:rPr>
+              <w:t xml:space="preserve">+6]; sắp theo ngày, giờ ca</w:t>
+            </w:r>
+          </w:p>
+          <w:p>
+            <w:pPr>
+              <w:spacing w:after="20"/>
+            </w:pPr>
+            <w:r>
+              <w:rPr>
+                <w:rFonts w:ascii="Arial" w:cs="Arial" w:eastAsia="Arial" w:hAnsi="Arial"/>
+                <w:b w:val="false"/>
+                <w:bCs w:val="false"/>
+                <w:sz w:val="18"/>
+                <w:szCs w:val="18"/>
+              </w:rPr>
+              <w:t xml:space="preserve">N xin lịch người khác: 403; để trống = lịch của mình</w:t>
             </w:r>
           </w:p>
         </w:tc>
@@ -18707,23 +19992,13 @@
             </w:pPr>
             <w:r>
               <w:rPr>
-                <w:rFonts w:ascii="Arial" w:cs="Arial" w:eastAsia="Arial" w:hAnsi="Arial"/>
-                <w:b w:val="false"/>
-                <w:bCs w:val="false"/>
-                <w:sz w:val="18"/>
-                <w:szCs w:val="18"/>
-              </w:rPr>
-              <w:t xml:space="preserve">Mảng </w:t>
-            </w:r>
-            <w:r>
-              <w:rPr>
-                <w:rFonts w:ascii="Consolas" w:cs="Consolas" w:eastAsia="Consolas" w:hAnsi="Consolas"/>
-                <w:b w:val="false"/>
-                <w:bCs w:val="false"/>
-                <w:sz w:val="18"/>
-                <w:szCs w:val="18"/>
-              </w:rPr>
-              <w:t xml:space="preserve">{ngay_lam, ten_ca, gio, ho_ten}</w:t>
+                <w:rFonts w:ascii="Consolas" w:cs="Consolas" w:eastAsia="Consolas" w:hAnsi="Consolas"/>
+                <w:b w:val="false"/>
+                <w:bCs w:val="false"/>
+                <w:sz w:val="18"/>
+                <w:szCs w:val="18"/>
+              </w:rPr>
+              <w:t xml:space="preserve">{ ok, data: [{ngay_lam, ma_ca, ten_ca, thoi_gian_bat_dau, thoi_gian_ket_thuc, ma_nhan_vien, ho_ten}], tu_ngay, den_ngay }</w:t>
             </w:r>
           </w:p>
         </w:tc>
@@ -18747,6 +20022,46 @@
             <w:pPr>
               <w:spacing w:after="20"/>
             </w:pPr>
+            <w:r>
+              <w:rPr>
+                <w:rFonts w:ascii="Arial" w:cs="Arial" w:eastAsia="Arial" w:hAnsi="Arial"/>
+                <w:b w:val="false"/>
+                <w:bCs w:val="false"/>
+                <w:sz w:val="18"/>
+                <w:szCs w:val="18"/>
+              </w:rPr>
+              <w:t xml:space="preserve">400</w:t>
+            </w:r>
+          </w:p>
+          <w:p>
+            <w:pPr>
+              <w:spacing w:after="20"/>
+            </w:pPr>
+            <w:r>
+              <w:rPr>
+                <w:rFonts w:ascii="Arial" w:cs="Arial" w:eastAsia="Arial" w:hAnsi="Arial"/>
+                <w:b w:val="false"/>
+                <w:bCs w:val="false"/>
+                <w:sz w:val="18"/>
+                <w:szCs w:val="18"/>
+              </w:rPr>
+              <w:t xml:space="preserve">401</w:t>
+            </w:r>
+          </w:p>
+          <w:p>
+            <w:pPr>
+              <w:spacing w:after="20"/>
+            </w:pPr>
+            <w:r>
+              <w:rPr>
+                <w:rFonts w:ascii="Arial" w:cs="Arial" w:eastAsia="Arial" w:hAnsi="Arial"/>
+                <w:b w:val="false"/>
+                <w:bCs w:val="false"/>
+                <w:sz w:val="18"/>
+                <w:szCs w:val="18"/>
+              </w:rPr>
+              <w:t xml:space="preserve">403</w:t>
+            </w:r>
           </w:p>
         </w:tc>
       </w:tr>
@@ -19043,13 +20358,23 @@
             </w:pPr>
             <w:r>
               <w:rPr>
-                <w:rFonts w:ascii="Consolas" w:cs="Consolas" w:eastAsia="Consolas" w:hAnsi="Consolas"/>
-                <w:b w:val="false"/>
-                <w:bCs w:val="false"/>
-                <w:sz w:val="18"/>
-                <w:szCs w:val="18"/>
-              </w:rPr>
-              <w:t xml:space="preserve">tu_ngay</w:t>
+                <w:rFonts w:ascii="Arial" w:cs="Arial" w:eastAsia="Arial" w:hAnsi="Arial"/>
+                <w:b w:val="false"/>
+                <w:bCs w:val="false"/>
+                <w:sz w:val="18"/>
+                <w:szCs w:val="18"/>
+              </w:rPr>
+              <w:t xml:space="preserve">Query </w:t>
+            </w:r>
+            <w:r>
+              <w:rPr>
+                <w:rFonts w:ascii="Consolas" w:cs="Consolas" w:eastAsia="Consolas" w:hAnsi="Consolas"/>
+                <w:b w:val="false"/>
+                <w:bCs w:val="false"/>
+                <w:sz w:val="18"/>
+                <w:szCs w:val="18"/>
+              </w:rPr>
+              <w:t xml:space="preserve">tu_ngay?</w:t>
             </w:r>
             <w:r>
               <w:rPr>
@@ -19069,7 +20394,7 @@
                 <w:sz w:val="18"/>
                 <w:szCs w:val="18"/>
               </w:rPr>
-              <w:t xml:space="preserve">den_ngay</w:t>
+              <w:t xml:space="preserve">den_ngay?</w:t>
             </w:r>
             <w:r>
               <w:rPr>
@@ -19089,7 +20414,7 @@
                 <w:sz w:val="18"/>
                 <w:szCs w:val="18"/>
               </w:rPr>
-              <w:t xml:space="preserve">nhom</w:t>
+              <w:t xml:space="preserve">nhom?</w:t>
             </w:r>
             <w:r>
               <w:rPr>
@@ -19119,7 +20444,7 @@
                 <w:sz w:val="18"/>
                 <w:szCs w:val="18"/>
               </w:rPr>
-              <w:t xml:space="preserve">/</w:t>
+              <w:t xml:space="preserve"> mặc định / </w:t>
             </w:r>
             <w:r>
               <w:rPr>
@@ -19139,7 +20464,7 @@
                 <w:sz w:val="18"/>
                 <w:szCs w:val="18"/>
               </w:rPr>
-              <w:t xml:space="preserve">/</w:t>
+              <w:t xml:space="preserve"> / </w:t>
             </w:r>
             <w:r>
               <w:rPr>
@@ -19159,7 +20484,17 @@
                 <w:sz w:val="18"/>
                 <w:szCs w:val="18"/>
               </w:rPr>
-              <w:t xml:space="preserve">)</w:t>
+              <w:t xml:space="preserve">) — </w:t>
+            </w:r>
+            <w:r>
+              <w:rPr>
+                <w:rFonts w:ascii="Consolas" w:cs="Consolas" w:eastAsia="Consolas" w:hAnsi="Consolas"/>
+                <w:b w:val="false"/>
+                <w:bCs w:val="false"/>
+                <w:sz w:val="18"/>
+                <w:szCs w:val="18"/>
+              </w:rPr>
+              <w:t xml:space="preserve">GET /api/bao-cao/doanh-thu</w:t>
             </w:r>
           </w:p>
         </w:tc>
@@ -19191,57 +20526,57 @@
                 <w:sz w:val="18"/>
                 <w:szCs w:val="18"/>
               </w:rPr>
-              <w:t xml:space="preserve">HoaDon</w:t>
-            </w:r>
-            <w:r>
-              <w:rPr>
-                <w:rFonts w:ascii="Arial" w:cs="Arial" w:eastAsia="Arial" w:hAnsi="Arial"/>
-                <w:b w:val="false"/>
-                <w:bCs w:val="false"/>
-                <w:sz w:val="18"/>
-                <w:szCs w:val="18"/>
-              </w:rPr>
-              <w:t xml:space="preserve"> </w:t>
-            </w:r>
-            <w:r>
-              <w:rPr>
-                <w:rFonts w:ascii="Consolas" w:cs="Consolas" w:eastAsia="Consolas" w:hAnsi="Consolas"/>
-                <w:b w:val="false"/>
-                <w:bCs w:val="false"/>
-                <w:sz w:val="18"/>
-                <w:szCs w:val="18"/>
-              </w:rPr>
-              <w:t xml:space="preserve">da_thanh_toan</w:t>
-            </w:r>
-            <w:r>
-              <w:rPr>
-                <w:rFonts w:ascii="Arial" w:cs="Arial" w:eastAsia="Arial" w:hAnsi="Arial"/>
-                <w:b w:val="false"/>
-                <w:bCs w:val="false"/>
-                <w:sz w:val="18"/>
-                <w:szCs w:val="18"/>
-              </w:rPr>
-              <w:t xml:space="preserve">, </w:t>
-            </w:r>
-            <w:r>
-              <w:rPr>
-                <w:rFonts w:ascii="Consolas" w:cs="Consolas" w:eastAsia="Consolas" w:hAnsi="Consolas"/>
-                <w:b w:val="false"/>
-                <w:bCs w:val="false"/>
-                <w:sz w:val="18"/>
-                <w:szCs w:val="18"/>
-              </w:rPr>
-              <w:t xml:space="preserve">GROUP BY DATE(thoi_gian_tao)</w:t>
-            </w:r>
-            <w:r>
-              <w:rPr>
-                <w:rFonts w:ascii="Arial" w:cs="Arial" w:eastAsia="Arial" w:hAnsi="Arial"/>
-                <w:b w:val="false"/>
-                <w:bCs w:val="false"/>
-                <w:sz w:val="18"/>
-                <w:szCs w:val="18"/>
-              </w:rPr>
-              <w:t xml:space="preserve">…</w:t>
+              <w:t xml:space="preserve">HoaDonDaThanhToan</w:t>
+            </w:r>
+            <w:r>
+              <w:rPr>
+                <w:rFonts w:ascii="Arial" w:cs="Arial" w:eastAsia="Arial" w:hAnsi="Arial"/>
+                <w:b w:val="false"/>
+                <w:bCs w:val="false"/>
+                <w:sz w:val="18"/>
+                <w:szCs w:val="18"/>
+              </w:rPr>
+              <w:t xml:space="preserve"> lọc theo ngày thanh toán (gồm cả hai đầu); kỳ: ngày </w:t>
+            </w:r>
+            <w:r>
+              <w:rPr>
+                <w:rFonts w:ascii="Consolas" w:cs="Consolas" w:eastAsia="Consolas" w:hAnsi="Consolas"/>
+                <w:b w:val="false"/>
+                <w:bCs w:val="false"/>
+                <w:sz w:val="18"/>
+                <w:szCs w:val="18"/>
+              </w:rPr>
+              <w:t xml:space="preserve">YYYY-MM-DD</w:t>
+            </w:r>
+            <w:r>
+              <w:rPr>
+                <w:rFonts w:ascii="Arial" w:cs="Arial" w:eastAsia="Arial" w:hAnsi="Arial"/>
+                <w:b w:val="false"/>
+                <w:bCs w:val="false"/>
+                <w:sz w:val="18"/>
+                <w:szCs w:val="18"/>
+              </w:rPr>
+              <w:t xml:space="preserve">, tuần = ngày thứ Hai đầu tuần, tháng </w:t>
+            </w:r>
+            <w:r>
+              <w:rPr>
+                <w:rFonts w:ascii="Consolas" w:cs="Consolas" w:eastAsia="Consolas" w:hAnsi="Consolas"/>
+                <w:b w:val="false"/>
+                <w:bCs w:val="false"/>
+                <w:sz w:val="18"/>
+                <w:szCs w:val="18"/>
+              </w:rPr>
+              <w:t xml:space="preserve">YYYY-MM</w:t>
+            </w:r>
+            <w:r>
+              <w:rPr>
+                <w:rFonts w:ascii="Arial" w:cs="Arial" w:eastAsia="Arial" w:hAnsi="Arial"/>
+                <w:b w:val="false"/>
+                <w:bCs w:val="false"/>
+                <w:sz w:val="18"/>
+                <w:szCs w:val="18"/>
+              </w:rPr>
+              <w:t xml:space="preserve">; chỉ kỳ có dữ liệu, sắp tăng dần</w:t>
             </w:r>
           </w:p>
         </w:tc>
@@ -19378,13 +20713,23 @@
             </w:pPr>
             <w:r>
               <w:rPr>
-                <w:rFonts w:ascii="Consolas" w:cs="Consolas" w:eastAsia="Consolas" w:hAnsi="Consolas"/>
-                <w:b w:val="false"/>
-                <w:bCs w:val="false"/>
-                <w:sz w:val="18"/>
-                <w:szCs w:val="18"/>
-              </w:rPr>
-              <w:t xml:space="preserve">tu_ngay</w:t>
+                <w:rFonts w:ascii="Arial" w:cs="Arial" w:eastAsia="Arial" w:hAnsi="Arial"/>
+                <w:b w:val="false"/>
+                <w:bCs w:val="false"/>
+                <w:sz w:val="18"/>
+                <w:szCs w:val="18"/>
+              </w:rPr>
+              <w:t xml:space="preserve">Query </w:t>
+            </w:r>
+            <w:r>
+              <w:rPr>
+                <w:rFonts w:ascii="Consolas" w:cs="Consolas" w:eastAsia="Consolas" w:hAnsi="Consolas"/>
+                <w:b w:val="false"/>
+                <w:bCs w:val="false"/>
+                <w:sz w:val="18"/>
+                <w:szCs w:val="18"/>
+              </w:rPr>
+              <w:t xml:space="preserve">tu_ngay?</w:t>
             </w:r>
             <w:r>
               <w:rPr>
@@ -19404,7 +20749,7 @@
                 <w:sz w:val="18"/>
                 <w:szCs w:val="18"/>
               </w:rPr>
-              <w:t xml:space="preserve">den_ngay</w:t>
+              <w:t xml:space="preserve">den_ngay?</w:t>
             </w:r>
             <w:r>
               <w:rPr>
@@ -19424,7 +20769,27 @@
                 <w:sz w:val="18"/>
                 <w:szCs w:val="18"/>
               </w:rPr>
-              <w:t xml:space="preserve">top</w:t>
+              <w:t xml:space="preserve">top?</w:t>
+            </w:r>
+            <w:r>
+              <w:rPr>
+                <w:rFonts w:ascii="Arial" w:cs="Arial" w:eastAsia="Arial" w:hAnsi="Arial"/>
+                <w:b w:val="false"/>
+                <w:bCs w:val="false"/>
+                <w:sz w:val="18"/>
+                <w:szCs w:val="18"/>
+              </w:rPr>
+              <w:t xml:space="preserve"> (mặc định 10, tối đa 100) — </w:t>
+            </w:r>
+            <w:r>
+              <w:rPr>
+                <w:rFonts w:ascii="Consolas" w:cs="Consolas" w:eastAsia="Consolas" w:hAnsi="Consolas"/>
+                <w:b w:val="false"/>
+                <w:bCs w:val="false"/>
+                <w:sz w:val="18"/>
+                <w:szCs w:val="18"/>
+              </w:rPr>
+              <w:t xml:space="preserve">GET /api/bao-cao/san-pham-ban-chay</w:t>
             </w:r>
           </w:p>
         </w:tc>
@@ -19466,7 +20831,7 @@
                 <w:sz w:val="18"/>
                 <w:szCs w:val="18"/>
               </w:rPr>
-              <w:t xml:space="preserve"> + </w:t>
+              <w:t xml:space="preserve"> của hóa đơn đã thanh toán + </w:t>
             </w:r>
             <w:r>
               <w:rPr>
@@ -19486,17 +20851,47 @@
                 <w:sz w:val="18"/>
                 <w:szCs w:val="18"/>
               </w:rPr>
-              <w:t xml:space="preserve">, </w:t>
-            </w:r>
-            <w:r>
-              <w:rPr>
-                <w:rFonts w:ascii="Consolas" w:cs="Consolas" w:eastAsia="Consolas" w:hAnsi="Consolas"/>
-                <w:b w:val="false"/>
-                <w:bCs w:val="false"/>
-                <w:sz w:val="18"/>
-                <w:szCs w:val="18"/>
-              </w:rPr>
-              <w:t xml:space="preserve">SUM(so_luong)</w:t>
+              <w:t xml:space="preserve">; </w:t>
+            </w:r>
+            <w:r>
+              <w:rPr>
+                <w:rFonts w:ascii="Consolas" w:cs="Consolas" w:eastAsia="Consolas" w:hAnsi="Consolas"/>
+                <w:b w:val="false"/>
+                <w:bCs w:val="false"/>
+                <w:sz w:val="18"/>
+                <w:szCs w:val="18"/>
+              </w:rPr>
+              <w:t xml:space="preserve">doanh_thu</w:t>
+            </w:r>
+            <w:r>
+              <w:rPr>
+                <w:rFonts w:ascii="Arial" w:cs="Arial" w:eastAsia="Arial" w:hAnsi="Arial"/>
+                <w:b w:val="false"/>
+                <w:bCs w:val="false"/>
+                <w:sz w:val="18"/>
+                <w:szCs w:val="18"/>
+              </w:rPr>
+              <w:t xml:space="preserve"> = </w:t>
+            </w:r>
+            <w:r>
+              <w:rPr>
+                <w:rFonts w:ascii="Consolas" w:cs="Consolas" w:eastAsia="Consolas" w:hAnsi="Consolas"/>
+                <w:b w:val="false"/>
+                <w:bCs w:val="false"/>
+                <w:sz w:val="18"/>
+                <w:szCs w:val="18"/>
+              </w:rPr>
+              <w:t xml:space="preserve">SUM(so_luong*don_gia - giam_gia)</w:t>
+            </w:r>
+            <w:r>
+              <w:rPr>
+                <w:rFonts w:ascii="Arial" w:cs="Arial" w:eastAsia="Arial" w:hAnsi="Arial"/>
+                <w:b w:val="false"/>
+                <w:bCs w:val="false"/>
+                <w:sz w:val="18"/>
+                <w:szCs w:val="18"/>
+              </w:rPr>
+              <w:t xml:space="preserve">; xếp theo số lượng giảm dần, đồng hạng theo doanh thu</w:t>
             </w:r>
           </w:p>
         </w:tc>
@@ -19538,7 +20933,7 @@
                 <w:sz w:val="18"/>
                 <w:szCs w:val="18"/>
               </w:rPr>
-              <w:t xml:space="preserve">{ten_san_pham, so_luong, doanh_thu}</w:t>
+              <w:t xml:space="preserve">{ma_san_pham, ten_san_pham, so_luong, doanh_thu}</w:t>
             </w:r>
           </w:p>
         </w:tc>
@@ -19633,13 +21028,23 @@
             </w:pPr>
             <w:r>
               <w:rPr>
-                <w:rFonts w:ascii="Consolas" w:cs="Consolas" w:eastAsia="Consolas" w:hAnsi="Consolas"/>
-                <w:b w:val="false"/>
-                <w:bCs w:val="false"/>
-                <w:sz w:val="18"/>
-                <w:szCs w:val="18"/>
-              </w:rPr>
-              <w:t xml:space="preserve">tu_ngay</w:t>
+                <w:rFonts w:ascii="Arial" w:cs="Arial" w:eastAsia="Arial" w:hAnsi="Arial"/>
+                <w:b w:val="false"/>
+                <w:bCs w:val="false"/>
+                <w:sz w:val="18"/>
+                <w:szCs w:val="18"/>
+              </w:rPr>
+              <w:t xml:space="preserve">Query </w:t>
+            </w:r>
+            <w:r>
+              <w:rPr>
+                <w:rFonts w:ascii="Consolas" w:cs="Consolas" w:eastAsia="Consolas" w:hAnsi="Consolas"/>
+                <w:b w:val="false"/>
+                <w:bCs w:val="false"/>
+                <w:sz w:val="18"/>
+                <w:szCs w:val="18"/>
+              </w:rPr>
+              <w:t xml:space="preserve">tu_ngay?</w:t>
             </w:r>
             <w:r>
               <w:rPr>
@@ -19659,7 +21064,27 @@
                 <w:sz w:val="18"/>
                 <w:szCs w:val="18"/>
               </w:rPr>
-              <w:t xml:space="preserve">den_ngay</w:t>
+              <w:t xml:space="preserve">den_ngay?</w:t>
+            </w:r>
+            <w:r>
+              <w:rPr>
+                <w:rFonts w:ascii="Arial" w:cs="Arial" w:eastAsia="Arial" w:hAnsi="Arial"/>
+                <w:b w:val="false"/>
+                <w:bCs w:val="false"/>
+                <w:sz w:val="18"/>
+                <w:szCs w:val="18"/>
+              </w:rPr>
+              <w:t xml:space="preserve"> — </w:t>
+            </w:r>
+            <w:r>
+              <w:rPr>
+                <w:rFonts w:ascii="Consolas" w:cs="Consolas" w:eastAsia="Consolas" w:hAnsi="Consolas"/>
+                <w:b w:val="false"/>
+                <w:bCs w:val="false"/>
+                <w:sz w:val="18"/>
+                <w:szCs w:val="18"/>
+              </w:rPr>
+              <w:t xml:space="preserve">GET /api/bao-cao/doanh-thu-theo-danh-muc</w:t>
             </w:r>
           </w:p>
         </w:tc>
@@ -19691,7 +21116,7 @@
                 <w:sz w:val="18"/>
                 <w:szCs w:val="18"/>
               </w:rPr>
-              <w:t xml:space="preserve">+ </w:t>
+              <w:t xml:space="preserve">Như BC-02, gom theo </w:t>
             </w:r>
             <w:r>
               <w:rPr>
@@ -19703,6 +21128,36 @@
               </w:rPr>
               <w:t xml:space="preserve">DanhMuc</w:t>
             </w:r>
+            <w:r>
+              <w:rPr>
+                <w:rFonts w:ascii="Arial" w:cs="Arial" w:eastAsia="Arial" w:hAnsi="Arial"/>
+                <w:b w:val="false"/>
+                <w:bCs w:val="false"/>
+                <w:sz w:val="18"/>
+                <w:szCs w:val="18"/>
+              </w:rPr>
+              <w:t xml:space="preserve">; </w:t>
+            </w:r>
+            <w:r>
+              <w:rPr>
+                <w:rFonts w:ascii="Consolas" w:cs="Consolas" w:eastAsia="Consolas" w:hAnsi="Consolas"/>
+                <w:b w:val="false"/>
+                <w:bCs w:val="false"/>
+                <w:sz w:val="18"/>
+                <w:szCs w:val="18"/>
+              </w:rPr>
+              <w:t xml:space="preserve">ty_le</w:t>
+            </w:r>
+            <w:r>
+              <w:rPr>
+                <w:rFonts w:ascii="Arial" w:cs="Arial" w:eastAsia="Arial" w:hAnsi="Arial"/>
+                <w:b w:val="false"/>
+                <w:bCs w:val="false"/>
+                <w:sz w:val="18"/>
+                <w:szCs w:val="18"/>
+              </w:rPr>
+              <w:t xml:space="preserve"> = % trên tổng doanh thu các danh mục (2 chữ số thập phân)</w:t>
+            </w:r>
           </w:p>
         </w:tc>
         <w:tc>
@@ -19743,7 +21198,7 @@
                 <w:sz w:val="18"/>
                 <w:szCs w:val="18"/>
               </w:rPr>
-              <w:t xml:space="preserve">{ten_danh_muc, doanh_thu, ty_le}</w:t>
+              <w:t xml:space="preserve">{ma_danh_muc, ten_danh_muc, doanh_thu, ty_le}</w:t>
             </w:r>
           </w:p>
         </w:tc>
@@ -19838,13 +21293,23 @@
             </w:pPr>
             <w:r>
               <w:rPr>
-                <w:rFonts w:ascii="Consolas" w:cs="Consolas" w:eastAsia="Consolas" w:hAnsi="Consolas"/>
-                <w:b w:val="false"/>
-                <w:bCs w:val="false"/>
-                <w:sz w:val="18"/>
-                <w:szCs w:val="18"/>
-              </w:rPr>
-              <w:t xml:space="preserve">tu_ngay</w:t>
+                <w:rFonts w:ascii="Arial" w:cs="Arial" w:eastAsia="Arial" w:hAnsi="Arial"/>
+                <w:b w:val="false"/>
+                <w:bCs w:val="false"/>
+                <w:sz w:val="18"/>
+                <w:szCs w:val="18"/>
+              </w:rPr>
+              <w:t xml:space="preserve">Query </w:t>
+            </w:r>
+            <w:r>
+              <w:rPr>
+                <w:rFonts w:ascii="Consolas" w:cs="Consolas" w:eastAsia="Consolas" w:hAnsi="Consolas"/>
+                <w:b w:val="false"/>
+                <w:bCs w:val="false"/>
+                <w:sz w:val="18"/>
+                <w:szCs w:val="18"/>
+              </w:rPr>
+              <w:t xml:space="preserve">tu_ngay?</w:t>
             </w:r>
             <w:r>
               <w:rPr>
@@ -19864,7 +21329,27 @@
                 <w:sz w:val="18"/>
                 <w:szCs w:val="18"/>
               </w:rPr>
-              <w:t xml:space="preserve">den_ngay</w:t>
+              <w:t xml:space="preserve">den_ngay?</w:t>
+            </w:r>
+            <w:r>
+              <w:rPr>
+                <w:rFonts w:ascii="Arial" w:cs="Arial" w:eastAsia="Arial" w:hAnsi="Arial"/>
+                <w:b w:val="false"/>
+                <w:bCs w:val="false"/>
+                <w:sz w:val="18"/>
+                <w:szCs w:val="18"/>
+              </w:rPr>
+              <w:t xml:space="preserve"> — </w:t>
+            </w:r>
+            <w:r>
+              <w:rPr>
+                <w:rFonts w:ascii="Consolas" w:cs="Consolas" w:eastAsia="Consolas" w:hAnsi="Consolas"/>
+                <w:b w:val="false"/>
+                <w:bCs w:val="false"/>
+                <w:sz w:val="18"/>
+                <w:szCs w:val="18"/>
+              </w:rPr>
+              <w:t xml:space="preserve">GET /api/bao-cao/phuong-thuc-thanh-toan</w:t>
             </w:r>
           </w:p>
         </w:tc>
@@ -19897,6 +21382,16 @@
                 <w:szCs w:val="18"/>
               </w:rPr>
               <w:t xml:space="preserve">GROUP BY phuong_thuc_thanh_toan</w:t>
+            </w:r>
+            <w:r>
+              <w:rPr>
+                <w:rFonts w:ascii="Arial" w:cs="Arial" w:eastAsia="Arial" w:hAnsi="Arial"/>
+                <w:b w:val="false"/>
+                <w:bCs w:val="false"/>
+                <w:sz w:val="18"/>
+                <w:szCs w:val="18"/>
+              </w:rPr>
+              <w:t xml:space="preserve">; xếp theo tổng tiền giảm dần</w:t>
             </w:r>
           </w:p>
         </w:tc>
@@ -20033,13 +21528,23 @@
             </w:pPr>
             <w:r>
               <w:rPr>
-                <w:rFonts w:ascii="Consolas" w:cs="Consolas" w:eastAsia="Consolas" w:hAnsi="Consolas"/>
-                <w:b w:val="false"/>
-                <w:bCs w:val="false"/>
-                <w:sz w:val="18"/>
-                <w:szCs w:val="18"/>
-              </w:rPr>
-              <w:t xml:space="preserve">tu_ngay</w:t>
+                <w:rFonts w:ascii="Arial" w:cs="Arial" w:eastAsia="Arial" w:hAnsi="Arial"/>
+                <w:b w:val="false"/>
+                <w:bCs w:val="false"/>
+                <w:sz w:val="18"/>
+                <w:szCs w:val="18"/>
+              </w:rPr>
+              <w:t xml:space="preserve">Query </w:t>
+            </w:r>
+            <w:r>
+              <w:rPr>
+                <w:rFonts w:ascii="Consolas" w:cs="Consolas" w:eastAsia="Consolas" w:hAnsi="Consolas"/>
+                <w:b w:val="false"/>
+                <w:bCs w:val="false"/>
+                <w:sz w:val="18"/>
+                <w:szCs w:val="18"/>
+              </w:rPr>
+              <w:t xml:space="preserve">tu_ngay?</w:t>
             </w:r>
             <w:r>
               <w:rPr>
@@ -20059,7 +21564,7 @@
                 <w:sz w:val="18"/>
                 <w:szCs w:val="18"/>
               </w:rPr>
-              <w:t xml:space="preserve">den_ngay</w:t>
+              <w:t xml:space="preserve">den_ngay?</w:t>
             </w:r>
             <w:r>
               <w:rPr>
@@ -20079,7 +21584,27 @@
                 <w:sz w:val="18"/>
                 <w:szCs w:val="18"/>
               </w:rPr>
-              <w:t xml:space="preserve">nhom</w:t>
+              <w:t xml:space="preserve">nhom?</w:t>
+            </w:r>
+            <w:r>
+              <w:rPr>
+                <w:rFonts w:ascii="Arial" w:cs="Arial" w:eastAsia="Arial" w:hAnsi="Arial"/>
+                <w:b w:val="false"/>
+                <w:bCs w:val="false"/>
+                <w:sz w:val="18"/>
+                <w:szCs w:val="18"/>
+              </w:rPr>
+              <w:t xml:space="preserve"> — </w:t>
+            </w:r>
+            <w:r>
+              <w:rPr>
+                <w:rFonts w:ascii="Consolas" w:cs="Consolas" w:eastAsia="Consolas" w:hAnsi="Consolas"/>
+                <w:b w:val="false"/>
+                <w:bCs w:val="false"/>
+                <w:sz w:val="18"/>
+                <w:szCs w:val="18"/>
+              </w:rPr>
+              <w:t xml:space="preserve">GET /api/bao-cao/chi-phi-vs-doanh-thu</w:t>
             </w:r>
           </w:p>
         </w:tc>
@@ -20105,6 +21630,36 @@
             </w:pPr>
             <w:r>
               <w:rPr>
+                <w:rFonts w:ascii="Arial" w:cs="Arial" w:eastAsia="Arial" w:hAnsi="Arial"/>
+                <w:b w:val="false"/>
+                <w:bCs w:val="false"/>
+                <w:sz w:val="18"/>
+                <w:szCs w:val="18"/>
+              </w:rPr>
+              <w:t xml:space="preserve">Doanh thu từ </w:t>
+            </w:r>
+            <w:r>
+              <w:rPr>
+                <w:rFonts w:ascii="Consolas" w:cs="Consolas" w:eastAsia="Consolas" w:hAnsi="Consolas"/>
+                <w:b w:val="false"/>
+                <w:bCs w:val="false"/>
+                <w:sz w:val="18"/>
+                <w:szCs w:val="18"/>
+              </w:rPr>
+              <w:t xml:space="preserve">HoaDonDaThanhToan</w:t>
+            </w:r>
+            <w:r>
+              <w:rPr>
+                <w:rFonts w:ascii="Arial" w:cs="Arial" w:eastAsia="Arial" w:hAnsi="Arial"/>
+                <w:b w:val="false"/>
+                <w:bCs w:val="false"/>
+                <w:sz w:val="18"/>
+                <w:szCs w:val="18"/>
+              </w:rPr>
+              <w:t xml:space="preserve"> (ngày thanh toán), chi phí từ </w:t>
+            </w:r>
+            <w:r>
+              <w:rPr>
                 <w:rFonts w:ascii="Consolas" w:cs="Consolas" w:eastAsia="Consolas" w:hAnsi="Consolas"/>
                 <w:b w:val="false"/>
                 <w:bCs w:val="false"/>
@@ -20121,17 +21676,27 @@
                 <w:sz w:val="18"/>
                 <w:szCs w:val="18"/>
               </w:rPr>
-              <w:t xml:space="preserve"> đối chiếu </w:t>
-            </w:r>
-            <w:r>
-              <w:rPr>
-                <w:rFonts w:ascii="Consolas" w:cs="Consolas" w:eastAsia="Consolas" w:hAnsi="Consolas"/>
-                <w:b w:val="false"/>
-                <w:bCs w:val="false"/>
-                <w:sz w:val="18"/>
-                <w:szCs w:val="18"/>
-              </w:rPr>
-              <w:t xml:space="preserve">HoaDon.tong_tien</w:t>
+              <w:t xml:space="preserve"> (ngày nhập); kỳ chỉ có một phía vẫn xuất hiện (phía kia = 0); </w:t>
+            </w:r>
+            <w:r>
+              <w:rPr>
+                <w:rFonts w:ascii="Consolas" w:cs="Consolas" w:eastAsia="Consolas" w:hAnsi="Consolas"/>
+                <w:b w:val="false"/>
+                <w:bCs w:val="false"/>
+                <w:sz w:val="18"/>
+                <w:szCs w:val="18"/>
+              </w:rPr>
+              <w:t xml:space="preserve">chenh_lech</w:t>
+            </w:r>
+            <w:r>
+              <w:rPr>
+                <w:rFonts w:ascii="Arial" w:cs="Arial" w:eastAsia="Arial" w:hAnsi="Arial"/>
+                <w:b w:val="false"/>
+                <w:bCs w:val="false"/>
+                <w:sz w:val="18"/>
+                <w:szCs w:val="18"/>
+              </w:rPr>
+              <w:t xml:space="preserve"> = doanh_thu - chi_phi_nhap (có thể âm)</w:t>
             </w:r>
           </w:p>
         </w:tc>
@@ -20268,13 +21833,23 @@
             </w:pPr>
             <w:r>
               <w:rPr>
-                <w:rFonts w:ascii="Consolas" w:cs="Consolas" w:eastAsia="Consolas" w:hAnsi="Consolas"/>
-                <w:b w:val="false"/>
-                <w:bCs w:val="false"/>
-                <w:sz w:val="18"/>
-                <w:szCs w:val="18"/>
-              </w:rPr>
-              <w:t xml:space="preserve">tu_ngay</w:t>
+                <w:rFonts w:ascii="Arial" w:cs="Arial" w:eastAsia="Arial" w:hAnsi="Arial"/>
+                <w:b w:val="false"/>
+                <w:bCs w:val="false"/>
+                <w:sz w:val="18"/>
+                <w:szCs w:val="18"/>
+              </w:rPr>
+              <w:t xml:space="preserve">Query </w:t>
+            </w:r>
+            <w:r>
+              <w:rPr>
+                <w:rFonts w:ascii="Consolas" w:cs="Consolas" w:eastAsia="Consolas" w:hAnsi="Consolas"/>
+                <w:b w:val="false"/>
+                <w:bCs w:val="false"/>
+                <w:sz w:val="18"/>
+                <w:szCs w:val="18"/>
+              </w:rPr>
+              <w:t xml:space="preserve">tu_ngay?</w:t>
             </w:r>
             <w:r>
               <w:rPr>
@@ -20294,7 +21869,27 @@
                 <w:sz w:val="18"/>
                 <w:szCs w:val="18"/>
               </w:rPr>
-              <w:t xml:space="preserve">den_ngay</w:t>
+              <w:t xml:space="preserve">den_ngay?</w:t>
+            </w:r>
+            <w:r>
+              <w:rPr>
+                <w:rFonts w:ascii="Arial" w:cs="Arial" w:eastAsia="Arial" w:hAnsi="Arial"/>
+                <w:b w:val="false"/>
+                <w:bCs w:val="false"/>
+                <w:sz w:val="18"/>
+                <w:szCs w:val="18"/>
+              </w:rPr>
+              <w:t xml:space="preserve"> — </w:t>
+            </w:r>
+            <w:r>
+              <w:rPr>
+                <w:rFonts w:ascii="Consolas" w:cs="Consolas" w:eastAsia="Consolas" w:hAnsi="Consolas"/>
+                <w:b w:val="false"/>
+                <w:bCs w:val="false"/>
+                <w:sz w:val="18"/>
+                <w:szCs w:val="18"/>
+              </w:rPr>
+              <w:t xml:space="preserve">GET /api/bao-cao/doanh-thu-theo-nhan-vien</w:t>
             </w:r>
           </w:p>
         </w:tc>
@@ -20328,6 +21923,16 @@
               </w:rPr>
               <w:t xml:space="preserve">GROUP BY ma_nhan_vien</w:t>
             </w:r>
+            <w:r>
+              <w:rPr>
+                <w:rFonts w:ascii="Arial" w:cs="Arial" w:eastAsia="Arial" w:hAnsi="Arial"/>
+                <w:b w:val="false"/>
+                <w:bCs w:val="false"/>
+                <w:sz w:val="18"/>
+                <w:szCs w:val="18"/>
+              </w:rPr>
+              <w:t xml:space="preserve"> (nhân viên nhập order) trên hóa đơn đã thanh toán, kể cả khách vãng lai; xếp theo doanh thu giảm dần</w:t>
+            </w:r>
           </w:p>
         </w:tc>
         <w:tc>
@@ -20368,7 +21973,7 @@
                 <w:sz w:val="18"/>
                 <w:szCs w:val="18"/>
               </w:rPr>
-              <w:t xml:space="preserve">{ho_ten, so_don, doanh_thu}</w:t>
+              <w:t xml:space="preserve">{ma_nhan_vien, ho_ten, so_don, doanh_thu}</w:t>
             </w:r>
           </w:p>
         </w:tc>
@@ -22636,6 +24241,139 @@
                 <w:sz w:val="18"/>
                 <w:szCs w:val="18"/>
               </w:rPr>
+              <w:t xml:space="preserve">POST</w:t>
+            </w:r>
+          </w:p>
+        </w:tc>
+        <w:tc>
+          <w:tcPr>
+            <w:tcW w:type="dxa" w:w="5400"/>
+            <w:tcBorders>
+              <w:top w:val="single" w:color="BFBFBF" w:sz="4"/>
+              <w:left w:val="single" w:color="BFBFBF" w:sz="4"/>
+              <w:bottom w:val="single" w:color="BFBFBF" w:sz="4"/>
+              <w:right w:val="single" w:color="BFBFBF" w:sz="4"/>
+            </w:tcBorders>
+            <w:tcMar>
+              <w:top w:type="dxa" w:w="60"/>
+              <w:left w:type="dxa" w:w="90"/>
+              <w:bottom w:type="dxa" w:w="60"/>
+              <w:right w:type="dxa" w:w="90"/>
+            </w:tcMar>
+          </w:tcPr>
+          <w:p>
+            <w:pPr>
+              <w:spacing w:after="20"/>
+            </w:pPr>
+            <w:r>
+              <w:rPr>
+                <w:rFonts w:ascii="Arial" w:cs="Arial" w:eastAsia="Arial" w:hAnsi="Arial"/>
+                <w:b w:val="false"/>
+                <w:bCs w:val="false"/>
+                <w:sz w:val="18"/>
+                <w:szCs w:val="18"/>
+              </w:rPr>
+              <w:t xml:space="preserve">/api/auth/doi-mat-khau</w:t>
+            </w:r>
+          </w:p>
+        </w:tc>
+        <w:tc>
+          <w:tcPr>
+            <w:tcW w:type="dxa" w:w="4878"/>
+            <w:tcBorders>
+              <w:top w:val="single" w:color="BFBFBF" w:sz="4"/>
+              <w:left w:val="single" w:color="BFBFBF" w:sz="4"/>
+              <w:bottom w:val="single" w:color="BFBFBF" w:sz="4"/>
+              <w:right w:val="single" w:color="BFBFBF" w:sz="4"/>
+            </w:tcBorders>
+            <w:tcMar>
+              <w:top w:type="dxa" w:w="60"/>
+              <w:left w:type="dxa" w:w="90"/>
+              <w:bottom w:type="dxa" w:w="60"/>
+              <w:right w:type="dxa" w:w="90"/>
+            </w:tcMar>
+          </w:tcPr>
+          <w:p>
+            <w:pPr>
+              <w:spacing w:after="20"/>
+            </w:pPr>
+            <w:r>
+              <w:rPr>
+                <w:rFonts w:ascii="Arial" w:cs="Arial" w:eastAsia="Arial" w:hAnsi="Arial"/>
+                <w:b w:val="false"/>
+                <w:bCs w:val="false"/>
+                <w:sz w:val="18"/>
+                <w:szCs w:val="18"/>
+              </w:rPr>
+              <w:t xml:space="preserve">AUTH-02 đổi mật khẩu của chính mình</w:t>
+            </w:r>
+          </w:p>
+        </w:tc>
+        <w:tc>
+          <w:tcPr>
+            <w:tcW w:type="dxa" w:w="2600"/>
+            <w:tcBorders>
+              <w:top w:val="single" w:color="BFBFBF" w:sz="4"/>
+              <w:left w:val="single" w:color="BFBFBF" w:sz="4"/>
+              <w:bottom w:val="single" w:color="BFBFBF" w:sz="4"/>
+              <w:right w:val="single" w:color="BFBFBF" w:sz="4"/>
+            </w:tcBorders>
+            <w:tcMar>
+              <w:top w:type="dxa" w:w="60"/>
+              <w:left w:type="dxa" w:w="90"/>
+              <w:bottom w:type="dxa" w:w="60"/>
+              <w:right w:type="dxa" w:w="90"/>
+            </w:tcMar>
+          </w:tcPr>
+          <w:p>
+            <w:pPr>
+              <w:spacing w:after="20"/>
+            </w:pPr>
+            <w:r>
+              <w:rPr>
+                <w:rFonts w:ascii="Arial" w:cs="Arial" w:eastAsia="Arial" w:hAnsi="Arial"/>
+                <w:b w:val="false"/>
+                <w:bCs w:val="false"/>
+                <w:sz w:val="18"/>
+                <w:szCs w:val="18"/>
+              </w:rPr>
+              <w:t xml:space="preserve">A/Q/N</w:t>
+            </w:r>
+          </w:p>
+        </w:tc>
+      </w:tr>
+      <w:tr>
+        <w:trPr>
+          <w:cantSplit/>
+        </w:trPr>
+        <w:tc>
+          <w:tcPr>
+            <w:tcW w:type="dxa" w:w="1800"/>
+            <w:tcBorders>
+              <w:top w:val="single" w:color="BFBFBF" w:sz="4"/>
+              <w:left w:val="single" w:color="BFBFBF" w:sz="4"/>
+              <w:bottom w:val="single" w:color="BFBFBF" w:sz="4"/>
+              <w:right w:val="single" w:color="BFBFBF" w:sz="4"/>
+            </w:tcBorders>
+            <w:tcMar>
+              <w:top w:type="dxa" w:w="60"/>
+              <w:left w:type="dxa" w:w="90"/>
+              <w:bottom w:type="dxa" w:w="60"/>
+              <w:right w:type="dxa" w:w="90"/>
+            </w:tcMar>
+          </w:tcPr>
+          <w:p>
+            <w:pPr>
+              <w:spacing w:after="20"/>
+            </w:pPr>
+            <w:r>
+              <w:rPr>
+                <w:rFonts w:ascii="Arial" w:cs="Arial" w:eastAsia="Arial" w:hAnsi="Arial"/>
+                <w:b w:val="false"/>
+                <w:bCs w:val="false"/>
+                <w:sz w:val="18"/>
+                <w:szCs w:val="18"/>
+              </w:rPr>
               <w:t xml:space="preserve">GET</w:t>
             </w:r>
           </w:p>
@@ -22733,6 +24471,1735 @@
                 <w:szCs w:val="18"/>
               </w:rPr>
               <w:t xml:space="preserve">A/Q/N</w:t>
+            </w:r>
+          </w:p>
+        </w:tc>
+      </w:tr>
+      <w:tr>
+        <w:trPr>
+          <w:cantSplit/>
+        </w:trPr>
+        <w:tc>
+          <w:tcPr>
+            <w:tcW w:type="dxa" w:w="1800"/>
+            <w:tcBorders>
+              <w:top w:val="single" w:color="BFBFBF" w:sz="4"/>
+              <w:left w:val="single" w:color="BFBFBF" w:sz="4"/>
+              <w:bottom w:val="single" w:color="BFBFBF" w:sz="4"/>
+              <w:right w:val="single" w:color="BFBFBF" w:sz="4"/>
+            </w:tcBorders>
+            <w:tcMar>
+              <w:top w:type="dxa" w:w="60"/>
+              <w:left w:type="dxa" w:w="90"/>
+              <w:bottom w:type="dxa" w:w="60"/>
+              <w:right w:type="dxa" w:w="90"/>
+            </w:tcMar>
+          </w:tcPr>
+          <w:p>
+            <w:pPr>
+              <w:spacing w:after="20"/>
+            </w:pPr>
+            <w:r>
+              <w:rPr>
+                <w:rFonts w:ascii="Arial" w:cs="Arial" w:eastAsia="Arial" w:hAnsi="Arial"/>
+                <w:b w:val="false"/>
+                <w:bCs w:val="false"/>
+                <w:sz w:val="18"/>
+                <w:szCs w:val="18"/>
+              </w:rPr>
+              <w:t xml:space="preserve">POST, GET</w:t>
+            </w:r>
+          </w:p>
+        </w:tc>
+        <w:tc>
+          <w:tcPr>
+            <w:tcW w:type="dxa" w:w="5400"/>
+            <w:tcBorders>
+              <w:top w:val="single" w:color="BFBFBF" w:sz="4"/>
+              <w:left w:val="single" w:color="BFBFBF" w:sz="4"/>
+              <w:bottom w:val="single" w:color="BFBFBF" w:sz="4"/>
+              <w:right w:val="single" w:color="BFBFBF" w:sz="4"/>
+            </w:tcBorders>
+            <w:tcMar>
+              <w:top w:type="dxa" w:w="60"/>
+              <w:left w:type="dxa" w:w="90"/>
+              <w:bottom w:type="dxa" w:w="60"/>
+              <w:right w:type="dxa" w:w="90"/>
+            </w:tcMar>
+          </w:tcPr>
+          <w:p>
+            <w:pPr>
+              <w:spacing w:after="20"/>
+            </w:pPr>
+            <w:r>
+              <w:rPr>
+                <w:rFonts w:ascii="Arial" w:cs="Arial" w:eastAsia="Arial" w:hAnsi="Arial"/>
+                <w:b w:val="false"/>
+                <w:bCs w:val="false"/>
+                <w:sz w:val="18"/>
+                <w:szCs w:val="18"/>
+              </w:rPr>
+              <w:t xml:space="preserve">/api/nhan-su</w:t>
+            </w:r>
+          </w:p>
+        </w:tc>
+        <w:tc>
+          <w:tcPr>
+            <w:tcW w:type="dxa" w:w="4878"/>
+            <w:tcBorders>
+              <w:top w:val="single" w:color="BFBFBF" w:sz="4"/>
+              <w:left w:val="single" w:color="BFBFBF" w:sz="4"/>
+              <w:bottom w:val="single" w:color="BFBFBF" w:sz="4"/>
+              <w:right w:val="single" w:color="BFBFBF" w:sz="4"/>
+            </w:tcBorders>
+            <w:tcMar>
+              <w:top w:type="dxa" w:w="60"/>
+              <w:left w:type="dxa" w:w="90"/>
+              <w:bottom w:type="dxa" w:w="60"/>
+              <w:right w:type="dxa" w:w="90"/>
+            </w:tcMar>
+          </w:tcPr>
+          <w:p>
+            <w:pPr>
+              <w:spacing w:after="20"/>
+            </w:pPr>
+            <w:r>
+              <w:rPr>
+                <w:rFonts w:ascii="Arial" w:cs="Arial" w:eastAsia="Arial" w:hAnsi="Arial"/>
+                <w:b w:val="false"/>
+                <w:bCs w:val="false"/>
+                <w:sz w:val="18"/>
+                <w:szCs w:val="18"/>
+              </w:rPr>
+              <w:t xml:space="preserve">NS-01 tạo nhân viên + tài khoản (A); danh sách nhân viên (A/Q)</w:t>
+            </w:r>
+          </w:p>
+        </w:tc>
+        <w:tc>
+          <w:tcPr>
+            <w:tcW w:type="dxa" w:w="2600"/>
+            <w:tcBorders>
+              <w:top w:val="single" w:color="BFBFBF" w:sz="4"/>
+              <w:left w:val="single" w:color="BFBFBF" w:sz="4"/>
+              <w:bottom w:val="single" w:color="BFBFBF" w:sz="4"/>
+              <w:right w:val="single" w:color="BFBFBF" w:sz="4"/>
+            </w:tcBorders>
+            <w:tcMar>
+              <w:top w:type="dxa" w:w="60"/>
+              <w:left w:type="dxa" w:w="90"/>
+              <w:bottom w:type="dxa" w:w="60"/>
+              <w:right w:type="dxa" w:w="90"/>
+            </w:tcMar>
+          </w:tcPr>
+          <w:p>
+            <w:pPr>
+              <w:spacing w:after="20"/>
+            </w:pPr>
+            <w:r>
+              <w:rPr>
+                <w:rFonts w:ascii="Arial" w:cs="Arial" w:eastAsia="Arial" w:hAnsi="Arial"/>
+                <w:b w:val="false"/>
+                <w:bCs w:val="false"/>
+                <w:sz w:val="18"/>
+                <w:szCs w:val="18"/>
+              </w:rPr>
+              <w:t xml:space="preserve">A (tạo), A/Q (xem)</w:t>
+            </w:r>
+          </w:p>
+        </w:tc>
+      </w:tr>
+      <w:tr>
+        <w:trPr>
+          <w:cantSplit/>
+        </w:trPr>
+        <w:tc>
+          <w:tcPr>
+            <w:tcW w:type="dxa" w:w="1800"/>
+            <w:tcBorders>
+              <w:top w:val="single" w:color="BFBFBF" w:sz="4"/>
+              <w:left w:val="single" w:color="BFBFBF" w:sz="4"/>
+              <w:bottom w:val="single" w:color="BFBFBF" w:sz="4"/>
+              <w:right w:val="single" w:color="BFBFBF" w:sz="4"/>
+            </w:tcBorders>
+            <w:tcMar>
+              <w:top w:type="dxa" w:w="60"/>
+              <w:left w:type="dxa" w:w="90"/>
+              <w:bottom w:type="dxa" w:w="60"/>
+              <w:right w:type="dxa" w:w="90"/>
+            </w:tcMar>
+          </w:tcPr>
+          <w:p>
+            <w:pPr>
+              <w:spacing w:after="20"/>
+            </w:pPr>
+            <w:r>
+              <w:rPr>
+                <w:rFonts w:ascii="Arial" w:cs="Arial" w:eastAsia="Arial" w:hAnsi="Arial"/>
+                <w:b w:val="false"/>
+                <w:bCs w:val="false"/>
+                <w:sz w:val="18"/>
+                <w:szCs w:val="18"/>
+              </w:rPr>
+              <w:t xml:space="preserve">GET, PATCH, DELETE</w:t>
+            </w:r>
+          </w:p>
+        </w:tc>
+        <w:tc>
+          <w:tcPr>
+            <w:tcW w:type="dxa" w:w="5400"/>
+            <w:tcBorders>
+              <w:top w:val="single" w:color="BFBFBF" w:sz="4"/>
+              <w:left w:val="single" w:color="BFBFBF" w:sz="4"/>
+              <w:bottom w:val="single" w:color="BFBFBF" w:sz="4"/>
+              <w:right w:val="single" w:color="BFBFBF" w:sz="4"/>
+            </w:tcBorders>
+            <w:tcMar>
+              <w:top w:type="dxa" w:w="60"/>
+              <w:left w:type="dxa" w:w="90"/>
+              <w:bottom w:type="dxa" w:w="60"/>
+              <w:right w:type="dxa" w:w="90"/>
+            </w:tcMar>
+          </w:tcPr>
+          <w:p>
+            <w:pPr>
+              <w:spacing w:after="20"/>
+            </w:pPr>
+            <w:r>
+              <w:rPr>
+                <w:rFonts w:ascii="Arial" w:cs="Arial" w:eastAsia="Arial" w:hAnsi="Arial"/>
+                <w:b w:val="false"/>
+                <w:bCs w:val="false"/>
+                <w:sz w:val="18"/>
+                <w:szCs w:val="18"/>
+              </w:rPr>
+              <w:t xml:space="preserve">/api/nhan-su/:ma</w:t>
+            </w:r>
+          </w:p>
+        </w:tc>
+        <w:tc>
+          <w:tcPr>
+            <w:tcW w:type="dxa" w:w="4878"/>
+            <w:tcBorders>
+              <w:top w:val="single" w:color="BFBFBF" w:sz="4"/>
+              <w:left w:val="single" w:color="BFBFBF" w:sz="4"/>
+              <w:bottom w:val="single" w:color="BFBFBF" w:sz="4"/>
+              <w:right w:val="single" w:color="BFBFBF" w:sz="4"/>
+            </w:tcBorders>
+            <w:tcMar>
+              <w:top w:type="dxa" w:w="60"/>
+              <w:left w:type="dxa" w:w="90"/>
+              <w:bottom w:type="dxa" w:w="60"/>
+              <w:right w:type="dxa" w:w="90"/>
+            </w:tcMar>
+          </w:tcPr>
+          <w:p>
+            <w:pPr>
+              <w:spacing w:after="20"/>
+            </w:pPr>
+            <w:r>
+              <w:rPr>
+                <w:rFonts w:ascii="Arial" w:cs="Arial" w:eastAsia="Arial" w:hAnsi="Arial"/>
+                <w:b w:val="false"/>
+                <w:bCs w:val="false"/>
+                <w:sz w:val="18"/>
+                <w:szCs w:val="18"/>
+              </w:rPr>
+              <w:t xml:space="preserve">Xem chi tiết (A/Q); NS-02 sửa / đổi quyền (A, Q sửa thông tin); NS-03 xóa hoặc cho nghỉ việc (A)</w:t>
+            </w:r>
+          </w:p>
+        </w:tc>
+        <w:tc>
+          <w:tcPr>
+            <w:tcW w:type="dxa" w:w="2600"/>
+            <w:tcBorders>
+              <w:top w:val="single" w:color="BFBFBF" w:sz="4"/>
+              <w:left w:val="single" w:color="BFBFBF" w:sz="4"/>
+              <w:bottom w:val="single" w:color="BFBFBF" w:sz="4"/>
+              <w:right w:val="single" w:color="BFBFBF" w:sz="4"/>
+            </w:tcBorders>
+            <w:tcMar>
+              <w:top w:type="dxa" w:w="60"/>
+              <w:left w:type="dxa" w:w="90"/>
+              <w:bottom w:type="dxa" w:w="60"/>
+              <w:right w:type="dxa" w:w="90"/>
+            </w:tcMar>
+          </w:tcPr>
+          <w:p>
+            <w:pPr>
+              <w:spacing w:after="20"/>
+            </w:pPr>
+            <w:r>
+              <w:rPr>
+                <w:rFonts w:ascii="Arial" w:cs="Arial" w:eastAsia="Arial" w:hAnsi="Arial"/>
+                <w:b w:val="false"/>
+                <w:bCs w:val="false"/>
+                <w:sz w:val="18"/>
+                <w:szCs w:val="18"/>
+              </w:rPr>
+              <w:t xml:space="preserve">A/Q</w:t>
+            </w:r>
+          </w:p>
+        </w:tc>
+      </w:tr>
+      <w:tr>
+        <w:trPr>
+          <w:cantSplit/>
+        </w:trPr>
+        <w:tc>
+          <w:tcPr>
+            <w:tcW w:type="dxa" w:w="1800"/>
+            <w:tcBorders>
+              <w:top w:val="single" w:color="BFBFBF" w:sz="4"/>
+              <w:left w:val="single" w:color="BFBFBF" w:sz="4"/>
+              <w:bottom w:val="single" w:color="BFBFBF" w:sz="4"/>
+              <w:right w:val="single" w:color="BFBFBF" w:sz="4"/>
+            </w:tcBorders>
+            <w:tcMar>
+              <w:top w:type="dxa" w:w="60"/>
+              <w:left w:type="dxa" w:w="90"/>
+              <w:bottom w:type="dxa" w:w="60"/>
+              <w:right w:type="dxa" w:w="90"/>
+            </w:tcMar>
+          </w:tcPr>
+          <w:p>
+            <w:pPr>
+              <w:spacing w:after="20"/>
+            </w:pPr>
+            <w:r>
+              <w:rPr>
+                <w:rFonts w:ascii="Arial" w:cs="Arial" w:eastAsia="Arial" w:hAnsi="Arial"/>
+                <w:b w:val="false"/>
+                <w:bCs w:val="false"/>
+                <w:sz w:val="18"/>
+                <w:szCs w:val="18"/>
+              </w:rPr>
+              <w:t xml:space="preserve">POST, GET</w:t>
+            </w:r>
+          </w:p>
+        </w:tc>
+        <w:tc>
+          <w:tcPr>
+            <w:tcW w:type="dxa" w:w="5400"/>
+            <w:tcBorders>
+              <w:top w:val="single" w:color="BFBFBF" w:sz="4"/>
+              <w:left w:val="single" w:color="BFBFBF" w:sz="4"/>
+              <w:bottom w:val="single" w:color="BFBFBF" w:sz="4"/>
+              <w:right w:val="single" w:color="BFBFBF" w:sz="4"/>
+            </w:tcBorders>
+            <w:tcMar>
+              <w:top w:type="dxa" w:w="60"/>
+              <w:left w:type="dxa" w:w="90"/>
+              <w:bottom w:type="dxa" w:w="60"/>
+              <w:right w:type="dxa" w:w="90"/>
+            </w:tcMar>
+          </w:tcPr>
+          <w:p>
+            <w:pPr>
+              <w:spacing w:after="20"/>
+            </w:pPr>
+            <w:r>
+              <w:rPr>
+                <w:rFonts w:ascii="Arial" w:cs="Arial" w:eastAsia="Arial" w:hAnsi="Arial"/>
+                <w:b w:val="false"/>
+                <w:bCs w:val="false"/>
+                <w:sz w:val="18"/>
+                <w:szCs w:val="18"/>
+              </w:rPr>
+              <w:t xml:space="preserve">/api/nhan-su/ca-lam-viec</w:t>
+            </w:r>
+          </w:p>
+        </w:tc>
+        <w:tc>
+          <w:tcPr>
+            <w:tcW w:type="dxa" w:w="4878"/>
+            <w:tcBorders>
+              <w:top w:val="single" w:color="BFBFBF" w:sz="4"/>
+              <w:left w:val="single" w:color="BFBFBF" w:sz="4"/>
+              <w:bottom w:val="single" w:color="BFBFBF" w:sz="4"/>
+              <w:right w:val="single" w:color="BFBFBF" w:sz="4"/>
+            </w:tcBorders>
+            <w:tcMar>
+              <w:top w:type="dxa" w:w="60"/>
+              <w:left w:type="dxa" w:w="90"/>
+              <w:bottom w:type="dxa" w:w="60"/>
+              <w:right w:type="dxa" w:w="90"/>
+            </w:tcMar>
+          </w:tcPr>
+          <w:p>
+            <w:pPr>
+              <w:spacing w:after="20"/>
+            </w:pPr>
+            <w:r>
+              <w:rPr>
+                <w:rFonts w:ascii="Arial" w:cs="Arial" w:eastAsia="Arial" w:hAnsi="Arial"/>
+                <w:b w:val="false"/>
+                <w:bCs w:val="false"/>
+                <w:sz w:val="18"/>
+                <w:szCs w:val="18"/>
+              </w:rPr>
+              <w:t xml:space="preserve">NS-04 tạo ca / danh sách ca</w:t>
+            </w:r>
+          </w:p>
+        </w:tc>
+        <w:tc>
+          <w:tcPr>
+            <w:tcW w:type="dxa" w:w="2600"/>
+            <w:tcBorders>
+              <w:top w:val="single" w:color="BFBFBF" w:sz="4"/>
+              <w:left w:val="single" w:color="BFBFBF" w:sz="4"/>
+              <w:bottom w:val="single" w:color="BFBFBF" w:sz="4"/>
+              <w:right w:val="single" w:color="BFBFBF" w:sz="4"/>
+            </w:tcBorders>
+            <w:tcMar>
+              <w:top w:type="dxa" w:w="60"/>
+              <w:left w:type="dxa" w:w="90"/>
+              <w:bottom w:type="dxa" w:w="60"/>
+              <w:right w:type="dxa" w:w="90"/>
+            </w:tcMar>
+          </w:tcPr>
+          <w:p>
+            <w:pPr>
+              <w:spacing w:after="20"/>
+            </w:pPr>
+            <w:r>
+              <w:rPr>
+                <w:rFonts w:ascii="Arial" w:cs="Arial" w:eastAsia="Arial" w:hAnsi="Arial"/>
+                <w:b w:val="false"/>
+                <w:bCs w:val="false"/>
+                <w:sz w:val="18"/>
+                <w:szCs w:val="18"/>
+              </w:rPr>
+              <w:t xml:space="preserve">A/Q</w:t>
+            </w:r>
+          </w:p>
+        </w:tc>
+      </w:tr>
+      <w:tr>
+        <w:trPr>
+          <w:cantSplit/>
+        </w:trPr>
+        <w:tc>
+          <w:tcPr>
+            <w:tcW w:type="dxa" w:w="1800"/>
+            <w:tcBorders>
+              <w:top w:val="single" w:color="BFBFBF" w:sz="4"/>
+              <w:left w:val="single" w:color="BFBFBF" w:sz="4"/>
+              <w:bottom w:val="single" w:color="BFBFBF" w:sz="4"/>
+              <w:right w:val="single" w:color="BFBFBF" w:sz="4"/>
+            </w:tcBorders>
+            <w:tcMar>
+              <w:top w:type="dxa" w:w="60"/>
+              <w:left w:type="dxa" w:w="90"/>
+              <w:bottom w:type="dxa" w:w="60"/>
+              <w:right w:type="dxa" w:w="90"/>
+            </w:tcMar>
+          </w:tcPr>
+          <w:p>
+            <w:pPr>
+              <w:spacing w:after="20"/>
+            </w:pPr>
+            <w:r>
+              <w:rPr>
+                <w:rFonts w:ascii="Arial" w:cs="Arial" w:eastAsia="Arial" w:hAnsi="Arial"/>
+                <w:b w:val="false"/>
+                <w:bCs w:val="false"/>
+                <w:sz w:val="18"/>
+                <w:szCs w:val="18"/>
+              </w:rPr>
+              <w:t xml:space="preserve">GET, PATCH, DELETE</w:t>
+            </w:r>
+          </w:p>
+        </w:tc>
+        <w:tc>
+          <w:tcPr>
+            <w:tcW w:type="dxa" w:w="5400"/>
+            <w:tcBorders>
+              <w:top w:val="single" w:color="BFBFBF" w:sz="4"/>
+              <w:left w:val="single" w:color="BFBFBF" w:sz="4"/>
+              <w:bottom w:val="single" w:color="BFBFBF" w:sz="4"/>
+              <w:right w:val="single" w:color="BFBFBF" w:sz="4"/>
+            </w:tcBorders>
+            <w:tcMar>
+              <w:top w:type="dxa" w:w="60"/>
+              <w:left w:type="dxa" w:w="90"/>
+              <w:bottom w:type="dxa" w:w="60"/>
+              <w:right w:type="dxa" w:w="90"/>
+            </w:tcMar>
+          </w:tcPr>
+          <w:p>
+            <w:pPr>
+              <w:spacing w:after="20"/>
+            </w:pPr>
+            <w:r>
+              <w:rPr>
+                <w:rFonts w:ascii="Arial" w:cs="Arial" w:eastAsia="Arial" w:hAnsi="Arial"/>
+                <w:b w:val="false"/>
+                <w:bCs w:val="false"/>
+                <w:sz w:val="18"/>
+                <w:szCs w:val="18"/>
+              </w:rPr>
+              <w:t xml:space="preserve">/api/nhan-su/ca-lam-viec/:ma</w:t>
+            </w:r>
+          </w:p>
+        </w:tc>
+        <w:tc>
+          <w:tcPr>
+            <w:tcW w:type="dxa" w:w="4878"/>
+            <w:tcBorders>
+              <w:top w:val="single" w:color="BFBFBF" w:sz="4"/>
+              <w:left w:val="single" w:color="BFBFBF" w:sz="4"/>
+              <w:bottom w:val="single" w:color="BFBFBF" w:sz="4"/>
+              <w:right w:val="single" w:color="BFBFBF" w:sz="4"/>
+            </w:tcBorders>
+            <w:tcMar>
+              <w:top w:type="dxa" w:w="60"/>
+              <w:left w:type="dxa" w:w="90"/>
+              <w:bottom w:type="dxa" w:w="60"/>
+              <w:right w:type="dxa" w:w="90"/>
+            </w:tcMar>
+          </w:tcPr>
+          <w:p>
+            <w:pPr>
+              <w:spacing w:after="20"/>
+            </w:pPr>
+            <w:r>
+              <w:rPr>
+                <w:rFonts w:ascii="Arial" w:cs="Arial" w:eastAsia="Arial" w:hAnsi="Arial"/>
+                <w:b w:val="false"/>
+                <w:bCs w:val="false"/>
+                <w:sz w:val="18"/>
+                <w:szCs w:val="18"/>
+              </w:rPr>
+              <w:t xml:space="preserve">NS-04 xem / sửa / xóa ca</w:t>
+            </w:r>
+          </w:p>
+        </w:tc>
+        <w:tc>
+          <w:tcPr>
+            <w:tcW w:type="dxa" w:w="2600"/>
+            <w:tcBorders>
+              <w:top w:val="single" w:color="BFBFBF" w:sz="4"/>
+              <w:left w:val="single" w:color="BFBFBF" w:sz="4"/>
+              <w:bottom w:val="single" w:color="BFBFBF" w:sz="4"/>
+              <w:right w:val="single" w:color="BFBFBF" w:sz="4"/>
+            </w:tcBorders>
+            <w:tcMar>
+              <w:top w:type="dxa" w:w="60"/>
+              <w:left w:type="dxa" w:w="90"/>
+              <w:bottom w:type="dxa" w:w="60"/>
+              <w:right w:type="dxa" w:w="90"/>
+            </w:tcMar>
+          </w:tcPr>
+          <w:p>
+            <w:pPr>
+              <w:spacing w:after="20"/>
+            </w:pPr>
+            <w:r>
+              <w:rPr>
+                <w:rFonts w:ascii="Arial" w:cs="Arial" w:eastAsia="Arial" w:hAnsi="Arial"/>
+                <w:b w:val="false"/>
+                <w:bCs w:val="false"/>
+                <w:sz w:val="18"/>
+                <w:szCs w:val="18"/>
+              </w:rPr>
+              <w:t xml:space="preserve">A/Q</w:t>
+            </w:r>
+          </w:p>
+        </w:tc>
+      </w:tr>
+      <w:tr>
+        <w:trPr>
+          <w:cantSplit/>
+        </w:trPr>
+        <w:tc>
+          <w:tcPr>
+            <w:tcW w:type="dxa" w:w="1800"/>
+            <w:tcBorders>
+              <w:top w:val="single" w:color="BFBFBF" w:sz="4"/>
+              <w:left w:val="single" w:color="BFBFBF" w:sz="4"/>
+              <w:bottom w:val="single" w:color="BFBFBF" w:sz="4"/>
+              <w:right w:val="single" w:color="BFBFBF" w:sz="4"/>
+            </w:tcBorders>
+            <w:tcMar>
+              <w:top w:type="dxa" w:w="60"/>
+              <w:left w:type="dxa" w:w="90"/>
+              <w:bottom w:type="dxa" w:w="60"/>
+              <w:right w:type="dxa" w:w="90"/>
+            </w:tcMar>
+          </w:tcPr>
+          <w:p>
+            <w:pPr>
+              <w:spacing w:after="20"/>
+            </w:pPr>
+            <w:r>
+              <w:rPr>
+                <w:rFonts w:ascii="Arial" w:cs="Arial" w:eastAsia="Arial" w:hAnsi="Arial"/>
+                <w:b w:val="false"/>
+                <w:bCs w:val="false"/>
+                <w:sz w:val="18"/>
+                <w:szCs w:val="18"/>
+              </w:rPr>
+              <w:t xml:space="preserve">POST, DELETE</w:t>
+            </w:r>
+          </w:p>
+        </w:tc>
+        <w:tc>
+          <w:tcPr>
+            <w:tcW w:type="dxa" w:w="5400"/>
+            <w:tcBorders>
+              <w:top w:val="single" w:color="BFBFBF" w:sz="4"/>
+              <w:left w:val="single" w:color="BFBFBF" w:sz="4"/>
+              <w:bottom w:val="single" w:color="BFBFBF" w:sz="4"/>
+              <w:right w:val="single" w:color="BFBFBF" w:sz="4"/>
+            </w:tcBorders>
+            <w:tcMar>
+              <w:top w:type="dxa" w:w="60"/>
+              <w:left w:type="dxa" w:w="90"/>
+              <w:bottom w:type="dxa" w:w="60"/>
+              <w:right w:type="dxa" w:w="90"/>
+            </w:tcMar>
+          </w:tcPr>
+          <w:p>
+            <w:pPr>
+              <w:spacing w:after="20"/>
+            </w:pPr>
+            <w:r>
+              <w:rPr>
+                <w:rFonts w:ascii="Arial" w:cs="Arial" w:eastAsia="Arial" w:hAnsi="Arial"/>
+                <w:b w:val="false"/>
+                <w:bCs w:val="false"/>
+                <w:sz w:val="18"/>
+                <w:szCs w:val="18"/>
+              </w:rPr>
+              <w:t xml:space="preserve">/api/nhan-su/phan-cong</w:t>
+            </w:r>
+          </w:p>
+        </w:tc>
+        <w:tc>
+          <w:tcPr>
+            <w:tcW w:type="dxa" w:w="4878"/>
+            <w:tcBorders>
+              <w:top w:val="single" w:color="BFBFBF" w:sz="4"/>
+              <w:left w:val="single" w:color="BFBFBF" w:sz="4"/>
+              <w:bottom w:val="single" w:color="BFBFBF" w:sz="4"/>
+              <w:right w:val="single" w:color="BFBFBF" w:sz="4"/>
+            </w:tcBorders>
+            <w:tcMar>
+              <w:top w:type="dxa" w:w="60"/>
+              <w:left w:type="dxa" w:w="90"/>
+              <w:bottom w:type="dxa" w:w="60"/>
+              <w:right w:type="dxa" w:w="90"/>
+            </w:tcMar>
+          </w:tcPr>
+          <w:p>
+            <w:pPr>
+              <w:spacing w:after="20"/>
+            </w:pPr>
+            <w:r>
+              <w:rPr>
+                <w:rFonts w:ascii="Arial" w:cs="Arial" w:eastAsia="Arial" w:hAnsi="Arial"/>
+                <w:b w:val="false"/>
+                <w:bCs w:val="false"/>
+                <w:sz w:val="18"/>
+                <w:szCs w:val="18"/>
+              </w:rPr>
+              <w:t xml:space="preserve">NS-05 xếp lịch; NS-06 gỡ phân công (query)</w:t>
+            </w:r>
+          </w:p>
+        </w:tc>
+        <w:tc>
+          <w:tcPr>
+            <w:tcW w:type="dxa" w:w="2600"/>
+            <w:tcBorders>
+              <w:top w:val="single" w:color="BFBFBF" w:sz="4"/>
+              <w:left w:val="single" w:color="BFBFBF" w:sz="4"/>
+              <w:bottom w:val="single" w:color="BFBFBF" w:sz="4"/>
+              <w:right w:val="single" w:color="BFBFBF" w:sz="4"/>
+            </w:tcBorders>
+            <w:tcMar>
+              <w:top w:type="dxa" w:w="60"/>
+              <w:left w:type="dxa" w:w="90"/>
+              <w:bottom w:type="dxa" w:w="60"/>
+              <w:right w:type="dxa" w:w="90"/>
+            </w:tcMar>
+          </w:tcPr>
+          <w:p>
+            <w:pPr>
+              <w:spacing w:after="20"/>
+            </w:pPr>
+            <w:r>
+              <w:rPr>
+                <w:rFonts w:ascii="Arial" w:cs="Arial" w:eastAsia="Arial" w:hAnsi="Arial"/>
+                <w:b w:val="false"/>
+                <w:bCs w:val="false"/>
+                <w:sz w:val="18"/>
+                <w:szCs w:val="18"/>
+              </w:rPr>
+              <w:t xml:space="preserve">A/Q</w:t>
+            </w:r>
+          </w:p>
+        </w:tc>
+      </w:tr>
+      <w:tr>
+        <w:trPr>
+          <w:cantSplit/>
+        </w:trPr>
+        <w:tc>
+          <w:tcPr>
+            <w:tcW w:type="dxa" w:w="1800"/>
+            <w:tcBorders>
+              <w:top w:val="single" w:color="BFBFBF" w:sz="4"/>
+              <w:left w:val="single" w:color="BFBFBF" w:sz="4"/>
+              <w:bottom w:val="single" w:color="BFBFBF" w:sz="4"/>
+              <w:right w:val="single" w:color="BFBFBF" w:sz="4"/>
+            </w:tcBorders>
+            <w:tcMar>
+              <w:top w:type="dxa" w:w="60"/>
+              <w:left w:type="dxa" w:w="90"/>
+              <w:bottom w:type="dxa" w:w="60"/>
+              <w:right w:type="dxa" w:w="90"/>
+            </w:tcMar>
+          </w:tcPr>
+          <w:p>
+            <w:pPr>
+              <w:spacing w:after="20"/>
+            </w:pPr>
+            <w:r>
+              <w:rPr>
+                <w:rFonts w:ascii="Arial" w:cs="Arial" w:eastAsia="Arial" w:hAnsi="Arial"/>
+                <w:b w:val="false"/>
+                <w:bCs w:val="false"/>
+                <w:sz w:val="18"/>
+                <w:szCs w:val="18"/>
+              </w:rPr>
+              <w:t xml:space="preserve">GET</w:t>
+            </w:r>
+          </w:p>
+        </w:tc>
+        <w:tc>
+          <w:tcPr>
+            <w:tcW w:type="dxa" w:w="5400"/>
+            <w:tcBorders>
+              <w:top w:val="single" w:color="BFBFBF" w:sz="4"/>
+              <w:left w:val="single" w:color="BFBFBF" w:sz="4"/>
+              <w:bottom w:val="single" w:color="BFBFBF" w:sz="4"/>
+              <w:right w:val="single" w:color="BFBFBF" w:sz="4"/>
+            </w:tcBorders>
+            <w:tcMar>
+              <w:top w:type="dxa" w:w="60"/>
+              <w:left w:type="dxa" w:w="90"/>
+              <w:bottom w:type="dxa" w:w="60"/>
+              <w:right w:type="dxa" w:w="90"/>
+            </w:tcMar>
+          </w:tcPr>
+          <w:p>
+            <w:pPr>
+              <w:spacing w:after="20"/>
+            </w:pPr>
+            <w:r>
+              <w:rPr>
+                <w:rFonts w:ascii="Arial" w:cs="Arial" w:eastAsia="Arial" w:hAnsi="Arial"/>
+                <w:b w:val="false"/>
+                <w:bCs w:val="false"/>
+                <w:sz w:val="18"/>
+                <w:szCs w:val="18"/>
+              </w:rPr>
+              <w:t xml:space="preserve">/api/nhan-su/lich-tuan</w:t>
+            </w:r>
+          </w:p>
+        </w:tc>
+        <w:tc>
+          <w:tcPr>
+            <w:tcW w:type="dxa" w:w="4878"/>
+            <w:tcBorders>
+              <w:top w:val="single" w:color="BFBFBF" w:sz="4"/>
+              <w:left w:val="single" w:color="BFBFBF" w:sz="4"/>
+              <w:bottom w:val="single" w:color="BFBFBF" w:sz="4"/>
+              <w:right w:val="single" w:color="BFBFBF" w:sz="4"/>
+            </w:tcBorders>
+            <w:tcMar>
+              <w:top w:type="dxa" w:w="60"/>
+              <w:left w:type="dxa" w:w="90"/>
+              <w:bottom w:type="dxa" w:w="60"/>
+              <w:right w:type="dxa" w:w="90"/>
+            </w:tcMar>
+          </w:tcPr>
+          <w:p>
+            <w:pPr>
+              <w:spacing w:after="20"/>
+            </w:pPr>
+            <w:r>
+              <w:rPr>
+                <w:rFonts w:ascii="Arial" w:cs="Arial" w:eastAsia="Arial" w:hAnsi="Arial"/>
+                <w:b w:val="false"/>
+                <w:bCs w:val="false"/>
+                <w:sz w:val="18"/>
+                <w:szCs w:val="18"/>
+              </w:rPr>
+              <w:t xml:space="preserve">NS-07 lịch tuần (N chỉ của mình)</w:t>
+            </w:r>
+          </w:p>
+        </w:tc>
+        <w:tc>
+          <w:tcPr>
+            <w:tcW w:type="dxa" w:w="2600"/>
+            <w:tcBorders>
+              <w:top w:val="single" w:color="BFBFBF" w:sz="4"/>
+              <w:left w:val="single" w:color="BFBFBF" w:sz="4"/>
+              <w:bottom w:val="single" w:color="BFBFBF" w:sz="4"/>
+              <w:right w:val="single" w:color="BFBFBF" w:sz="4"/>
+            </w:tcBorders>
+            <w:tcMar>
+              <w:top w:type="dxa" w:w="60"/>
+              <w:left w:type="dxa" w:w="90"/>
+              <w:bottom w:type="dxa" w:w="60"/>
+              <w:right w:type="dxa" w:w="90"/>
+            </w:tcMar>
+          </w:tcPr>
+          <w:p>
+            <w:pPr>
+              <w:spacing w:after="20"/>
+            </w:pPr>
+            <w:r>
+              <w:rPr>
+                <w:rFonts w:ascii="Arial" w:cs="Arial" w:eastAsia="Arial" w:hAnsi="Arial"/>
+                <w:b w:val="false"/>
+                <w:bCs w:val="false"/>
+                <w:sz w:val="18"/>
+                <w:szCs w:val="18"/>
+              </w:rPr>
+              <w:t xml:space="preserve">A/Q/N</w:t>
+            </w:r>
+          </w:p>
+        </w:tc>
+      </w:tr>
+      <w:tr>
+        <w:trPr>
+          <w:cantSplit/>
+        </w:trPr>
+        <w:tc>
+          <w:tcPr>
+            <w:tcW w:type="dxa" w:w="1800"/>
+            <w:tcBorders>
+              <w:top w:val="single" w:color="BFBFBF" w:sz="4"/>
+              <w:left w:val="single" w:color="BFBFBF" w:sz="4"/>
+              <w:bottom w:val="single" w:color="BFBFBF" w:sz="4"/>
+              <w:right w:val="single" w:color="BFBFBF" w:sz="4"/>
+            </w:tcBorders>
+            <w:tcMar>
+              <w:top w:type="dxa" w:w="60"/>
+              <w:left w:type="dxa" w:w="90"/>
+              <w:bottom w:type="dxa" w:w="60"/>
+              <w:right w:type="dxa" w:w="90"/>
+            </w:tcMar>
+          </w:tcPr>
+          <w:p>
+            <w:pPr>
+              <w:spacing w:after="20"/>
+            </w:pPr>
+            <w:r>
+              <w:rPr>
+                <w:rFonts w:ascii="Arial" w:cs="Arial" w:eastAsia="Arial" w:hAnsi="Arial"/>
+                <w:b w:val="false"/>
+                <w:bCs w:val="false"/>
+                <w:sz w:val="18"/>
+                <w:szCs w:val="18"/>
+              </w:rPr>
+              <w:t xml:space="preserve">GET</w:t>
+            </w:r>
+          </w:p>
+        </w:tc>
+        <w:tc>
+          <w:tcPr>
+            <w:tcW w:type="dxa" w:w="5400"/>
+            <w:tcBorders>
+              <w:top w:val="single" w:color="BFBFBF" w:sz="4"/>
+              <w:left w:val="single" w:color="BFBFBF" w:sz="4"/>
+              <w:bottom w:val="single" w:color="BFBFBF" w:sz="4"/>
+              <w:right w:val="single" w:color="BFBFBF" w:sz="4"/>
+            </w:tcBorders>
+            <w:tcMar>
+              <w:top w:type="dxa" w:w="60"/>
+              <w:left w:type="dxa" w:w="90"/>
+              <w:bottom w:type="dxa" w:w="60"/>
+              <w:right w:type="dxa" w:w="90"/>
+            </w:tcMar>
+          </w:tcPr>
+          <w:p>
+            <w:pPr>
+              <w:spacing w:after="20"/>
+            </w:pPr>
+            <w:r>
+              <w:rPr>
+                <w:rFonts w:ascii="Arial" w:cs="Arial" w:eastAsia="Arial" w:hAnsi="Arial"/>
+                <w:b w:val="false"/>
+                <w:bCs w:val="false"/>
+                <w:sz w:val="18"/>
+                <w:szCs w:val="18"/>
+              </w:rPr>
+              <w:t xml:space="preserve">/api/khach-hang/top</w:t>
+            </w:r>
+          </w:p>
+        </w:tc>
+        <w:tc>
+          <w:tcPr>
+            <w:tcW w:type="dxa" w:w="4878"/>
+            <w:tcBorders>
+              <w:top w:val="single" w:color="BFBFBF" w:sz="4"/>
+              <w:left w:val="single" w:color="BFBFBF" w:sz="4"/>
+              <w:bottom w:val="single" w:color="BFBFBF" w:sz="4"/>
+              <w:right w:val="single" w:color="BFBFBF" w:sz="4"/>
+            </w:tcBorders>
+            <w:tcMar>
+              <w:top w:type="dxa" w:w="60"/>
+              <w:left w:type="dxa" w:w="90"/>
+              <w:bottom w:type="dxa" w:w="60"/>
+              <w:right w:type="dxa" w:w="90"/>
+            </w:tcMar>
+          </w:tcPr>
+          <w:p>
+            <w:pPr>
+              <w:spacing w:after="20"/>
+            </w:pPr>
+            <w:r>
+              <w:rPr>
+                <w:rFonts w:ascii="Arial" w:cs="Arial" w:eastAsia="Arial" w:hAnsi="Arial"/>
+                <w:b w:val="false"/>
+                <w:bCs w:val="false"/>
+                <w:sz w:val="18"/>
+                <w:szCs w:val="18"/>
+              </w:rPr>
+              <w:t xml:space="preserve">KH-05 top khách thân thiết</w:t>
+            </w:r>
+          </w:p>
+        </w:tc>
+        <w:tc>
+          <w:tcPr>
+            <w:tcW w:type="dxa" w:w="2600"/>
+            <w:tcBorders>
+              <w:top w:val="single" w:color="BFBFBF" w:sz="4"/>
+              <w:left w:val="single" w:color="BFBFBF" w:sz="4"/>
+              <w:bottom w:val="single" w:color="BFBFBF" w:sz="4"/>
+              <w:right w:val="single" w:color="BFBFBF" w:sz="4"/>
+            </w:tcBorders>
+            <w:tcMar>
+              <w:top w:type="dxa" w:w="60"/>
+              <w:left w:type="dxa" w:w="90"/>
+              <w:bottom w:type="dxa" w:w="60"/>
+              <w:right w:type="dxa" w:w="90"/>
+            </w:tcMar>
+          </w:tcPr>
+          <w:p>
+            <w:pPr>
+              <w:spacing w:after="20"/>
+            </w:pPr>
+            <w:r>
+              <w:rPr>
+                <w:rFonts w:ascii="Arial" w:cs="Arial" w:eastAsia="Arial" w:hAnsi="Arial"/>
+                <w:b w:val="false"/>
+                <w:bCs w:val="false"/>
+                <w:sz w:val="18"/>
+                <w:szCs w:val="18"/>
+              </w:rPr>
+              <w:t xml:space="preserve">A/Q</w:t>
+            </w:r>
+          </w:p>
+        </w:tc>
+      </w:tr>
+      <w:tr>
+        <w:trPr>
+          <w:cantSplit/>
+        </w:trPr>
+        <w:tc>
+          <w:tcPr>
+            <w:tcW w:type="dxa" w:w="1800"/>
+            <w:tcBorders>
+              <w:top w:val="single" w:color="BFBFBF" w:sz="4"/>
+              <w:left w:val="single" w:color="BFBFBF" w:sz="4"/>
+              <w:bottom w:val="single" w:color="BFBFBF" w:sz="4"/>
+              <w:right w:val="single" w:color="BFBFBF" w:sz="4"/>
+            </w:tcBorders>
+            <w:tcMar>
+              <w:top w:type="dxa" w:w="60"/>
+              <w:left w:type="dxa" w:w="90"/>
+              <w:bottom w:type="dxa" w:w="60"/>
+              <w:right w:type="dxa" w:w="90"/>
+            </w:tcMar>
+          </w:tcPr>
+          <w:p>
+            <w:pPr>
+              <w:spacing w:after="20"/>
+            </w:pPr>
+            <w:r>
+              <w:rPr>
+                <w:rFonts w:ascii="Arial" w:cs="Arial" w:eastAsia="Arial" w:hAnsi="Arial"/>
+                <w:b w:val="false"/>
+                <w:bCs w:val="false"/>
+                <w:sz w:val="18"/>
+                <w:szCs w:val="18"/>
+              </w:rPr>
+              <w:t xml:space="preserve">GET</w:t>
+            </w:r>
+          </w:p>
+        </w:tc>
+        <w:tc>
+          <w:tcPr>
+            <w:tcW w:type="dxa" w:w="5400"/>
+            <w:tcBorders>
+              <w:top w:val="single" w:color="BFBFBF" w:sz="4"/>
+              <w:left w:val="single" w:color="BFBFBF" w:sz="4"/>
+              <w:bottom w:val="single" w:color="BFBFBF" w:sz="4"/>
+              <w:right w:val="single" w:color="BFBFBF" w:sz="4"/>
+            </w:tcBorders>
+            <w:tcMar>
+              <w:top w:type="dxa" w:w="60"/>
+              <w:left w:type="dxa" w:w="90"/>
+              <w:bottom w:type="dxa" w:w="60"/>
+              <w:right w:type="dxa" w:w="90"/>
+            </w:tcMar>
+          </w:tcPr>
+          <w:p>
+            <w:pPr>
+              <w:spacing w:after="20"/>
+            </w:pPr>
+            <w:r>
+              <w:rPr>
+                <w:rFonts w:ascii="Arial" w:cs="Arial" w:eastAsia="Arial" w:hAnsi="Arial"/>
+                <w:b w:val="false"/>
+                <w:bCs w:val="false"/>
+                <w:sz w:val="18"/>
+                <w:szCs w:val="18"/>
+              </w:rPr>
+              <w:t xml:space="preserve">/api/bao-cao/doanh-thu</w:t>
+            </w:r>
+          </w:p>
+        </w:tc>
+        <w:tc>
+          <w:tcPr>
+            <w:tcW w:type="dxa" w:w="4878"/>
+            <w:tcBorders>
+              <w:top w:val="single" w:color="BFBFBF" w:sz="4"/>
+              <w:left w:val="single" w:color="BFBFBF" w:sz="4"/>
+              <w:bottom w:val="single" w:color="BFBFBF" w:sz="4"/>
+              <w:right w:val="single" w:color="BFBFBF" w:sz="4"/>
+            </w:tcBorders>
+            <w:tcMar>
+              <w:top w:type="dxa" w:w="60"/>
+              <w:left w:type="dxa" w:w="90"/>
+              <w:bottom w:type="dxa" w:w="60"/>
+              <w:right w:type="dxa" w:w="90"/>
+            </w:tcMar>
+          </w:tcPr>
+          <w:p>
+            <w:pPr>
+              <w:spacing w:after="20"/>
+            </w:pPr>
+            <w:r>
+              <w:rPr>
+                <w:rFonts w:ascii="Arial" w:cs="Arial" w:eastAsia="Arial" w:hAnsi="Arial"/>
+                <w:b w:val="false"/>
+                <w:bCs w:val="false"/>
+                <w:sz w:val="18"/>
+                <w:szCs w:val="18"/>
+              </w:rPr>
+              <w:t xml:space="preserve">BC-01 doanh thu theo thời gian</w:t>
+            </w:r>
+          </w:p>
+        </w:tc>
+        <w:tc>
+          <w:tcPr>
+            <w:tcW w:type="dxa" w:w="2600"/>
+            <w:tcBorders>
+              <w:top w:val="single" w:color="BFBFBF" w:sz="4"/>
+              <w:left w:val="single" w:color="BFBFBF" w:sz="4"/>
+              <w:bottom w:val="single" w:color="BFBFBF" w:sz="4"/>
+              <w:right w:val="single" w:color="BFBFBF" w:sz="4"/>
+            </w:tcBorders>
+            <w:tcMar>
+              <w:top w:type="dxa" w:w="60"/>
+              <w:left w:type="dxa" w:w="90"/>
+              <w:bottom w:type="dxa" w:w="60"/>
+              <w:right w:type="dxa" w:w="90"/>
+            </w:tcMar>
+          </w:tcPr>
+          <w:p>
+            <w:pPr>
+              <w:spacing w:after="20"/>
+            </w:pPr>
+            <w:r>
+              <w:rPr>
+                <w:rFonts w:ascii="Arial" w:cs="Arial" w:eastAsia="Arial" w:hAnsi="Arial"/>
+                <w:b w:val="false"/>
+                <w:bCs w:val="false"/>
+                <w:sz w:val="18"/>
+                <w:szCs w:val="18"/>
+              </w:rPr>
+              <w:t xml:space="preserve">A/Q</w:t>
+            </w:r>
+          </w:p>
+        </w:tc>
+      </w:tr>
+      <w:tr>
+        <w:trPr>
+          <w:cantSplit/>
+        </w:trPr>
+        <w:tc>
+          <w:tcPr>
+            <w:tcW w:type="dxa" w:w="1800"/>
+            <w:tcBorders>
+              <w:top w:val="single" w:color="BFBFBF" w:sz="4"/>
+              <w:left w:val="single" w:color="BFBFBF" w:sz="4"/>
+              <w:bottom w:val="single" w:color="BFBFBF" w:sz="4"/>
+              <w:right w:val="single" w:color="BFBFBF" w:sz="4"/>
+            </w:tcBorders>
+            <w:tcMar>
+              <w:top w:type="dxa" w:w="60"/>
+              <w:left w:type="dxa" w:w="90"/>
+              <w:bottom w:type="dxa" w:w="60"/>
+              <w:right w:type="dxa" w:w="90"/>
+            </w:tcMar>
+          </w:tcPr>
+          <w:p>
+            <w:pPr>
+              <w:spacing w:after="20"/>
+            </w:pPr>
+            <w:r>
+              <w:rPr>
+                <w:rFonts w:ascii="Arial" w:cs="Arial" w:eastAsia="Arial" w:hAnsi="Arial"/>
+                <w:b w:val="false"/>
+                <w:bCs w:val="false"/>
+                <w:sz w:val="18"/>
+                <w:szCs w:val="18"/>
+              </w:rPr>
+              <w:t xml:space="preserve">GET</w:t>
+            </w:r>
+          </w:p>
+        </w:tc>
+        <w:tc>
+          <w:tcPr>
+            <w:tcW w:type="dxa" w:w="5400"/>
+            <w:tcBorders>
+              <w:top w:val="single" w:color="BFBFBF" w:sz="4"/>
+              <w:left w:val="single" w:color="BFBFBF" w:sz="4"/>
+              <w:bottom w:val="single" w:color="BFBFBF" w:sz="4"/>
+              <w:right w:val="single" w:color="BFBFBF" w:sz="4"/>
+            </w:tcBorders>
+            <w:tcMar>
+              <w:top w:type="dxa" w:w="60"/>
+              <w:left w:type="dxa" w:w="90"/>
+              <w:bottom w:type="dxa" w:w="60"/>
+              <w:right w:type="dxa" w:w="90"/>
+            </w:tcMar>
+          </w:tcPr>
+          <w:p>
+            <w:pPr>
+              <w:spacing w:after="20"/>
+            </w:pPr>
+            <w:r>
+              <w:rPr>
+                <w:rFonts w:ascii="Arial" w:cs="Arial" w:eastAsia="Arial" w:hAnsi="Arial"/>
+                <w:b w:val="false"/>
+                <w:bCs w:val="false"/>
+                <w:sz w:val="18"/>
+                <w:szCs w:val="18"/>
+              </w:rPr>
+              <w:t xml:space="preserve">/api/bao-cao/san-pham-ban-chay</w:t>
+            </w:r>
+          </w:p>
+        </w:tc>
+        <w:tc>
+          <w:tcPr>
+            <w:tcW w:type="dxa" w:w="4878"/>
+            <w:tcBorders>
+              <w:top w:val="single" w:color="BFBFBF" w:sz="4"/>
+              <w:left w:val="single" w:color="BFBFBF" w:sz="4"/>
+              <w:bottom w:val="single" w:color="BFBFBF" w:sz="4"/>
+              <w:right w:val="single" w:color="BFBFBF" w:sz="4"/>
+            </w:tcBorders>
+            <w:tcMar>
+              <w:top w:type="dxa" w:w="60"/>
+              <w:left w:type="dxa" w:w="90"/>
+              <w:bottom w:type="dxa" w:w="60"/>
+              <w:right w:type="dxa" w:w="90"/>
+            </w:tcMar>
+          </w:tcPr>
+          <w:p>
+            <w:pPr>
+              <w:spacing w:after="20"/>
+            </w:pPr>
+            <w:r>
+              <w:rPr>
+                <w:rFonts w:ascii="Arial" w:cs="Arial" w:eastAsia="Arial" w:hAnsi="Arial"/>
+                <w:b w:val="false"/>
+                <w:bCs w:val="false"/>
+                <w:sz w:val="18"/>
+                <w:szCs w:val="18"/>
+              </w:rPr>
+              <w:t xml:space="preserve">BC-02 sản phẩm bán chạy</w:t>
+            </w:r>
+          </w:p>
+        </w:tc>
+        <w:tc>
+          <w:tcPr>
+            <w:tcW w:type="dxa" w:w="2600"/>
+            <w:tcBorders>
+              <w:top w:val="single" w:color="BFBFBF" w:sz="4"/>
+              <w:left w:val="single" w:color="BFBFBF" w:sz="4"/>
+              <w:bottom w:val="single" w:color="BFBFBF" w:sz="4"/>
+              <w:right w:val="single" w:color="BFBFBF" w:sz="4"/>
+            </w:tcBorders>
+            <w:tcMar>
+              <w:top w:type="dxa" w:w="60"/>
+              <w:left w:type="dxa" w:w="90"/>
+              <w:bottom w:type="dxa" w:w="60"/>
+              <w:right w:type="dxa" w:w="90"/>
+            </w:tcMar>
+          </w:tcPr>
+          <w:p>
+            <w:pPr>
+              <w:spacing w:after="20"/>
+            </w:pPr>
+            <w:r>
+              <w:rPr>
+                <w:rFonts w:ascii="Arial" w:cs="Arial" w:eastAsia="Arial" w:hAnsi="Arial"/>
+                <w:b w:val="false"/>
+                <w:bCs w:val="false"/>
+                <w:sz w:val="18"/>
+                <w:szCs w:val="18"/>
+              </w:rPr>
+              <w:t xml:space="preserve">A/Q</w:t>
+            </w:r>
+          </w:p>
+        </w:tc>
+      </w:tr>
+      <w:tr>
+        <w:trPr>
+          <w:cantSplit/>
+        </w:trPr>
+        <w:tc>
+          <w:tcPr>
+            <w:tcW w:type="dxa" w:w="1800"/>
+            <w:tcBorders>
+              <w:top w:val="single" w:color="BFBFBF" w:sz="4"/>
+              <w:left w:val="single" w:color="BFBFBF" w:sz="4"/>
+              <w:bottom w:val="single" w:color="BFBFBF" w:sz="4"/>
+              <w:right w:val="single" w:color="BFBFBF" w:sz="4"/>
+            </w:tcBorders>
+            <w:tcMar>
+              <w:top w:type="dxa" w:w="60"/>
+              <w:left w:type="dxa" w:w="90"/>
+              <w:bottom w:type="dxa" w:w="60"/>
+              <w:right w:type="dxa" w:w="90"/>
+            </w:tcMar>
+          </w:tcPr>
+          <w:p>
+            <w:pPr>
+              <w:spacing w:after="20"/>
+            </w:pPr>
+            <w:r>
+              <w:rPr>
+                <w:rFonts w:ascii="Arial" w:cs="Arial" w:eastAsia="Arial" w:hAnsi="Arial"/>
+                <w:b w:val="false"/>
+                <w:bCs w:val="false"/>
+                <w:sz w:val="18"/>
+                <w:szCs w:val="18"/>
+              </w:rPr>
+              <w:t xml:space="preserve">GET</w:t>
+            </w:r>
+          </w:p>
+        </w:tc>
+        <w:tc>
+          <w:tcPr>
+            <w:tcW w:type="dxa" w:w="5400"/>
+            <w:tcBorders>
+              <w:top w:val="single" w:color="BFBFBF" w:sz="4"/>
+              <w:left w:val="single" w:color="BFBFBF" w:sz="4"/>
+              <w:bottom w:val="single" w:color="BFBFBF" w:sz="4"/>
+              <w:right w:val="single" w:color="BFBFBF" w:sz="4"/>
+            </w:tcBorders>
+            <w:tcMar>
+              <w:top w:type="dxa" w:w="60"/>
+              <w:left w:type="dxa" w:w="90"/>
+              <w:bottom w:type="dxa" w:w="60"/>
+              <w:right w:type="dxa" w:w="90"/>
+            </w:tcMar>
+          </w:tcPr>
+          <w:p>
+            <w:pPr>
+              <w:spacing w:after="20"/>
+            </w:pPr>
+            <w:r>
+              <w:rPr>
+                <w:rFonts w:ascii="Arial" w:cs="Arial" w:eastAsia="Arial" w:hAnsi="Arial"/>
+                <w:b w:val="false"/>
+                <w:bCs w:val="false"/>
+                <w:sz w:val="18"/>
+                <w:szCs w:val="18"/>
+              </w:rPr>
+              <w:t xml:space="preserve">/api/bao-cao/doanh-thu-theo-danh-muc</w:t>
+            </w:r>
+          </w:p>
+        </w:tc>
+        <w:tc>
+          <w:tcPr>
+            <w:tcW w:type="dxa" w:w="4878"/>
+            <w:tcBorders>
+              <w:top w:val="single" w:color="BFBFBF" w:sz="4"/>
+              <w:left w:val="single" w:color="BFBFBF" w:sz="4"/>
+              <w:bottom w:val="single" w:color="BFBFBF" w:sz="4"/>
+              <w:right w:val="single" w:color="BFBFBF" w:sz="4"/>
+            </w:tcBorders>
+            <w:tcMar>
+              <w:top w:type="dxa" w:w="60"/>
+              <w:left w:type="dxa" w:w="90"/>
+              <w:bottom w:type="dxa" w:w="60"/>
+              <w:right w:type="dxa" w:w="90"/>
+            </w:tcMar>
+          </w:tcPr>
+          <w:p>
+            <w:pPr>
+              <w:spacing w:after="20"/>
+            </w:pPr>
+            <w:r>
+              <w:rPr>
+                <w:rFonts w:ascii="Arial" w:cs="Arial" w:eastAsia="Arial" w:hAnsi="Arial"/>
+                <w:b w:val="false"/>
+                <w:bCs w:val="false"/>
+                <w:sz w:val="18"/>
+                <w:szCs w:val="18"/>
+              </w:rPr>
+              <w:t xml:space="preserve">BC-03 doanh thu theo danh mục</w:t>
+            </w:r>
+          </w:p>
+        </w:tc>
+        <w:tc>
+          <w:tcPr>
+            <w:tcW w:type="dxa" w:w="2600"/>
+            <w:tcBorders>
+              <w:top w:val="single" w:color="BFBFBF" w:sz="4"/>
+              <w:left w:val="single" w:color="BFBFBF" w:sz="4"/>
+              <w:bottom w:val="single" w:color="BFBFBF" w:sz="4"/>
+              <w:right w:val="single" w:color="BFBFBF" w:sz="4"/>
+            </w:tcBorders>
+            <w:tcMar>
+              <w:top w:type="dxa" w:w="60"/>
+              <w:left w:type="dxa" w:w="90"/>
+              <w:bottom w:type="dxa" w:w="60"/>
+              <w:right w:type="dxa" w:w="90"/>
+            </w:tcMar>
+          </w:tcPr>
+          <w:p>
+            <w:pPr>
+              <w:spacing w:after="20"/>
+            </w:pPr>
+            <w:r>
+              <w:rPr>
+                <w:rFonts w:ascii="Arial" w:cs="Arial" w:eastAsia="Arial" w:hAnsi="Arial"/>
+                <w:b w:val="false"/>
+                <w:bCs w:val="false"/>
+                <w:sz w:val="18"/>
+                <w:szCs w:val="18"/>
+              </w:rPr>
+              <w:t xml:space="preserve">A/Q</w:t>
+            </w:r>
+          </w:p>
+        </w:tc>
+      </w:tr>
+      <w:tr>
+        <w:trPr>
+          <w:cantSplit/>
+        </w:trPr>
+        <w:tc>
+          <w:tcPr>
+            <w:tcW w:type="dxa" w:w="1800"/>
+            <w:tcBorders>
+              <w:top w:val="single" w:color="BFBFBF" w:sz="4"/>
+              <w:left w:val="single" w:color="BFBFBF" w:sz="4"/>
+              <w:bottom w:val="single" w:color="BFBFBF" w:sz="4"/>
+              <w:right w:val="single" w:color="BFBFBF" w:sz="4"/>
+            </w:tcBorders>
+            <w:tcMar>
+              <w:top w:type="dxa" w:w="60"/>
+              <w:left w:type="dxa" w:w="90"/>
+              <w:bottom w:type="dxa" w:w="60"/>
+              <w:right w:type="dxa" w:w="90"/>
+            </w:tcMar>
+          </w:tcPr>
+          <w:p>
+            <w:pPr>
+              <w:spacing w:after="20"/>
+            </w:pPr>
+            <w:r>
+              <w:rPr>
+                <w:rFonts w:ascii="Arial" w:cs="Arial" w:eastAsia="Arial" w:hAnsi="Arial"/>
+                <w:b w:val="false"/>
+                <w:bCs w:val="false"/>
+                <w:sz w:val="18"/>
+                <w:szCs w:val="18"/>
+              </w:rPr>
+              <w:t xml:space="preserve">GET</w:t>
+            </w:r>
+          </w:p>
+        </w:tc>
+        <w:tc>
+          <w:tcPr>
+            <w:tcW w:type="dxa" w:w="5400"/>
+            <w:tcBorders>
+              <w:top w:val="single" w:color="BFBFBF" w:sz="4"/>
+              <w:left w:val="single" w:color="BFBFBF" w:sz="4"/>
+              <w:bottom w:val="single" w:color="BFBFBF" w:sz="4"/>
+              <w:right w:val="single" w:color="BFBFBF" w:sz="4"/>
+            </w:tcBorders>
+            <w:tcMar>
+              <w:top w:type="dxa" w:w="60"/>
+              <w:left w:type="dxa" w:w="90"/>
+              <w:bottom w:type="dxa" w:w="60"/>
+              <w:right w:type="dxa" w:w="90"/>
+            </w:tcMar>
+          </w:tcPr>
+          <w:p>
+            <w:pPr>
+              <w:spacing w:after="20"/>
+            </w:pPr>
+            <w:r>
+              <w:rPr>
+                <w:rFonts w:ascii="Arial" w:cs="Arial" w:eastAsia="Arial" w:hAnsi="Arial"/>
+                <w:b w:val="false"/>
+                <w:bCs w:val="false"/>
+                <w:sz w:val="18"/>
+                <w:szCs w:val="18"/>
+              </w:rPr>
+              <w:t xml:space="preserve">/api/bao-cao/phuong-thuc-thanh-toan</w:t>
+            </w:r>
+          </w:p>
+        </w:tc>
+        <w:tc>
+          <w:tcPr>
+            <w:tcW w:type="dxa" w:w="4878"/>
+            <w:tcBorders>
+              <w:top w:val="single" w:color="BFBFBF" w:sz="4"/>
+              <w:left w:val="single" w:color="BFBFBF" w:sz="4"/>
+              <w:bottom w:val="single" w:color="BFBFBF" w:sz="4"/>
+              <w:right w:val="single" w:color="BFBFBF" w:sz="4"/>
+            </w:tcBorders>
+            <w:tcMar>
+              <w:top w:type="dxa" w:w="60"/>
+              <w:left w:type="dxa" w:w="90"/>
+              <w:bottom w:type="dxa" w:w="60"/>
+              <w:right w:type="dxa" w:w="90"/>
+            </w:tcMar>
+          </w:tcPr>
+          <w:p>
+            <w:pPr>
+              <w:spacing w:after="20"/>
+            </w:pPr>
+            <w:r>
+              <w:rPr>
+                <w:rFonts w:ascii="Arial" w:cs="Arial" w:eastAsia="Arial" w:hAnsi="Arial"/>
+                <w:b w:val="false"/>
+                <w:bCs w:val="false"/>
+                <w:sz w:val="18"/>
+                <w:szCs w:val="18"/>
+              </w:rPr>
+              <w:t xml:space="preserve">BC-04 theo phương thức thanh toán</w:t>
+            </w:r>
+          </w:p>
+        </w:tc>
+        <w:tc>
+          <w:tcPr>
+            <w:tcW w:type="dxa" w:w="2600"/>
+            <w:tcBorders>
+              <w:top w:val="single" w:color="BFBFBF" w:sz="4"/>
+              <w:left w:val="single" w:color="BFBFBF" w:sz="4"/>
+              <w:bottom w:val="single" w:color="BFBFBF" w:sz="4"/>
+              <w:right w:val="single" w:color="BFBFBF" w:sz="4"/>
+            </w:tcBorders>
+            <w:tcMar>
+              <w:top w:type="dxa" w:w="60"/>
+              <w:left w:type="dxa" w:w="90"/>
+              <w:bottom w:type="dxa" w:w="60"/>
+              <w:right w:type="dxa" w:w="90"/>
+            </w:tcMar>
+          </w:tcPr>
+          <w:p>
+            <w:pPr>
+              <w:spacing w:after="20"/>
+            </w:pPr>
+            <w:r>
+              <w:rPr>
+                <w:rFonts w:ascii="Arial" w:cs="Arial" w:eastAsia="Arial" w:hAnsi="Arial"/>
+                <w:b w:val="false"/>
+                <w:bCs w:val="false"/>
+                <w:sz w:val="18"/>
+                <w:szCs w:val="18"/>
+              </w:rPr>
+              <w:t xml:space="preserve">A/Q</w:t>
+            </w:r>
+          </w:p>
+        </w:tc>
+      </w:tr>
+      <w:tr>
+        <w:trPr>
+          <w:cantSplit/>
+        </w:trPr>
+        <w:tc>
+          <w:tcPr>
+            <w:tcW w:type="dxa" w:w="1800"/>
+            <w:tcBorders>
+              <w:top w:val="single" w:color="BFBFBF" w:sz="4"/>
+              <w:left w:val="single" w:color="BFBFBF" w:sz="4"/>
+              <w:bottom w:val="single" w:color="BFBFBF" w:sz="4"/>
+              <w:right w:val="single" w:color="BFBFBF" w:sz="4"/>
+            </w:tcBorders>
+            <w:tcMar>
+              <w:top w:type="dxa" w:w="60"/>
+              <w:left w:type="dxa" w:w="90"/>
+              <w:bottom w:type="dxa" w:w="60"/>
+              <w:right w:type="dxa" w:w="90"/>
+            </w:tcMar>
+          </w:tcPr>
+          <w:p>
+            <w:pPr>
+              <w:spacing w:after="20"/>
+            </w:pPr>
+            <w:r>
+              <w:rPr>
+                <w:rFonts w:ascii="Arial" w:cs="Arial" w:eastAsia="Arial" w:hAnsi="Arial"/>
+                <w:b w:val="false"/>
+                <w:bCs w:val="false"/>
+                <w:sz w:val="18"/>
+                <w:szCs w:val="18"/>
+              </w:rPr>
+              <w:t xml:space="preserve">GET</w:t>
+            </w:r>
+          </w:p>
+        </w:tc>
+        <w:tc>
+          <w:tcPr>
+            <w:tcW w:type="dxa" w:w="5400"/>
+            <w:tcBorders>
+              <w:top w:val="single" w:color="BFBFBF" w:sz="4"/>
+              <w:left w:val="single" w:color="BFBFBF" w:sz="4"/>
+              <w:bottom w:val="single" w:color="BFBFBF" w:sz="4"/>
+              <w:right w:val="single" w:color="BFBFBF" w:sz="4"/>
+            </w:tcBorders>
+            <w:tcMar>
+              <w:top w:type="dxa" w:w="60"/>
+              <w:left w:type="dxa" w:w="90"/>
+              <w:bottom w:type="dxa" w:w="60"/>
+              <w:right w:type="dxa" w:w="90"/>
+            </w:tcMar>
+          </w:tcPr>
+          <w:p>
+            <w:pPr>
+              <w:spacing w:after="20"/>
+            </w:pPr>
+            <w:r>
+              <w:rPr>
+                <w:rFonts w:ascii="Arial" w:cs="Arial" w:eastAsia="Arial" w:hAnsi="Arial"/>
+                <w:b w:val="false"/>
+                <w:bCs w:val="false"/>
+                <w:sz w:val="18"/>
+                <w:szCs w:val="18"/>
+              </w:rPr>
+              <w:t xml:space="preserve">/api/bao-cao/chi-phi-vs-doanh-thu</w:t>
+            </w:r>
+          </w:p>
+        </w:tc>
+        <w:tc>
+          <w:tcPr>
+            <w:tcW w:type="dxa" w:w="4878"/>
+            <w:tcBorders>
+              <w:top w:val="single" w:color="BFBFBF" w:sz="4"/>
+              <w:left w:val="single" w:color="BFBFBF" w:sz="4"/>
+              <w:bottom w:val="single" w:color="BFBFBF" w:sz="4"/>
+              <w:right w:val="single" w:color="BFBFBF" w:sz="4"/>
+            </w:tcBorders>
+            <w:tcMar>
+              <w:top w:type="dxa" w:w="60"/>
+              <w:left w:type="dxa" w:w="90"/>
+              <w:bottom w:type="dxa" w:w="60"/>
+              <w:right w:type="dxa" w:w="90"/>
+            </w:tcMar>
+          </w:tcPr>
+          <w:p>
+            <w:pPr>
+              <w:spacing w:after="20"/>
+            </w:pPr>
+            <w:r>
+              <w:rPr>
+                <w:rFonts w:ascii="Arial" w:cs="Arial" w:eastAsia="Arial" w:hAnsi="Arial"/>
+                <w:b w:val="false"/>
+                <w:bCs w:val="false"/>
+                <w:sz w:val="18"/>
+                <w:szCs w:val="18"/>
+              </w:rPr>
+              <w:t xml:space="preserve">BC-05 chi phí nhập vs doanh thu</w:t>
+            </w:r>
+          </w:p>
+        </w:tc>
+        <w:tc>
+          <w:tcPr>
+            <w:tcW w:type="dxa" w:w="2600"/>
+            <w:tcBorders>
+              <w:top w:val="single" w:color="BFBFBF" w:sz="4"/>
+              <w:left w:val="single" w:color="BFBFBF" w:sz="4"/>
+              <w:bottom w:val="single" w:color="BFBFBF" w:sz="4"/>
+              <w:right w:val="single" w:color="BFBFBF" w:sz="4"/>
+            </w:tcBorders>
+            <w:tcMar>
+              <w:top w:type="dxa" w:w="60"/>
+              <w:left w:type="dxa" w:w="90"/>
+              <w:bottom w:type="dxa" w:w="60"/>
+              <w:right w:type="dxa" w:w="90"/>
+            </w:tcMar>
+          </w:tcPr>
+          <w:p>
+            <w:pPr>
+              <w:spacing w:after="20"/>
+            </w:pPr>
+            <w:r>
+              <w:rPr>
+                <w:rFonts w:ascii="Arial" w:cs="Arial" w:eastAsia="Arial" w:hAnsi="Arial"/>
+                <w:b w:val="false"/>
+                <w:bCs w:val="false"/>
+                <w:sz w:val="18"/>
+                <w:szCs w:val="18"/>
+              </w:rPr>
+              <w:t xml:space="preserve">A/Q</w:t>
+            </w:r>
+          </w:p>
+        </w:tc>
+      </w:tr>
+      <w:tr>
+        <w:trPr>
+          <w:cantSplit/>
+        </w:trPr>
+        <w:tc>
+          <w:tcPr>
+            <w:tcW w:type="dxa" w:w="1800"/>
+            <w:tcBorders>
+              <w:top w:val="single" w:color="BFBFBF" w:sz="4"/>
+              <w:left w:val="single" w:color="BFBFBF" w:sz="4"/>
+              <w:bottom w:val="single" w:color="BFBFBF" w:sz="4"/>
+              <w:right w:val="single" w:color="BFBFBF" w:sz="4"/>
+            </w:tcBorders>
+            <w:tcMar>
+              <w:top w:type="dxa" w:w="60"/>
+              <w:left w:type="dxa" w:w="90"/>
+              <w:bottom w:type="dxa" w:w="60"/>
+              <w:right w:type="dxa" w:w="90"/>
+            </w:tcMar>
+          </w:tcPr>
+          <w:p>
+            <w:pPr>
+              <w:spacing w:after="20"/>
+            </w:pPr>
+            <w:r>
+              <w:rPr>
+                <w:rFonts w:ascii="Arial" w:cs="Arial" w:eastAsia="Arial" w:hAnsi="Arial"/>
+                <w:b w:val="false"/>
+                <w:bCs w:val="false"/>
+                <w:sz w:val="18"/>
+                <w:szCs w:val="18"/>
+              </w:rPr>
+              <w:t xml:space="preserve">GET</w:t>
+            </w:r>
+          </w:p>
+        </w:tc>
+        <w:tc>
+          <w:tcPr>
+            <w:tcW w:type="dxa" w:w="5400"/>
+            <w:tcBorders>
+              <w:top w:val="single" w:color="BFBFBF" w:sz="4"/>
+              <w:left w:val="single" w:color="BFBFBF" w:sz="4"/>
+              <w:bottom w:val="single" w:color="BFBFBF" w:sz="4"/>
+              <w:right w:val="single" w:color="BFBFBF" w:sz="4"/>
+            </w:tcBorders>
+            <w:tcMar>
+              <w:top w:type="dxa" w:w="60"/>
+              <w:left w:type="dxa" w:w="90"/>
+              <w:bottom w:type="dxa" w:w="60"/>
+              <w:right w:type="dxa" w:w="90"/>
+            </w:tcMar>
+          </w:tcPr>
+          <w:p>
+            <w:pPr>
+              <w:spacing w:after="20"/>
+            </w:pPr>
+            <w:r>
+              <w:rPr>
+                <w:rFonts w:ascii="Arial" w:cs="Arial" w:eastAsia="Arial" w:hAnsi="Arial"/>
+                <w:b w:val="false"/>
+                <w:bCs w:val="false"/>
+                <w:sz w:val="18"/>
+                <w:szCs w:val="18"/>
+              </w:rPr>
+              <w:t xml:space="preserve">/api/bao-cao/doanh-thu-theo-nhan-vien</w:t>
+            </w:r>
+          </w:p>
+        </w:tc>
+        <w:tc>
+          <w:tcPr>
+            <w:tcW w:type="dxa" w:w="4878"/>
+            <w:tcBorders>
+              <w:top w:val="single" w:color="BFBFBF" w:sz="4"/>
+              <w:left w:val="single" w:color="BFBFBF" w:sz="4"/>
+              <w:bottom w:val="single" w:color="BFBFBF" w:sz="4"/>
+              <w:right w:val="single" w:color="BFBFBF" w:sz="4"/>
+            </w:tcBorders>
+            <w:tcMar>
+              <w:top w:type="dxa" w:w="60"/>
+              <w:left w:type="dxa" w:w="90"/>
+              <w:bottom w:type="dxa" w:w="60"/>
+              <w:right w:type="dxa" w:w="90"/>
+            </w:tcMar>
+          </w:tcPr>
+          <w:p>
+            <w:pPr>
+              <w:spacing w:after="20"/>
+            </w:pPr>
+            <w:r>
+              <w:rPr>
+                <w:rFonts w:ascii="Arial" w:cs="Arial" w:eastAsia="Arial" w:hAnsi="Arial"/>
+                <w:b w:val="false"/>
+                <w:bCs w:val="false"/>
+                <w:sz w:val="18"/>
+                <w:szCs w:val="18"/>
+              </w:rPr>
+              <w:t xml:space="preserve">BC-06 doanh thu theo nhân viên</w:t>
+            </w:r>
+          </w:p>
+        </w:tc>
+        <w:tc>
+          <w:tcPr>
+            <w:tcW w:type="dxa" w:w="2600"/>
+            <w:tcBorders>
+              <w:top w:val="single" w:color="BFBFBF" w:sz="4"/>
+              <w:left w:val="single" w:color="BFBFBF" w:sz="4"/>
+              <w:bottom w:val="single" w:color="BFBFBF" w:sz="4"/>
+              <w:right w:val="single" w:color="BFBFBF" w:sz="4"/>
+            </w:tcBorders>
+            <w:tcMar>
+              <w:top w:type="dxa" w:w="60"/>
+              <w:left w:type="dxa" w:w="90"/>
+              <w:bottom w:type="dxa" w:w="60"/>
+              <w:right w:type="dxa" w:w="90"/>
+            </w:tcMar>
+          </w:tcPr>
+          <w:p>
+            <w:pPr>
+              <w:spacing w:after="20"/>
+            </w:pPr>
+            <w:r>
+              <w:rPr>
+                <w:rFonts w:ascii="Arial" w:cs="Arial" w:eastAsia="Arial" w:hAnsi="Arial"/>
+                <w:b w:val="false"/>
+                <w:bCs w:val="false"/>
+                <w:sz w:val="18"/>
+                <w:szCs w:val="18"/>
+              </w:rPr>
+              <w:t xml:space="preserve">A/Q</w:t>
             </w:r>
           </w:p>
         </w:tc>

</xml_diff>